<commit_message>
fix: resolve final revision review findings
</commit_message>
<xml_diff>
--- a/paper/revision_submission/manuscript_mc_revised_clean.docx
+++ b/paper/revision_submission/manuscript_mc_revised_clean.docx
@@ -139,15 +139,7 @@
           <w:sz w:val="20"/>
           <w:szCs w:val="20"/>
         </w:rPr>
-        <w:t xml:space="preserve">000 mismatch samples; GP mean correction reduces this count to 36. The scenario-wise commissioned row, using</w:t>
-      </w:r>
-      <w:r>
-        <w:rPr>
-          <w:rFonts w:ascii="Times New Roman" w:hAnsi="Times New Roman" w:eastAsia="Times New Roman" w:cs="Times New Roman"/>
-          <w:sz w:val="20"/>
-          <w:szCs w:val="20"/>
-        </w:rPr>
-        <w:t xml:space="preserve"> </w:t>
+        <w:t xml:space="preserve">000 mismatch samples; GP mean correction reduces this count to 36. Across separately commissioned scenario-specific GP models, the selected settings (</w:t>
       </w:r>
       <m:oMath>
         <m:sSub>
@@ -198,7 +190,7 @@
           <w:sz w:val="20"/>
           <w:szCs w:val="20"/>
         </w:rPr>
-        <w:t xml:space="preserve">in S3 and 0 otherwise, gives 0/17</w:t>
+        <w:t xml:space="preserve">in S3 and 0 otherwise) give 0/17</w:t>
       </w:r>
       <w:r>
         <w:rPr>
@@ -1778,7 +1770,7 @@
           <w:sz w:val="20"/>
           <w:szCs w:val="20"/>
         </w:rPr>
-        <w:t xml:space="preserve">. The theorem states the conditions under which the full-margin endpoint yields continuous-time forward invariance. Section </w:t>
+        <w:t xml:space="preserve">. The theorem states the conditions under which the full implemented-margin endpoint yields continuous-time forward invariance. Section </w:t>
       </w:r>
       <w:r>
         <w:rPr>
@@ -10437,7 +10429,7 @@
         </w:rPr>
         <w:drawing>
           <wp:inline>
-            <wp:extent cx="5270500" cy="2635250"/>
+            <wp:extent cx="5270500" cy="2530763"/>
             <wp:effectExtent b="0" l="0" r="0" t="0"/>
             <wp:docPr descr="" title="" id="33" name="Picture"/>
             <a:graphic>
@@ -10458,7 +10450,7 @@
                   <pic:spPr bwMode="auto">
                     <a:xfrm>
                       <a:off x="0" y="0"/>
-                      <a:ext cx="5270500" cy="2635250"/>
+                      <a:ext cx="5270500" cy="2530763"/>
                     </a:xfrm>
                     <a:prstGeom prst="rect">
                       <a:avLst/>
@@ -24024,7 +24016,7 @@
           <w:sz w:val="20"/>
           <w:szCs w:val="20"/>
         </w:rPr>
-        <w:t xml:space="preserve">. Each cell aggregates five 500-sample rollouts, i.e., 2500 controller samples. The full-margin row tests the conservative</w:t>
+        <w:t xml:space="preserve">. Each cell aggregates five 500-sample rollouts, i.e., 2500 controller samples. The full implemented-margin row tests the conservative</w:t>
       </w:r>
       <w:r>
         <w:rPr>
@@ -24091,7 +24083,7 @@
         <w:tblStyle w:val="Table"/>
         <w:tblW w:type="dxa" w:w="8500"/>
         <w:tblLook w:firstRow="1" w:lastRow="0" w:firstColumn="0" w:lastColumn="0" w:noHBand="0" w:noVBand="0" w:val="0020"/>
-        <w:tblCaption w:val="Table 2. Primary \Delta g=0 validation: sample-level constraint violation rate (%) at controller instants under a fixed upstream deviation proposal, computed by Eq. [eq:sample_violation_rate] with a raw-margin numerical tolerance of 10^{-2}. Each cell aggregates five 500-sample rollouts, i.e., 2500 controller samples. The full-margin row tests the conservative \epsilon_\kappa=1.0 endpoint under actuator limits; it is not the recommended commissioned operating point."/>
+        <w:tblCaption w:val="Table 2. Primary \Delta g=0 validation: sample-level constraint violation rate (%) at controller instants under a fixed upstream deviation proposal, computed by Eq. [eq:sample_violation_rate] with a raw-margin numerical tolerance of 10^{-2}. Each cell aggregates five 500-sample rollouts, i.e., 2500 controller samples. The full implemented-margin row tests the conservative \epsilon_\kappa=1.0 endpoint under actuator limits; it is not the recommended commissioned operating point."/>
         <w:jc w:val="center"/>
         <w:tblLayout w:type="fixed"/>
         <w:tblCellMar>
@@ -26107,7 +26099,51 @@
           <w:sz w:val="20"/>
           <w:szCs w:val="20"/>
         </w:rPr>
-        <w:t xml:space="preserve">500 observed violations across the nominal and six mismatch conditions. NMPC is also effective, with 35/17</w:t>
+        <w:t xml:space="preserve">500 observed violations across the nominal and six mismatch conditions. Each condition is a separate offline commissioning regime with its own frozen scenario-specific GP; this row compares commissioned operating points across prescribed residual regimes rather than switching</w:t>
+      </w:r>
+      <w:r>
+        <w:rPr>
+          <w:rFonts w:ascii="Times New Roman" w:hAnsi="Times New Roman" w:eastAsia="Times New Roman" w:cs="Times New Roman"/>
+          <w:sz w:val="20"/>
+          <w:szCs w:val="20"/>
+        </w:rPr>
+        <w:t xml:space="preserve"> </w:t>
+      </w:r>
+      <m:oMath>
+        <m:sSub>
+          <m:e>
+            <m:r>
+              <w:rPr>
+                <w:rFonts w:ascii="Times New Roman" w:hAnsi="Times New Roman" w:eastAsia="Times New Roman" w:cs="Times New Roman"/>
+              </w:rPr>
+              <m:t>ϵ</m:t>
+            </m:r>
+          </m:e>
+          <m:sub>
+            <m:r>
+              <w:rPr>
+                <w:rFonts w:ascii="Times New Roman" w:hAnsi="Times New Roman" w:eastAsia="Times New Roman" w:cs="Times New Roman"/>
+              </w:rPr>
+              <m:t>κ</m:t>
+            </m:r>
+          </m:sub>
+        </m:sSub>
+      </m:oMath>
+      <w:r>
+        <w:rPr>
+          <w:rFonts w:ascii="Times New Roman" w:hAnsi="Times New Roman" w:eastAsia="Times New Roman" w:cs="Times New Roman"/>
+          <w:sz w:val="20"/>
+          <w:szCs w:val="20"/>
+        </w:rPr>
+        <w:t xml:space="preserve"> </w:t>
+      </w:r>
+      <w:r>
+        <w:rPr>
+          <w:rFonts w:ascii="Times New Roman" w:hAnsi="Times New Roman" w:eastAsia="Times New Roman" w:cs="Times New Roman"/>
+          <w:sz w:val="20"/>
+          <w:szCs w:val="20"/>
+        </w:rPr>
+        <w:t xml:space="preserve">by observing the true scenario online. NMPC is also effective, with 35/17</w:t>
       </w:r>
       <w:r>
         <w:rPr>
@@ -33745,15 +33781,7 @@
           <w:sz w:val="20"/>
           <w:szCs w:val="20"/>
         </w:rPr>
-        <w:t xml:space="preserve">000 mismatch-sample violations without a GP. Mean correction reduces that count to 36. The scenario-wise commissioned row, using</w:t>
-      </w:r>
-      <w:r>
-        <w:rPr>
-          <w:rFonts w:ascii="Times New Roman" w:hAnsi="Times New Roman" w:eastAsia="Times New Roman" w:cs="Times New Roman"/>
-          <w:sz w:val="20"/>
-          <w:szCs w:val="20"/>
-        </w:rPr>
-        <w:t xml:space="preserve"> </w:t>
+        <w:t xml:space="preserve">000 mismatch-sample violations without a GP. Mean correction reduces that count to 36. Across separately commissioned scenario-specific GP models, the selected settings (</w:t>
       </w:r>
       <m:oMath>
         <m:sSub>
@@ -33804,7 +33832,7 @@
           <w:sz w:val="20"/>
           <w:szCs w:val="20"/>
         </w:rPr>
-        <w:t xml:space="preserve">in S3 and 0 otherwise, gives 0/17</w:t>
+        <w:t xml:space="preserve">in S3 and 0 otherwise) give 0/17</w:t>
       </w:r>
       <w:r>
         <w:rPr>

</xml_diff>

<commit_message>
fix: close major-revision notation and evidence gaps
</commit_message>
<xml_diff>
--- a/paper/revision_submission/manuscript_mc_revised_clean.docx
+++ b/paper/revision_submission/manuscript_mc_revised_clean.docx
@@ -139,7 +139,7 @@
           <w:sz w:val="20"/>
           <w:szCs w:val="20"/>
         </w:rPr>
-        <w:t xml:space="preserve">000 mismatch samples; GP mean correction reduces this count to 36. Across separately commissioned scenario-specific GP models, the selected settings (</w:t>
+        <w:t xml:space="preserve">000 mismatch samples; GP mean correction reduces this count to 36. In the scenario-specific primary sweep, the tune-selected S3 setting (</w:t>
       </w:r>
       <m:oMath>
         <m:sSub>
@@ -182,15 +182,50 @@
           <w:sz w:val="20"/>
           <w:szCs w:val="20"/>
         </w:rPr>
-        <w:t xml:space="preserve"> </w:t>
-      </w:r>
-      <w:r>
-        <w:rPr>
-          <w:rFonts w:ascii="Times New Roman" w:hAnsi="Times New Roman" w:eastAsia="Times New Roman" w:cs="Times New Roman"/>
-          <w:sz w:val="20"/>
-          <w:szCs w:val="20"/>
-        </w:rPr>
-        <w:t xml:space="preserve">in S3 and 0 otherwise) give 0/17</w:t>
+        <w:t xml:space="preserve">) and the mean-only endpoint (</w:t>
+      </w:r>
+      <m:oMath>
+        <m:sSub>
+          <m:e>
+            <m:r>
+              <w:rPr>
+                <w:rFonts w:ascii="Times New Roman" w:hAnsi="Times New Roman" w:eastAsia="Times New Roman" w:cs="Times New Roman"/>
+              </w:rPr>
+              <m:t>ϵ</m:t>
+            </m:r>
+          </m:e>
+          <m:sub>
+            <m:r>
+              <w:rPr>
+                <w:rFonts w:ascii="Times New Roman" w:hAnsi="Times New Roman" w:eastAsia="Times New Roman" w:cs="Times New Roman"/>
+              </w:rPr>
+              <m:t>κ</m:t>
+            </m:r>
+          </m:sub>
+        </m:sSub>
+        <m:r>
+          <m:rPr>
+            <m:sty m:val="p"/>
+          </m:rPr>
+          <w:rPr>
+            <w:rFonts w:ascii="Times New Roman" w:hAnsi="Times New Roman" w:eastAsia="Times New Roman" w:cs="Times New Roman"/>
+          </w:rPr>
+          <m:t>=</m:t>
+        </m:r>
+        <m:r>
+          <w:rPr>
+            <w:rFonts w:ascii="Times New Roman" w:hAnsi="Times New Roman" w:eastAsia="Times New Roman" w:cs="Times New Roman"/>
+          </w:rPr>
+          <m:t>0</m:t>
+        </m:r>
+      </m:oMath>
+      <w:r>
+        <w:rPr>
+          <w:rFonts w:ascii="Times New Roman" w:hAnsi="Times New Roman" w:eastAsia="Times New Roman" w:cs="Times New Roman"/>
+          <w:sz w:val="20"/>
+          <w:szCs w:val="20"/>
+        </w:rPr>
+        <w:t xml:space="preserve">) in the remaining conditions give 0/17</w:t>
       </w:r>
       <w:r>
         <w:rPr>
@@ -206,7 +241,7 @@
           <w:sz w:val="20"/>
           <w:szCs w:val="20"/>
         </w:rPr>
-        <w:t xml:space="preserve">500 observed violations in the primary sweep, while an independent 50</w:t>
+        <w:t xml:space="preserve">500 observed violations, while an independent 50</w:t>
       </w:r>
       <w:r>
         <w:rPr>
@@ -6915,7 +6950,7 @@
           <w:sz w:val="20"/>
           <w:szCs w:val="20"/>
         </w:rPr>
-        <w:t xml:space="preserve">back to the physical actuator command. The HOCBF rows are written as</w:t>
+        <w:t xml:space="preserve">back to the physical actuator command. The GP-mean-corrected HOCBF rows are written as</w:t>
       </w:r>
       <w:r>
         <w:rPr>
@@ -7016,7 +7051,132 @@
           <w:sz w:val="20"/>
           <w:szCs w:val="20"/>
         </w:rPr>
-        <w:t xml:space="preserve">in deviation-input form. The term</w:t>
+        <w:t xml:space="preserve">in deviation-input form;</w:t>
+      </w:r>
+      <w:r>
+        <w:rPr>
+          <w:rFonts w:ascii="Times New Roman" w:hAnsi="Times New Roman" w:eastAsia="Times New Roman" w:cs="Times New Roman"/>
+          <w:sz w:val="20"/>
+          <w:szCs w:val="20"/>
+        </w:rPr>
+        <w:t xml:space="preserve"> </w:t>
+      </w:r>
+      <m:oMath>
+        <m:sSub>
+          <m:e>
+            <m:r>
+              <w:rPr>
+                <w:rFonts w:ascii="Times New Roman" w:hAnsi="Times New Roman" w:eastAsia="Times New Roman" w:cs="Times New Roman"/>
+              </w:rPr>
+              <m:t>A</m:t>
+            </m:r>
+          </m:e>
+          <m:sub>
+            <m:r>
+              <w:rPr>
+                <w:rFonts w:ascii="Times New Roman" w:hAnsi="Times New Roman" w:eastAsia="Times New Roman" w:cs="Times New Roman"/>
+              </w:rPr>
+              <m:t>0</m:t>
+            </m:r>
+          </m:sub>
+        </m:sSub>
+        <m:r>
+          <m:rPr>
+            <m:sty m:val="p"/>
+          </m:rPr>
+          <w:rPr>
+            <w:rFonts w:ascii="Times New Roman" w:hAnsi="Times New Roman" w:eastAsia="Times New Roman" w:cs="Times New Roman"/>
+          </w:rPr>
+          <m:t>(</m:t>
+        </m:r>
+        <m:r>
+          <w:rPr>
+            <w:rFonts w:ascii="Times New Roman" w:hAnsi="Times New Roman" w:eastAsia="Times New Roman" w:cs="Times New Roman"/>
+          </w:rPr>
+          <m:t>x</m:t>
+        </m:r>
+        <m:r>
+          <m:rPr>
+            <m:sty m:val="p"/>
+          </m:rPr>
+          <w:rPr>
+            <w:rFonts w:ascii="Times New Roman" w:hAnsi="Times New Roman" w:eastAsia="Times New Roman" w:cs="Times New Roman"/>
+          </w:rPr>
+          <m:t>)</m:t>
+        </m:r>
+        <m:r>
+          <w:rPr>
+            <w:rFonts w:ascii="Times New Roman" w:hAnsi="Times New Roman" w:eastAsia="Times New Roman" w:cs="Times New Roman"/>
+          </w:rPr>
+          <m:t>v</m:t>
+        </m:r>
+        <m:r>
+          <m:rPr>
+            <m:sty m:val="p"/>
+          </m:rPr>
+          <w:rPr>
+            <w:rFonts w:ascii="Times New Roman" w:hAnsi="Times New Roman" w:eastAsia="Times New Roman" w:cs="Times New Roman"/>
+          </w:rPr>
+          <m:t>≤</m:t>
+        </m:r>
+        <m:sSub>
+          <m:e>
+            <m:r>
+              <w:rPr>
+                <w:rFonts w:ascii="Times New Roman" w:hAnsi="Times New Roman" w:eastAsia="Times New Roman" w:cs="Times New Roman"/>
+              </w:rPr>
+              <m:t>b</m:t>
+            </m:r>
+          </m:e>
+          <m:sub>
+            <m:r>
+              <w:rPr>
+                <w:rFonts w:ascii="Times New Roman" w:hAnsi="Times New Roman" w:eastAsia="Times New Roman" w:cs="Times New Roman"/>
+              </w:rPr>
+              <m:t>0</m:t>
+            </m:r>
+          </m:sub>
+        </m:sSub>
+        <m:r>
+          <m:rPr>
+            <m:sty m:val="p"/>
+          </m:rPr>
+          <w:rPr>
+            <w:rFonts w:ascii="Times New Roman" w:hAnsi="Times New Roman" w:eastAsia="Times New Roman" w:cs="Times New Roman"/>
+          </w:rPr>
+          <m:t>(</m:t>
+        </m:r>
+        <m:r>
+          <w:rPr>
+            <w:rFonts w:ascii="Times New Roman" w:hAnsi="Times New Roman" w:eastAsia="Times New Roman" w:cs="Times New Roman"/>
+          </w:rPr>
+          <m:t>x</m:t>
+        </m:r>
+        <m:r>
+          <m:rPr>
+            <m:sty m:val="p"/>
+          </m:rPr>
+          <w:rPr>
+            <w:rFonts w:ascii="Times New Roman" w:hAnsi="Times New Roman" w:eastAsia="Times New Roman" w:cs="Times New Roman"/>
+          </w:rPr>
+          <m:t>)</m:t>
+        </m:r>
+      </m:oMath>
+      <w:r>
+        <w:rPr>
+          <w:rFonts w:ascii="Times New Roman" w:hAnsi="Times New Roman" w:eastAsia="Times New Roman" w:cs="Times New Roman"/>
+          <w:sz w:val="20"/>
+          <w:szCs w:val="20"/>
+        </w:rPr>
+        <w:t xml:space="preserve"> </w:t>
+      </w:r>
+      <w:r>
+        <w:rPr>
+          <w:rFonts w:ascii="Times New Roman" w:hAnsi="Times New Roman" w:eastAsia="Times New Roman" w:cs="Times New Roman"/>
+          <w:sz w:val="20"/>
+          <w:szCs w:val="20"/>
+        </w:rPr>
+        <w:t xml:space="preserve">is reserved for the no-GP nominal-model ablation. The term</w:t>
       </w:r>
       <w:r>
         <w:rPr>
@@ -10093,7 +10253,31 @@
           <w:sz w:val="20"/>
           <w:szCs w:val="20"/>
         </w:rPr>
-        <w:t xml:space="preserve">With linear</w:t>
+        <w:t xml:space="preserve">For the six barriers indexed by</w:t>
+      </w:r>
+      <w:r>
+        <w:rPr>
+          <w:rFonts w:ascii="Times New Roman" w:hAnsi="Times New Roman" w:eastAsia="Times New Roman" w:cs="Times New Roman"/>
+          <w:sz w:val="20"/>
+          <w:szCs w:val="20"/>
+        </w:rPr>
+        <w:t xml:space="preserve"> </w:t>
+      </w:r>
+      <m:oMath>
+        <m:r>
+          <w:rPr>
+            <w:rFonts w:ascii="Times New Roman" w:hAnsi="Times New Roman" w:eastAsia="Times New Roman" w:cs="Times New Roman"/>
+          </w:rPr>
+          <m:t>c</m:t>
+        </m:r>
+      </m:oMath>
+      <w:r>
+        <w:rPr>
+          <w:rFonts w:ascii="Times New Roman" w:hAnsi="Times New Roman" w:eastAsia="Times New Roman" w:cs="Times New Roman"/>
+          <w:sz w:val="20"/>
+          <w:szCs w:val="20"/>
+        </w:rPr>
+        <w:t xml:space="preserve">, with relative degree</w:t>
       </w:r>
       <w:r>
         <w:rPr>
@@ -10110,6 +10294,660 @@
               <w:rPr>
                 <w:rFonts w:ascii="Times New Roman" w:hAnsi="Times New Roman" w:eastAsia="Times New Roman" w:cs="Times New Roman"/>
               </w:rPr>
+              <m:t>m</m:t>
+            </m:r>
+          </m:e>
+          <m:sub>
+            <m:r>
+              <w:rPr>
+                <w:rFonts w:ascii="Times New Roman" w:hAnsi="Times New Roman" w:eastAsia="Times New Roman" w:cs="Times New Roman"/>
+              </w:rPr>
+              <m:t>c</m:t>
+            </m:r>
+          </m:sub>
+        </m:sSub>
+      </m:oMath>
+      <w:r>
+        <w:rPr>
+          <w:rFonts w:ascii="Times New Roman" w:hAnsi="Times New Roman" w:eastAsia="Times New Roman" w:cs="Times New Roman"/>
+          <w:sz w:val="20"/>
+          <w:szCs w:val="20"/>
+        </w:rPr>
+        <w:t xml:space="preserve">, define the recursive HOCBF admissible set under the true dynamics as</w:t>
+      </w:r>
+    </w:p>
+    <w:tbl>
+      <w:tblPr>
+        <w:tblDescription w:val="EquationNumbering"/>
+        <w:tblW w:w="8500" w:type="dxa"/>
+        <w:jc w:val="center"/>
+        <w:tblBorders>
+          <w:top w:val="nil"/>
+          <w:left w:val="nil"/>
+          <w:bottom w:val="nil"/>
+          <w:right w:val="nil"/>
+          <w:insideH w:val="nil"/>
+          <w:insideV w:val="nil"/>
+        </w:tblBorders>
+      </w:tblPr>
+      <w:tblGrid>
+        <w:gridCol w:w="7800"/>
+        <w:gridCol w:w="700"/>
+      </w:tblGrid>
+      <w:tr>
+        <w:tc>
+          <w:tcPr>
+            <w:tcW w:w="7800" w:type="dxa"/>
+            <w:tcBorders>
+              <w:top w:val="nil"/>
+              <w:left w:val="nil"/>
+              <w:bottom w:val="nil"/>
+              <w:right w:val="nil"/>
+              <w:insideH w:val="nil"/>
+              <w:insideV w:val="nil"/>
+            </w:tcBorders>
+          </w:tcPr>
+          <w:p>
+            <w:pPr>
+              <w:jc w:val="center"/>
+            </w:pPr>
+            <m:oMathPara>
+              <m:oMathParaPr>
+                <m:jc m:val="center"/>
+              </m:oMathParaPr>
+              <m:oMath>
+                <m:sSub>
+                  <m:e>
+                    <m:r>
+                      <m:rPr>
+                        <m:scr m:val="script"/>
+                        <m:sty m:val="p"/>
+                      </m:rPr>
+                      <w:rPr>
+                        <w:rFonts w:ascii="Times New Roman" w:hAnsi="Times New Roman" w:eastAsia="Times New Roman" w:cs="Times New Roman"/>
+                      </w:rPr>
+                      <m:t>C</m:t>
+                    </m:r>
+                  </m:e>
+                  <m:sub>
+                    <m:r>
+                      <w:rPr>
+                        <w:rFonts w:ascii="Times New Roman" w:hAnsi="Times New Roman" w:eastAsia="Times New Roman" w:cs="Times New Roman"/>
+                      </w:rPr>
+                      <m:t>c</m:t>
+                    </m:r>
+                    <m:r>
+                      <m:rPr>
+                        <m:sty m:val="p"/>
+                      </m:rPr>
+                      <w:rPr>
+                        <w:rFonts w:ascii="Times New Roman" w:hAnsi="Times New Roman" w:eastAsia="Times New Roman" w:cs="Times New Roman"/>
+                      </w:rPr>
+                      <m:t>,</m:t>
+                    </m:r>
+                    <m:r>
+                      <w:rPr>
+                        <w:rFonts w:ascii="Times New Roman" w:hAnsi="Times New Roman" w:eastAsia="Times New Roman" w:cs="Times New Roman"/>
+                      </w:rPr>
+                      <m:t>i</m:t>
+                    </m:r>
+                  </m:sub>
+                </m:sSub>
+                <m:r>
+                  <m:rPr>
+                    <m:sty m:val="p"/>
+                  </m:rPr>
+                  <w:rPr>
+                    <w:rFonts w:ascii="Times New Roman" w:hAnsi="Times New Roman" w:eastAsia="Times New Roman" w:cs="Times New Roman"/>
+                  </w:rPr>
+                  <m:t>=</m:t>
+                </m:r>
+                <m:r>
+                  <m:rPr>
+                    <m:sty m:val="p"/>
+                  </m:rPr>
+                  <w:rPr>
+                    <w:rFonts w:ascii="Times New Roman" w:hAnsi="Times New Roman" w:eastAsia="Times New Roman" w:cs="Times New Roman"/>
+                  </w:rPr>
+                  <m:t>{</m:t>
+                </m:r>
+                <m:r>
+                  <w:rPr>
+                    <w:rFonts w:ascii="Times New Roman" w:hAnsi="Times New Roman" w:eastAsia="Times New Roman" w:cs="Times New Roman"/>
+                  </w:rPr>
+                  <m:t>x</m:t>
+                </m:r>
+                <m:r>
+                  <m:rPr>
+                    <m:sty m:val="p"/>
+                  </m:rPr>
+                  <w:rPr>
+                    <w:rFonts w:ascii="Times New Roman" w:hAnsi="Times New Roman" w:eastAsia="Times New Roman" w:cs="Times New Roman"/>
+                  </w:rPr>
+                  <m:t>∈</m:t>
+                </m:r>
+                <m:sSub>
+                  <m:e>
+                    <m:r>
+                      <m:rPr>
+                        <m:scr m:val="script"/>
+                        <m:sty m:val="p"/>
+                      </m:rPr>
+                      <w:rPr>
+                        <w:rFonts w:ascii="Times New Roman" w:hAnsi="Times New Roman" w:eastAsia="Times New Roman" w:cs="Times New Roman"/>
+                      </w:rPr>
+                      <m:t>X</m:t>
+                    </m:r>
+                  </m:e>
+                  <m:sub>
+                    <m:r>
+                      <m:rPr>
+                        <m:sty m:val="p"/>
+                      </m:rPr>
+                      <w:rPr>
+                        <w:rFonts w:ascii="Times New Roman" w:hAnsi="Times New Roman" w:eastAsia="Times New Roman" w:cs="Times New Roman"/>
+                      </w:rPr>
+                      <m:t>o</m:t>
+                    </m:r>
+                    <m:r>
+                      <m:rPr>
+                        <m:sty m:val="p"/>
+                      </m:rPr>
+                      <w:rPr>
+                        <w:rFonts w:ascii="Times New Roman" w:hAnsi="Times New Roman" w:eastAsia="Times New Roman" w:cs="Times New Roman"/>
+                      </w:rPr>
+                      <m:t>p</m:t>
+                    </m:r>
+                  </m:sub>
+                </m:sSub>
+                <m:r>
+                  <m:rPr>
+                    <m:sty m:val="p"/>
+                  </m:rPr>
+                  <w:rPr>
+                    <w:rFonts w:ascii="Times New Roman" w:hAnsi="Times New Roman" w:eastAsia="Times New Roman" w:cs="Times New Roman"/>
+                  </w:rPr>
+                  <m:t>:</m:t>
+                </m:r>
+                <m:sSubSup>
+                  <m:e>
+                    <m:r>
+                      <w:rPr>
+                        <w:rFonts w:ascii="Times New Roman" w:hAnsi="Times New Roman" w:eastAsia="Times New Roman" w:cs="Times New Roman"/>
+                      </w:rPr>
+                      <m:t>ψ</m:t>
+                    </m:r>
+                  </m:e>
+                  <m:sub>
+                    <m:r>
+                      <w:rPr>
+                        <w:rFonts w:ascii="Times New Roman" w:hAnsi="Times New Roman" w:eastAsia="Times New Roman" w:cs="Times New Roman"/>
+                      </w:rPr>
+                      <m:t>c</m:t>
+                    </m:r>
+                    <m:r>
+                      <m:rPr>
+                        <m:sty m:val="p"/>
+                      </m:rPr>
+                      <w:rPr>
+                        <w:rFonts w:ascii="Times New Roman" w:hAnsi="Times New Roman" w:eastAsia="Times New Roman" w:cs="Times New Roman"/>
+                      </w:rPr>
+                      <m:t>,</m:t>
+                    </m:r>
+                    <m:r>
+                      <w:rPr>
+                        <w:rFonts w:ascii="Times New Roman" w:hAnsi="Times New Roman" w:eastAsia="Times New Roman" w:cs="Times New Roman"/>
+                      </w:rPr>
+                      <m:t>i</m:t>
+                    </m:r>
+                  </m:sub>
+                  <m:sup>
+                    <m:r>
+                      <m:rPr>
+                        <m:sty m:val="p"/>
+                      </m:rPr>
+                      <w:rPr>
+                        <w:rFonts w:ascii="Times New Roman" w:hAnsi="Times New Roman" w:eastAsia="Times New Roman" w:cs="Times New Roman"/>
+                      </w:rPr>
+                      <m:t>t</m:t>
+                    </m:r>
+                    <m:r>
+                      <m:rPr>
+                        <m:sty m:val="p"/>
+                      </m:rPr>
+                      <w:rPr>
+                        <w:rFonts w:ascii="Times New Roman" w:hAnsi="Times New Roman" w:eastAsia="Times New Roman" w:cs="Times New Roman"/>
+                      </w:rPr>
+                      <m:t>r</m:t>
+                    </m:r>
+                    <m:r>
+                      <m:rPr>
+                        <m:sty m:val="p"/>
+                      </m:rPr>
+                      <w:rPr>
+                        <w:rFonts w:ascii="Times New Roman" w:hAnsi="Times New Roman" w:eastAsia="Times New Roman" w:cs="Times New Roman"/>
+                      </w:rPr>
+                      <m:t>u</m:t>
+                    </m:r>
+                    <m:r>
+                      <m:rPr>
+                        <m:sty m:val="p"/>
+                      </m:rPr>
+                      <w:rPr>
+                        <w:rFonts w:ascii="Times New Roman" w:hAnsi="Times New Roman" w:eastAsia="Times New Roman" w:cs="Times New Roman"/>
+                      </w:rPr>
+                      <m:t>e</m:t>
+                    </m:r>
+                  </m:sup>
+                </m:sSubSup>
+                <m:r>
+                  <m:rPr>
+                    <m:sty m:val="p"/>
+                  </m:rPr>
+                  <w:rPr>
+                    <w:rFonts w:ascii="Times New Roman" w:hAnsi="Times New Roman" w:eastAsia="Times New Roman" w:cs="Times New Roman"/>
+                  </w:rPr>
+                  <m:t>(</m:t>
+                </m:r>
+                <m:r>
+                  <w:rPr>
+                    <w:rFonts w:ascii="Times New Roman" w:hAnsi="Times New Roman" w:eastAsia="Times New Roman" w:cs="Times New Roman"/>
+                  </w:rPr>
+                  <m:t>x</m:t>
+                </m:r>
+                <m:r>
+                  <m:rPr>
+                    <m:sty m:val="p"/>
+                  </m:rPr>
+                  <w:rPr>
+                    <w:rFonts w:ascii="Times New Roman" w:hAnsi="Times New Roman" w:eastAsia="Times New Roman" w:cs="Times New Roman"/>
+                  </w:rPr>
+                  <m:t>)</m:t>
+                </m:r>
+                <m:r>
+                  <m:rPr>
+                    <m:sty m:val="p"/>
+                  </m:rPr>
+                  <w:rPr>
+                    <w:rFonts w:ascii="Times New Roman" w:hAnsi="Times New Roman" w:eastAsia="Times New Roman" w:cs="Times New Roman"/>
+                  </w:rPr>
+                  <m:t>≥</m:t>
+                </m:r>
+                <m:r>
+                  <w:rPr>
+                    <w:rFonts w:ascii="Times New Roman" w:hAnsi="Times New Roman" w:eastAsia="Times New Roman" w:cs="Times New Roman"/>
+                  </w:rPr>
+                  <m:t>0</m:t>
+                </m:r>
+                <m:r>
+                  <m:rPr>
+                    <m:sty m:val="p"/>
+                  </m:rPr>
+                  <w:rPr>
+                    <w:rFonts w:ascii="Times New Roman" w:hAnsi="Times New Roman" w:eastAsia="Times New Roman" w:cs="Times New Roman"/>
+                  </w:rPr>
+                  <m:t>}</m:t>
+                </m:r>
+                <m:r>
+                  <m:rPr>
+                    <m:sty m:val="p"/>
+                  </m:rPr>
+                  <w:rPr>
+                    <w:rFonts w:ascii="Times New Roman" w:hAnsi="Times New Roman" w:eastAsia="Times New Roman" w:cs="Times New Roman"/>
+                  </w:rPr>
+                  <m:t>,</m:t>
+                </m:r>
+                <m:r>
+                  <w:rPr>
+                    <w:rFonts w:ascii="Times New Roman" w:hAnsi="Times New Roman" w:eastAsia="Times New Roman" w:cs="Times New Roman"/>
+                  </w:rPr>
+                  <m:t> </m:t>
+                </m:r>
+                <m:r>
+                  <w:rPr>
+                    <w:rFonts w:ascii="Times New Roman" w:hAnsi="Times New Roman" w:eastAsia="Times New Roman" w:cs="Times New Roman"/>
+                  </w:rPr>
+                  <m:t>i</m:t>
+                </m:r>
+                <m:r>
+                  <m:rPr>
+                    <m:sty m:val="p"/>
+                  </m:rPr>
+                  <w:rPr>
+                    <w:rFonts w:ascii="Times New Roman" w:hAnsi="Times New Roman" w:eastAsia="Times New Roman" w:cs="Times New Roman"/>
+                  </w:rPr>
+                  <m:t>=</m:t>
+                </m:r>
+                <m:r>
+                  <w:rPr>
+                    <w:rFonts w:ascii="Times New Roman" w:hAnsi="Times New Roman" w:eastAsia="Times New Roman" w:cs="Times New Roman"/>
+                  </w:rPr>
+                  <m:t>0</m:t>
+                </m:r>
+                <m:r>
+                  <m:rPr>
+                    <m:sty m:val="p"/>
+                  </m:rPr>
+                  <w:rPr>
+                    <w:rFonts w:ascii="Times New Roman" w:hAnsi="Times New Roman" w:eastAsia="Times New Roman" w:cs="Times New Roman"/>
+                  </w:rPr>
+                  <m:t>,</m:t>
+                </m:r>
+                <m:r>
+                  <m:rPr>
+                    <m:sty m:val="p"/>
+                  </m:rPr>
+                  <w:rPr>
+                    <w:rFonts w:ascii="Times New Roman" w:hAnsi="Times New Roman" w:eastAsia="Times New Roman" w:cs="Times New Roman"/>
+                  </w:rPr>
+                  <m:t>…</m:t>
+                </m:r>
+                <m:r>
+                  <m:rPr>
+                    <m:sty m:val="p"/>
+                  </m:rPr>
+                  <w:rPr>
+                    <w:rFonts w:ascii="Times New Roman" w:hAnsi="Times New Roman" w:eastAsia="Times New Roman" w:cs="Times New Roman"/>
+                  </w:rPr>
+                  <m:t>,</m:t>
+                </m:r>
+                <m:sSub>
+                  <m:e>
+                    <m:r>
+                      <w:rPr>
+                        <w:rFonts w:ascii="Times New Roman" w:hAnsi="Times New Roman" w:eastAsia="Times New Roman" w:cs="Times New Roman"/>
+                      </w:rPr>
+                      <m:t>m</m:t>
+                    </m:r>
+                  </m:e>
+                  <m:sub>
+                    <m:r>
+                      <w:rPr>
+                        <w:rFonts w:ascii="Times New Roman" w:hAnsi="Times New Roman" w:eastAsia="Times New Roman" w:cs="Times New Roman"/>
+                      </w:rPr>
+                      <m:t>c</m:t>
+                    </m:r>
+                  </m:sub>
+                </m:sSub>
+                <m:r>
+                  <m:rPr>
+                    <m:sty m:val="p"/>
+                  </m:rPr>
+                  <w:rPr>
+                    <w:rFonts w:ascii="Times New Roman" w:hAnsi="Times New Roman" w:eastAsia="Times New Roman" w:cs="Times New Roman"/>
+                  </w:rPr>
+                  <m:t>−</m:t>
+                </m:r>
+                <m:r>
+                  <w:rPr>
+                    <w:rFonts w:ascii="Times New Roman" w:hAnsi="Times New Roman" w:eastAsia="Times New Roman" w:cs="Times New Roman"/>
+                  </w:rPr>
+                  <m:t>1</m:t>
+                </m:r>
+                <m:r>
+                  <m:rPr>
+                    <m:sty m:val="p"/>
+                  </m:rPr>
+                  <w:rPr>
+                    <w:rFonts w:ascii="Times New Roman" w:hAnsi="Times New Roman" w:eastAsia="Times New Roman" w:cs="Times New Roman"/>
+                  </w:rPr>
+                  <m:t>,</m:t>
+                </m:r>
+                <m:r>
+                  <w:rPr>
+                    <w:rFonts w:ascii="Times New Roman" w:hAnsi="Times New Roman" w:eastAsia="Times New Roman" w:cs="Times New Roman"/>
+                  </w:rPr>
+                  <m:t>  </m:t>
+                </m:r>
+                <m:r>
+                  <m:rPr>
+                    <m:scr m:val="script"/>
+                    <m:sty m:val="p"/>
+                  </m:rPr>
+                  <w:rPr>
+                    <w:rFonts w:ascii="Times New Roman" w:hAnsi="Times New Roman" w:eastAsia="Times New Roman" w:cs="Times New Roman"/>
+                  </w:rPr>
+                  <m:t>C</m:t>
+                </m:r>
+                <m:r>
+                  <m:rPr>
+                    <m:sty m:val="p"/>
+                  </m:rPr>
+                  <w:rPr>
+                    <w:rFonts w:ascii="Times New Roman" w:hAnsi="Times New Roman" w:eastAsia="Times New Roman" w:cs="Times New Roman"/>
+                  </w:rPr>
+                  <m:t>=</m:t>
+                </m:r>
+                <m:limLow>
+                  <m:e>
+                    <m:limUpp>
+                      <m:e>
+                        <m:r>
+                          <m:rPr>
+                            <m:sty m:val="p"/>
+                          </m:rPr>
+                          <w:rPr>
+                            <w:rFonts w:ascii="Times New Roman" w:hAnsi="Times New Roman" w:eastAsia="Times New Roman" w:cs="Times New Roman"/>
+                          </w:rPr>
+                          <m:t>⋂</m:t>
+                        </m:r>
+                      </m:e>
+                      <m:lim>
+                        <m:r>
+                          <w:rPr>
+                            <w:rFonts w:ascii="Times New Roman" w:hAnsi="Times New Roman" w:eastAsia="Times New Roman" w:cs="Times New Roman"/>
+                          </w:rPr>
+                          <m:t>6</m:t>
+                        </m:r>
+                      </m:lim>
+                    </m:limUpp>
+                  </m:e>
+                  <m:lim>
+                    <m:r>
+                      <w:rPr>
+                        <w:rFonts w:ascii="Times New Roman" w:hAnsi="Times New Roman" w:eastAsia="Times New Roman" w:cs="Times New Roman"/>
+                      </w:rPr>
+                      <m:t>c</m:t>
+                    </m:r>
+                    <m:r>
+                      <m:rPr>
+                        <m:sty m:val="p"/>
+                      </m:rPr>
+                      <w:rPr>
+                        <w:rFonts w:ascii="Times New Roman" w:hAnsi="Times New Roman" w:eastAsia="Times New Roman" w:cs="Times New Roman"/>
+                      </w:rPr>
+                      <m:t>=</m:t>
+                    </m:r>
+                    <m:r>
+                      <w:rPr>
+                        <w:rFonts w:ascii="Times New Roman" w:hAnsi="Times New Roman" w:eastAsia="Times New Roman" w:cs="Times New Roman"/>
+                      </w:rPr>
+                      <m:t>1</m:t>
+                    </m:r>
+                  </m:lim>
+                </m:limLow>
+                <m:limLow>
+                  <m:e>
+                    <m:limUpp>
+                      <m:e>
+                        <m:r>
+                          <m:rPr>
+                            <m:sty m:val="p"/>
+                          </m:rPr>
+                          <w:rPr>
+                            <w:rFonts w:ascii="Times New Roman" w:hAnsi="Times New Roman" w:eastAsia="Times New Roman" w:cs="Times New Roman"/>
+                          </w:rPr>
+                          <m:t>⋂</m:t>
+                        </m:r>
+                      </m:e>
+                      <m:lim>
+                        <m:sSub>
+                          <m:e>
+                            <m:r>
+                              <w:rPr>
+                                <w:rFonts w:ascii="Times New Roman" w:hAnsi="Times New Roman" w:eastAsia="Times New Roman" w:cs="Times New Roman"/>
+                              </w:rPr>
+                              <m:t>m</m:t>
+                            </m:r>
+                          </m:e>
+                          <m:sub>
+                            <m:r>
+                              <w:rPr>
+                                <w:rFonts w:ascii="Times New Roman" w:hAnsi="Times New Roman" w:eastAsia="Times New Roman" w:cs="Times New Roman"/>
+                              </w:rPr>
+                              <m:t>c</m:t>
+                            </m:r>
+                          </m:sub>
+                        </m:sSub>
+                        <m:r>
+                          <m:rPr>
+                            <m:sty m:val="p"/>
+                          </m:rPr>
+                          <w:rPr>
+                            <w:rFonts w:ascii="Times New Roman" w:hAnsi="Times New Roman" w:eastAsia="Times New Roman" w:cs="Times New Roman"/>
+                          </w:rPr>
+                          <m:t>−</m:t>
+                        </m:r>
+                        <m:r>
+                          <w:rPr>
+                            <w:rFonts w:ascii="Times New Roman" w:hAnsi="Times New Roman" w:eastAsia="Times New Roman" w:cs="Times New Roman"/>
+                          </w:rPr>
+                          <m:t>1</m:t>
+                        </m:r>
+                      </m:lim>
+                    </m:limUpp>
+                  </m:e>
+                  <m:lim>
+                    <m:r>
+                      <w:rPr>
+                        <w:rFonts w:ascii="Times New Roman" w:hAnsi="Times New Roman" w:eastAsia="Times New Roman" w:cs="Times New Roman"/>
+                      </w:rPr>
+                      <m:t>i</m:t>
+                    </m:r>
+                    <m:r>
+                      <m:rPr>
+                        <m:sty m:val="p"/>
+                      </m:rPr>
+                      <w:rPr>
+                        <w:rFonts w:ascii="Times New Roman" w:hAnsi="Times New Roman" w:eastAsia="Times New Roman" w:cs="Times New Roman"/>
+                      </w:rPr>
+                      <m:t>=</m:t>
+                    </m:r>
+                    <m:r>
+                      <w:rPr>
+                        <w:rFonts w:ascii="Times New Roman" w:hAnsi="Times New Roman" w:eastAsia="Times New Roman" w:cs="Times New Roman"/>
+                      </w:rPr>
+                      <m:t>0</m:t>
+                    </m:r>
+                  </m:lim>
+                </m:limLow>
+                <m:sSub>
+                  <m:e>
+                    <m:r>
+                      <m:rPr>
+                        <m:scr m:val="script"/>
+                        <m:sty m:val="p"/>
+                      </m:rPr>
+                      <w:rPr>
+                        <w:rFonts w:ascii="Times New Roman" w:hAnsi="Times New Roman" w:eastAsia="Times New Roman" w:cs="Times New Roman"/>
+                      </w:rPr>
+                      <m:t>C</m:t>
+                    </m:r>
+                  </m:e>
+                  <m:sub>
+                    <m:r>
+                      <w:rPr>
+                        <w:rFonts w:ascii="Times New Roman" w:hAnsi="Times New Roman" w:eastAsia="Times New Roman" w:cs="Times New Roman"/>
+                      </w:rPr>
+                      <m:t>c</m:t>
+                    </m:r>
+                    <m:r>
+                      <m:rPr>
+                        <m:sty m:val="p"/>
+                      </m:rPr>
+                      <w:rPr>
+                        <w:rFonts w:ascii="Times New Roman" w:hAnsi="Times New Roman" w:eastAsia="Times New Roman" w:cs="Times New Roman"/>
+                      </w:rPr>
+                      <m:t>,</m:t>
+                    </m:r>
+                    <m:r>
+                      <w:rPr>
+                        <w:rFonts w:ascii="Times New Roman" w:hAnsi="Times New Roman" w:eastAsia="Times New Roman" w:cs="Times New Roman"/>
+                      </w:rPr>
+                      <m:t>i</m:t>
+                    </m:r>
+                  </m:sub>
+                </m:sSub>
+                <m:r>
+                  <m:rPr>
+                    <m:sty m:val="p"/>
+                  </m:rPr>
+                  <w:rPr>
+                    <w:rFonts w:ascii="Times New Roman" w:hAnsi="Times New Roman" w:eastAsia="Times New Roman" w:cs="Times New Roman"/>
+                  </w:rPr>
+                  <m:t>.</m:t>
+                </m:r>
+              </m:oMath>
+            </m:oMathPara>
+          </w:p>
+        </w:tc>
+        <w:tc>
+          <w:tcPr>
+            <w:tcW w:w="700" w:type="dxa"/>
+            <w:tcBorders>
+              <w:top w:val="nil"/>
+              <w:left w:val="nil"/>
+              <w:bottom w:val="nil"/>
+              <w:right w:val="nil"/>
+              <w:insideH w:val="nil"/>
+              <w:insideV w:val="nil"/>
+            </w:tcBorders>
+          </w:tcPr>
+          <w:p>
+            <w:pPr>
+              <w:jc w:val="right"/>
+            </w:pPr>
+            <w:r>
+              <w:rPr>
+                <w:rFonts w:ascii="Times New Roman" w:hAnsi="Times New Roman" w:eastAsia="Times New Roman" w:cs="Times New Roman"/>
+                <w:sz w:val="20"/>
+                <w:szCs w:val="20"/>
+              </w:rPr>
+              <w:t>(8)</w:t>
+            </w:r>
+          </w:p>
+        </w:tc>
+      </w:tr>
+    </w:tbl>
+    <w:p>
+      <w:pPr>
+        <w:pStyle w:val="11"/>
+        <w:jc w:val="left"/>
+        <w:ind w:firstLine="420"/>
+      </w:pPr>
+      <w:r>
+        <w:rPr>
+          <w:rFonts w:ascii="Times New Roman" w:hAnsi="Times New Roman" w:eastAsia="Times New Roman" w:cs="Times New Roman"/>
+          <w:sz w:val="20"/>
+          <w:szCs w:val="20"/>
+        </w:rPr>
+        <w:t xml:space="preserve">With linear</w:t>
+      </w:r>
+      <w:r>
+        <w:rPr>
+          <w:rFonts w:ascii="Times New Roman" w:hAnsi="Times New Roman" w:eastAsia="Times New Roman" w:cs="Times New Roman"/>
+          <w:sz w:val="20"/>
+          <w:szCs w:val="20"/>
+        </w:rPr>
+        <w:t xml:space="preserve"> </w:t>
+      </w:r>
+      <m:oMath>
+        <m:sSub>
+          <m:e>
+            <m:r>
+              <w:rPr>
+                <w:rFonts w:ascii="Times New Roman" w:hAnsi="Times New Roman" w:eastAsia="Times New Roman" w:cs="Times New Roman"/>
+              </w:rPr>
               <m:t>α</m:t>
             </m:r>
           </m:e>
@@ -10210,7 +11048,430 @@
           <w:sz w:val="20"/>
           <w:szCs w:val="20"/>
         </w:rPr>
-        <w:t xml:space="preserve">into the stabilized model gives exact-model rows in deviation-input form,</w:t>
+        <w:t xml:space="preserve">into the stabilized model gives a top-level affine row. For the GP-mean-corrected drift</w:t>
+      </w:r>
+      <w:r>
+        <w:rPr>
+          <w:rFonts w:ascii="Times New Roman" w:hAnsi="Times New Roman" w:eastAsia="Times New Roman" w:cs="Times New Roman"/>
+          <w:sz w:val="20"/>
+          <w:szCs w:val="20"/>
+        </w:rPr>
+        <w:t xml:space="preserve"> </w:t>
+      </w:r>
+      <m:oMath>
+        <m:acc>
+          <m:accPr>
+            <m:chr m:val="̂"/>
+          </m:accPr>
+          <m:e>
+            <m:r>
+              <w:rPr>
+                <w:rFonts w:ascii="Times New Roman" w:hAnsi="Times New Roman" w:eastAsia="Times New Roman" w:cs="Times New Roman"/>
+              </w:rPr>
+              <m:t>f</m:t>
+            </m:r>
+          </m:e>
+        </m:acc>
+        <m:r>
+          <m:rPr>
+            <m:sty m:val="p"/>
+          </m:rPr>
+          <w:rPr>
+            <w:rFonts w:ascii="Times New Roman" w:hAnsi="Times New Roman" w:eastAsia="Times New Roman" w:cs="Times New Roman"/>
+          </w:rPr>
+          <m:t>=</m:t>
+        </m:r>
+        <m:sSub>
+          <m:e>
+            <m:r>
+              <w:rPr>
+                <w:rFonts w:ascii="Times New Roman" w:hAnsi="Times New Roman" w:eastAsia="Times New Roman" w:cs="Times New Roman"/>
+              </w:rPr>
+              <m:t>f</m:t>
+            </m:r>
+          </m:e>
+          <m:sub>
+            <m:r>
+              <w:rPr>
+                <w:rFonts w:ascii="Times New Roman" w:hAnsi="Times New Roman" w:eastAsia="Times New Roman" w:cs="Times New Roman"/>
+              </w:rPr>
+              <m:t>0</m:t>
+            </m:r>
+          </m:sub>
+        </m:sSub>
+        <m:r>
+          <m:rPr>
+            <m:sty m:val="p"/>
+          </m:rPr>
+          <w:rPr>
+            <w:rFonts w:ascii="Times New Roman" w:hAnsi="Times New Roman" w:eastAsia="Times New Roman" w:cs="Times New Roman"/>
+          </w:rPr>
+          <m:t>+</m:t>
+        </m:r>
+        <m:sSub>
+          <m:e>
+            <m:r>
+              <w:rPr>
+                <w:rFonts w:ascii="Times New Roman" w:hAnsi="Times New Roman" w:eastAsia="Times New Roman" w:cs="Times New Roman"/>
+              </w:rPr>
+              <m:t>μ</m:t>
+            </m:r>
+          </m:e>
+          <m:sub>
+            <m:r>
+              <m:rPr>
+                <m:sty m:val="p"/>
+              </m:rPr>
+              <w:rPr>
+                <w:rFonts w:ascii="Times New Roman" w:hAnsi="Times New Roman" w:eastAsia="Times New Roman" w:cs="Times New Roman"/>
+              </w:rPr>
+              <m:t>G</m:t>
+            </m:r>
+            <m:r>
+              <m:rPr>
+                <m:sty m:val="p"/>
+              </m:rPr>
+              <w:rPr>
+                <w:rFonts w:ascii="Times New Roman" w:hAnsi="Times New Roman" w:eastAsia="Times New Roman" w:cs="Times New Roman"/>
+              </w:rPr>
+              <m:t>P</m:t>
+            </m:r>
+          </m:sub>
+        </m:sSub>
+      </m:oMath>
+      <w:r>
+        <w:rPr>
+          <w:rFonts w:ascii="Times New Roman" w:hAnsi="Times New Roman" w:eastAsia="Times New Roman" w:cs="Times New Roman"/>
+          <w:sz w:val="20"/>
+          <w:szCs w:val="20"/>
+        </w:rPr>
+        <w:t xml:space="preserve">, this row is defined by</w:t>
+      </w:r>
+      <w:r>
+        <w:rPr>
+          <w:rFonts w:ascii="Times New Roman" w:hAnsi="Times New Roman" w:eastAsia="Times New Roman" w:cs="Times New Roman"/>
+          <w:sz w:val="20"/>
+          <w:szCs w:val="20"/>
+        </w:rPr>
+        <w:t xml:space="preserve"> </w:t>
+      </w:r>
+      <m:oMath>
+        <m:sSubSup>
+          <m:e>
+            <m:acc>
+              <m:accPr>
+                <m:chr m:val="̂"/>
+              </m:accPr>
+              <m:e>
+                <m:r>
+                  <w:rPr>
+                    <w:rFonts w:ascii="Times New Roman" w:hAnsi="Times New Roman" w:eastAsia="Times New Roman" w:cs="Times New Roman"/>
+                  </w:rPr>
+                  <m:t>ψ</m:t>
+                </m:r>
+              </m:e>
+            </m:acc>
+          </m:e>
+          <m:sub>
+            <m:r>
+              <w:rPr>
+                <w:rFonts w:ascii="Times New Roman" w:hAnsi="Times New Roman" w:eastAsia="Times New Roman" w:cs="Times New Roman"/>
+              </w:rPr>
+              <m:t>c</m:t>
+            </m:r>
+            <m:r>
+              <m:rPr>
+                <m:sty m:val="p"/>
+              </m:rPr>
+              <w:rPr>
+                <w:rFonts w:ascii="Times New Roman" w:hAnsi="Times New Roman" w:eastAsia="Times New Roman" w:cs="Times New Roman"/>
+              </w:rPr>
+              <m:t>,</m:t>
+            </m:r>
+            <m:sSub>
+              <m:e>
+                <m:r>
+                  <w:rPr>
+                    <w:rFonts w:ascii="Times New Roman" w:hAnsi="Times New Roman" w:eastAsia="Times New Roman" w:cs="Times New Roman"/>
+                  </w:rPr>
+                  <m:t>m</m:t>
+                </m:r>
+              </m:e>
+              <m:sub>
+                <m:r>
+                  <w:rPr>
+                    <w:rFonts w:ascii="Times New Roman" w:hAnsi="Times New Roman" w:eastAsia="Times New Roman" w:cs="Times New Roman"/>
+                  </w:rPr>
+                  <m:t>c</m:t>
+                </m:r>
+              </m:sub>
+            </m:sSub>
+          </m:sub>
+          <m:sup>
+            <m:r>
+              <w:rPr>
+                <w:rFonts w:ascii="Times New Roman" w:hAnsi="Times New Roman" w:eastAsia="Times New Roman" w:cs="Times New Roman"/>
+              </w:rPr>
+              <m:t>0</m:t>
+            </m:r>
+          </m:sup>
+        </m:sSubSup>
+        <m:r>
+          <m:rPr>
+            <m:sty m:val="p"/>
+          </m:rPr>
+          <w:rPr>
+            <w:rFonts w:ascii="Times New Roman" w:hAnsi="Times New Roman" w:eastAsia="Times New Roman" w:cs="Times New Roman"/>
+          </w:rPr>
+          <m:t>(</m:t>
+        </m:r>
+        <m:r>
+          <w:rPr>
+            <w:rFonts w:ascii="Times New Roman" w:hAnsi="Times New Roman" w:eastAsia="Times New Roman" w:cs="Times New Roman"/>
+          </w:rPr>
+          <m:t>x</m:t>
+        </m:r>
+        <m:r>
+          <m:rPr>
+            <m:sty m:val="p"/>
+          </m:rPr>
+          <w:rPr>
+            <w:rFonts w:ascii="Times New Roman" w:hAnsi="Times New Roman" w:eastAsia="Times New Roman" w:cs="Times New Roman"/>
+          </w:rPr>
+          <m:t>,</m:t>
+        </m:r>
+        <m:r>
+          <w:rPr>
+            <w:rFonts w:ascii="Times New Roman" w:hAnsi="Times New Roman" w:eastAsia="Times New Roman" w:cs="Times New Roman"/>
+          </w:rPr>
+          <m:t>v</m:t>
+        </m:r>
+        <m:r>
+          <m:rPr>
+            <m:sty m:val="p"/>
+          </m:rPr>
+          <w:rPr>
+            <w:rFonts w:ascii="Times New Roman" w:hAnsi="Times New Roman" w:eastAsia="Times New Roman" w:cs="Times New Roman"/>
+          </w:rPr>
+          <m:t>)</m:t>
+        </m:r>
+        <m:r>
+          <m:rPr>
+            <m:sty m:val="p"/>
+          </m:rPr>
+          <w:rPr>
+            <w:rFonts w:ascii="Times New Roman" w:hAnsi="Times New Roman" w:eastAsia="Times New Roman" w:cs="Times New Roman"/>
+          </w:rPr>
+          <m:t>=</m:t>
+        </m:r>
+        <m:sSub>
+          <m:e>
+            <m:r>
+              <w:rPr>
+                <w:rFonts w:ascii="Times New Roman" w:hAnsi="Times New Roman" w:eastAsia="Times New Roman" w:cs="Times New Roman"/>
+              </w:rPr>
+              <m:t>b</m:t>
+            </m:r>
+          </m:e>
+          <m:sub>
+            <m:r>
+              <w:rPr>
+                <w:rFonts w:ascii="Times New Roman" w:hAnsi="Times New Roman" w:eastAsia="Times New Roman" w:cs="Times New Roman"/>
+              </w:rPr>
+              <m:t>c</m:t>
+            </m:r>
+          </m:sub>
+        </m:sSub>
+        <m:r>
+          <m:rPr>
+            <m:sty m:val="p"/>
+          </m:rPr>
+          <w:rPr>
+            <w:rFonts w:ascii="Times New Roman" w:hAnsi="Times New Roman" w:eastAsia="Times New Roman" w:cs="Times New Roman"/>
+          </w:rPr>
+          <m:t>(</m:t>
+        </m:r>
+        <m:r>
+          <w:rPr>
+            <w:rFonts w:ascii="Times New Roman" w:hAnsi="Times New Roman" w:eastAsia="Times New Roman" w:cs="Times New Roman"/>
+          </w:rPr>
+          <m:t>x</m:t>
+        </m:r>
+        <m:r>
+          <m:rPr>
+            <m:sty m:val="p"/>
+          </m:rPr>
+          <w:rPr>
+            <w:rFonts w:ascii="Times New Roman" w:hAnsi="Times New Roman" w:eastAsia="Times New Roman" w:cs="Times New Roman"/>
+          </w:rPr>
+          <m:t>)</m:t>
+        </m:r>
+        <m:r>
+          <m:rPr>
+            <m:sty m:val="p"/>
+          </m:rPr>
+          <w:rPr>
+            <w:rFonts w:ascii="Times New Roman" w:hAnsi="Times New Roman" w:eastAsia="Times New Roman" w:cs="Times New Roman"/>
+          </w:rPr>
+          <m:t>−</m:t>
+        </m:r>
+        <m:sSub>
+          <m:e>
+            <m:r>
+              <w:rPr>
+                <w:rFonts w:ascii="Times New Roman" w:hAnsi="Times New Roman" w:eastAsia="Times New Roman" w:cs="Times New Roman"/>
+              </w:rPr>
+              <m:t>A</m:t>
+            </m:r>
+          </m:e>
+          <m:sub>
+            <m:r>
+              <w:rPr>
+                <w:rFonts w:ascii="Times New Roman" w:hAnsi="Times New Roman" w:eastAsia="Times New Roman" w:cs="Times New Roman"/>
+              </w:rPr>
+              <m:t>c</m:t>
+            </m:r>
+          </m:sub>
+        </m:sSub>
+        <m:r>
+          <m:rPr>
+            <m:sty m:val="p"/>
+          </m:rPr>
+          <w:rPr>
+            <w:rFonts w:ascii="Times New Roman" w:hAnsi="Times New Roman" w:eastAsia="Times New Roman" w:cs="Times New Roman"/>
+          </w:rPr>
+          <m:t>(</m:t>
+        </m:r>
+        <m:r>
+          <w:rPr>
+            <w:rFonts w:ascii="Times New Roman" w:hAnsi="Times New Roman" w:eastAsia="Times New Roman" w:cs="Times New Roman"/>
+          </w:rPr>
+          <m:t>x</m:t>
+        </m:r>
+        <m:r>
+          <m:rPr>
+            <m:sty m:val="p"/>
+          </m:rPr>
+          <w:rPr>
+            <w:rFonts w:ascii="Times New Roman" w:hAnsi="Times New Roman" w:eastAsia="Times New Roman" w:cs="Times New Roman"/>
+          </w:rPr>
+          <m:t>)</m:t>
+        </m:r>
+        <m:r>
+          <w:rPr>
+            <w:rFonts w:ascii="Times New Roman" w:hAnsi="Times New Roman" w:eastAsia="Times New Roman" w:cs="Times New Roman"/>
+          </w:rPr>
+          <m:t>v</m:t>
+        </m:r>
+      </m:oMath>
+      <w:r>
+        <w:rPr>
+          <w:rFonts w:ascii="Times New Roman" w:hAnsi="Times New Roman" w:eastAsia="Times New Roman" w:cs="Times New Roman"/>
+          <w:sz w:val="20"/>
+          <w:szCs w:val="20"/>
+        </w:rPr>
+        <w:t xml:space="preserve"> </w:t>
+      </w:r>
+      <w:r>
+        <w:rPr>
+          <w:rFonts w:ascii="Times New Roman" w:hAnsi="Times New Roman" w:eastAsia="Times New Roman" w:cs="Times New Roman"/>
+          <w:sz w:val="20"/>
+          <w:szCs w:val="20"/>
+        </w:rPr>
+        <w:t xml:space="preserve">and is stacked as</w:t>
+      </w:r>
+      <w:r>
+        <w:rPr>
+          <w:rFonts w:ascii="Times New Roman" w:hAnsi="Times New Roman" w:eastAsia="Times New Roman" w:cs="Times New Roman"/>
+          <w:sz w:val="20"/>
+          <w:szCs w:val="20"/>
+        </w:rPr>
+        <w:t xml:space="preserve"> </w:t>
+      </w:r>
+      <m:oMath>
+        <m:r>
+          <w:rPr>
+            <w:rFonts w:ascii="Times New Roman" w:hAnsi="Times New Roman" w:eastAsia="Times New Roman" w:cs="Times New Roman"/>
+          </w:rPr>
+          <m:t>A</m:t>
+        </m:r>
+        <m:r>
+          <m:rPr>
+            <m:sty m:val="p"/>
+          </m:rPr>
+          <w:rPr>
+            <w:rFonts w:ascii="Times New Roman" w:hAnsi="Times New Roman" w:eastAsia="Times New Roman" w:cs="Times New Roman"/>
+          </w:rPr>
+          <m:t>(</m:t>
+        </m:r>
+        <m:r>
+          <w:rPr>
+            <w:rFonts w:ascii="Times New Roman" w:hAnsi="Times New Roman" w:eastAsia="Times New Roman" w:cs="Times New Roman"/>
+          </w:rPr>
+          <m:t>x</m:t>
+        </m:r>
+        <m:r>
+          <m:rPr>
+            <m:sty m:val="p"/>
+          </m:rPr>
+          <w:rPr>
+            <w:rFonts w:ascii="Times New Roman" w:hAnsi="Times New Roman" w:eastAsia="Times New Roman" w:cs="Times New Roman"/>
+          </w:rPr>
+          <m:t>)</m:t>
+        </m:r>
+        <m:r>
+          <w:rPr>
+            <w:rFonts w:ascii="Times New Roman" w:hAnsi="Times New Roman" w:eastAsia="Times New Roman" w:cs="Times New Roman"/>
+          </w:rPr>
+          <m:t>v</m:t>
+        </m:r>
+        <m:r>
+          <m:rPr>
+            <m:sty m:val="p"/>
+          </m:rPr>
+          <w:rPr>
+            <w:rFonts w:ascii="Times New Roman" w:hAnsi="Times New Roman" w:eastAsia="Times New Roman" w:cs="Times New Roman"/>
+          </w:rPr>
+          <m:t>≤</m:t>
+        </m:r>
+        <m:r>
+          <w:rPr>
+            <w:rFonts w:ascii="Times New Roman" w:hAnsi="Times New Roman" w:eastAsia="Times New Roman" w:cs="Times New Roman"/>
+          </w:rPr>
+          <m:t>b</m:t>
+        </m:r>
+        <m:r>
+          <m:rPr>
+            <m:sty m:val="p"/>
+          </m:rPr>
+          <w:rPr>
+            <w:rFonts w:ascii="Times New Roman" w:hAnsi="Times New Roman" w:eastAsia="Times New Roman" w:cs="Times New Roman"/>
+          </w:rPr>
+          <m:t>(</m:t>
+        </m:r>
+        <m:r>
+          <w:rPr>
+            <w:rFonts w:ascii="Times New Roman" w:hAnsi="Times New Roman" w:eastAsia="Times New Roman" w:cs="Times New Roman"/>
+          </w:rPr>
+          <m:t>x</m:t>
+        </m:r>
+        <m:r>
+          <m:rPr>
+            <m:sty m:val="p"/>
+          </m:rPr>
+          <w:rPr>
+            <w:rFonts w:ascii="Times New Roman" w:hAnsi="Times New Roman" w:eastAsia="Times New Roman" w:cs="Times New Roman"/>
+          </w:rPr>
+          <m:t>)</m:t>
+        </m:r>
+      </m:oMath>
+      <w:r>
+        <w:rPr>
+          <w:rFonts w:ascii="Times New Roman" w:hAnsi="Times New Roman" w:eastAsia="Times New Roman" w:cs="Times New Roman"/>
+          <w:sz w:val="20"/>
+          <w:szCs w:val="20"/>
+        </w:rPr>
+        <w:t xml:space="preserve">. Applying the same construction to</w:t>
       </w:r>
       <w:r>
         <w:rPr>
@@ -10227,6 +11488,50 @@
               <w:rPr>
                 <w:rFonts w:ascii="Times New Roman" w:hAnsi="Times New Roman" w:eastAsia="Times New Roman" w:cs="Times New Roman"/>
               </w:rPr>
+              <m:t>f</m:t>
+            </m:r>
+          </m:e>
+          <m:sub>
+            <m:r>
+              <w:rPr>
+                <w:rFonts w:ascii="Times New Roman" w:hAnsi="Times New Roman" w:eastAsia="Times New Roman" w:cs="Times New Roman"/>
+              </w:rPr>
+              <m:t>0</m:t>
+            </m:r>
+          </m:sub>
+        </m:sSub>
+      </m:oMath>
+      <w:r>
+        <w:rPr>
+          <w:rFonts w:ascii="Times New Roman" w:hAnsi="Times New Roman" w:eastAsia="Times New Roman" w:cs="Times New Roman"/>
+          <w:sz w:val="20"/>
+          <w:szCs w:val="20"/>
+        </w:rPr>
+        <w:t xml:space="preserve"> </w:t>
+      </w:r>
+      <w:r>
+        <w:rPr>
+          <w:rFonts w:ascii="Times New Roman" w:hAnsi="Times New Roman" w:eastAsia="Times New Roman" w:cs="Times New Roman"/>
+          <w:sz w:val="20"/>
+          <w:szCs w:val="20"/>
+        </w:rPr>
+        <w:t xml:space="preserve">without GP correction gives</w:t>
+      </w:r>
+      <w:r>
+        <w:rPr>
+          <w:rFonts w:ascii="Times New Roman" w:hAnsi="Times New Roman" w:eastAsia="Times New Roman" w:cs="Times New Roman"/>
+          <w:sz w:val="20"/>
+          <w:szCs w:val="20"/>
+        </w:rPr>
+        <w:t xml:space="preserve"> </w:t>
+      </w:r>
+      <m:oMath>
+        <m:sSub>
+          <m:e>
+            <m:r>
+              <w:rPr>
+                <w:rFonts w:ascii="Times New Roman" w:hAnsi="Times New Roman" w:eastAsia="Times New Roman" w:cs="Times New Roman"/>
+              </w:rPr>
               <m:t>A</m:t>
             </m:r>
           </m:e>
@@ -10327,7 +11632,7 @@
           <w:sz w:val="20"/>
           <w:szCs w:val="20"/>
         </w:rPr>
-        <w:t xml:space="preserve">. This preserves the bookkeeping between pressure (</w:t>
+        <w:t xml:space="preserve">, which is used only for the no-GP ablation. This convention preserves the bookkeeping between pressure (</w:t>
       </w:r>
       <m:oMath>
         <m:r>
@@ -12018,7 +13323,7 @@
                 <w:sz w:val="20"/>
                 <w:szCs w:val="20"/>
               </w:rPr>
-              <w:t>(8)</w:t>
+              <w:t>(9)</w:t>
             </w:r>
           </w:p>
         </w:tc>
@@ -12698,7 +14003,7 @@
           <w:sz w:val="20"/>
           <w:szCs w:val="20"/>
         </w:rPr>
-        <w:t xml:space="preserve">(8)</w:t>
+        <w:t xml:space="preserve">(9)</w:t>
       </w:r>
       <w:r>
         <w:rPr>
@@ -13592,7 +14897,7 @@
                 <w:sz w:val="20"/>
                 <w:szCs w:val="20"/>
               </w:rPr>
-              <w:t>(9)</w:t>
+              <w:t>(10)</w:t>
             </w:r>
           </w:p>
         </w:tc>
@@ -14899,7 +16204,7 @@
                 <w:sz w:val="20"/>
                 <w:szCs w:val="20"/>
               </w:rPr>
-              <w:t>(10)</w:t>
+              <w:t>(11)</w:t>
             </w:r>
           </w:p>
         </w:tc>
@@ -16154,7 +17459,7 @@
                 <w:sz w:val="20"/>
                 <w:szCs w:val="20"/>
               </w:rPr>
-              <w:t>(11)</w:t>
+              <w:t>(12)</w:t>
             </w:r>
           </w:p>
         </w:tc>
@@ -16610,7 +17915,7 @@
           <w:sz w:val="20"/>
           <w:szCs w:val="20"/>
         </w:rPr>
-        <w:t xml:space="preserve">. The resulting HOCBF constraint is</w:t>
+        <w:t xml:space="preserve">. The resulting mean-corrected HOCBF constraint is</w:t>
       </w:r>
       <w:r>
         <w:rPr>
@@ -16621,24 +17926,12 @@
         <w:t xml:space="preserve"> </w:t>
       </w:r>
       <m:oMath>
-        <m:sSub>
-          <m:e>
-            <m:r>
-              <w:rPr>
-                <w:rFonts w:ascii="Times New Roman" w:hAnsi="Times New Roman" w:eastAsia="Times New Roman" w:cs="Times New Roman"/>
-              </w:rPr>
-              <m:t>A</m:t>
-            </m:r>
-          </m:e>
-          <m:sub>
-            <m:r>
-              <w:rPr>
-                <w:rFonts w:ascii="Times New Roman" w:hAnsi="Times New Roman" w:eastAsia="Times New Roman" w:cs="Times New Roman"/>
-              </w:rPr>
-              <m:t>0</m:t>
-            </m:r>
-          </m:sub>
-        </m:sSub>
+        <m:r>
+          <w:rPr>
+            <w:rFonts w:ascii="Times New Roman" w:hAnsi="Times New Roman" w:eastAsia="Times New Roman" w:cs="Times New Roman"/>
+          </w:rPr>
+          <m:t>A</m:t>
+        </m:r>
         <m:r>
           <m:rPr>
             <m:sty m:val="p"/>
@@ -16678,24 +17971,12 @@
           </w:rPr>
           <m:t>≤</m:t>
         </m:r>
-        <m:sSub>
-          <m:e>
-            <m:r>
-              <w:rPr>
-                <w:rFonts w:ascii="Times New Roman" w:hAnsi="Times New Roman" w:eastAsia="Times New Roman" w:cs="Times New Roman"/>
-              </w:rPr>
-              <m:t>b</m:t>
-            </m:r>
-          </m:e>
-          <m:sub>
-            <m:r>
-              <w:rPr>
-                <w:rFonts w:ascii="Times New Roman" w:hAnsi="Times New Roman" w:eastAsia="Times New Roman" w:cs="Times New Roman"/>
-              </w:rPr>
-              <m:t>0</m:t>
-            </m:r>
-          </m:sub>
-        </m:sSub>
+        <m:r>
+          <w:rPr>
+            <w:rFonts w:ascii="Times New Roman" w:hAnsi="Times New Roman" w:eastAsia="Times New Roman" w:cs="Times New Roman"/>
+          </w:rPr>
+          <m:t>b</m:t>
+        </m:r>
         <m:r>
           <m:rPr>
             <m:sty m:val="p"/>
@@ -17389,7 +18670,7 @@
           <w:sz w:val="20"/>
           <w:szCs w:val="20"/>
         </w:rPr>
-        <w:t xml:space="preserve">(8)</w:t>
+        <w:t xml:space="preserve">(9)</w:t>
       </w:r>
       <w:r>
         <w:rPr>
@@ -17843,7 +19124,7 @@
           <w:sz w:val="20"/>
           <w:szCs w:val="20"/>
         </w:rPr>
-        <w:t xml:space="preserve">(11)</w:t>
+        <w:t xml:space="preserve">(12)</w:t>
       </w:r>
       <w:r>
         <w:rPr>
@@ -18820,7 +20101,7 @@
           <w:sz w:val="20"/>
           <w:szCs w:val="20"/>
         </w:rPr>
-        <w:t xml:space="preserve">denote the induced top-level HOCBF residual after substituting the deviation-input model. Under Assumptions </w:t>
+        <w:t xml:space="preserve">denote the induced top-level HOCBF residual after substituting the deviation-input model. If</w:t>
       </w:r>
       <w:r>
         <w:rPr>
@@ -18830,97 +20111,15 @@
           <w:sz w:val="20"/>
           <w:szCs w:val="20"/>
         </w:rPr>
-        <w:t xml:space="preserve">1</w:t>
-      </w:r>
-      <w:r>
-        <w:rPr>
-          <w:rFonts w:ascii="Times New Roman" w:hAnsi="Times New Roman" w:eastAsia="Times New Roman" w:cs="Times New Roman"/>
-          <w:i/>
-          <w:iCs/>
-          <w:sz w:val="20"/>
-          <w:szCs w:val="20"/>
-        </w:rPr>
-        <w:t xml:space="preserve">–</w:t>
-      </w:r>
-      <w:r>
-        <w:rPr>
-          <w:rFonts w:ascii="Times New Roman" w:hAnsi="Times New Roman" w:eastAsia="Times New Roman" w:cs="Times New Roman"/>
-          <w:i/>
-          <w:iCs/>
-          <w:sz w:val="20"/>
-          <w:szCs w:val="20"/>
-        </w:rPr>
-        <w:t xml:space="preserve">4</w:t>
-      </w:r>
-      <w:r>
-        <w:rPr>
-          <w:rFonts w:ascii="Times New Roman" w:hAnsi="Times New Roman" w:eastAsia="Times New Roman" w:cs="Times New Roman"/>
-          <w:i/>
-          <w:iCs/>
-          <w:sz w:val="20"/>
-          <w:szCs w:val="20"/>
-        </w:rPr>
-        <w:t xml:space="preserve">, the QP in Eq. </w:t>
-      </w:r>
-      <w:r>
-        <w:rPr>
-          <w:rFonts w:ascii="Times New Roman" w:hAnsi="Times New Roman" w:eastAsia="Times New Roman" w:cs="Times New Roman"/>
-          <w:i/>
-          <w:iCs/>
-          <w:sz w:val="20"/>
-          <w:szCs w:val="20"/>
-        </w:rPr>
-        <w:t xml:space="preserve">(3)</w:t>
-      </w:r>
-      <w:r>
-        <w:rPr>
-          <w:rFonts w:ascii="Times New Roman" w:hAnsi="Times New Roman" w:eastAsia="Times New Roman" w:cs="Times New Roman"/>
-          <w:i/>
-          <w:iCs/>
-          <w:sz w:val="20"/>
-          <w:szCs w:val="20"/>
-        </w:rPr>
-        <w:t xml:space="preserve"> </w:t>
-      </w:r>
-      <w:r>
-        <w:rPr>
-          <w:rFonts w:ascii="Times New Roman" w:hAnsi="Times New Roman" w:eastAsia="Times New Roman" w:cs="Times New Roman"/>
-          <w:i/>
-          <w:iCs/>
-          <w:sz w:val="20"/>
-          <w:szCs w:val="20"/>
-        </w:rPr>
-        <w:t xml:space="preserve">with</w:t>
-      </w:r>
-      <w:r>
-        <w:rPr>
-          <w:rFonts w:ascii="Times New Roman" w:hAnsi="Times New Roman" w:eastAsia="Times New Roman" w:cs="Times New Roman"/>
-          <w:i/>
-          <w:iCs/>
-          <w:sz w:val="20"/>
-          <w:szCs w:val="20"/>
-        </w:rPr>
         <w:t xml:space="preserve"> </w:t>
       </w:r>
       <m:oMath>
-        <m:sSub>
-          <m:e>
-            <m:r>
-              <w:rPr>
-                <w:rFonts w:ascii="Times New Roman" w:hAnsi="Times New Roman" w:eastAsia="Times New Roman" w:cs="Times New Roman"/>
-              </w:rPr>
-              <m:t>ϵ</m:t>
-            </m:r>
-          </m:e>
-          <m:sub>
-            <m:r>
-              <w:rPr>
-                <w:rFonts w:ascii="Times New Roman" w:hAnsi="Times New Roman" w:eastAsia="Times New Roman" w:cs="Times New Roman"/>
-              </w:rPr>
-              <m:t>κ</m:t>
-            </m:r>
-          </m:sub>
-        </m:sSub>
+        <m:r>
+          <w:rPr>
+            <w:rFonts w:ascii="Times New Roman" w:hAnsi="Times New Roman" w:eastAsia="Times New Roman" w:cs="Times New Roman"/>
+          </w:rPr>
+          <m:t>x</m:t>
+        </m:r>
         <m:r>
           <m:rPr>
             <m:sty m:val="p"/>
@@ -18928,46 +20127,32 @@
           <w:rPr>
             <w:rFonts w:ascii="Times New Roman" w:hAnsi="Times New Roman" w:eastAsia="Times New Roman" w:cs="Times New Roman"/>
           </w:rPr>
-          <m:t>=</m:t>
-        </m:r>
-        <m:r>
-          <w:rPr>
-            <w:rFonts w:ascii="Times New Roman" w:hAnsi="Times New Roman" w:eastAsia="Times New Roman" w:cs="Times New Roman"/>
-          </w:rPr>
-          <m:t>1</m:t>
-        </m:r>
-      </m:oMath>
-      <w:r>
-        <w:rPr>
-          <w:rFonts w:ascii="Times New Roman" w:hAnsi="Times New Roman" w:eastAsia="Times New Roman" w:cs="Times New Roman"/>
-          <w:i/>
-          <w:iCs/>
-          <w:sz w:val="20"/>
-          <w:szCs w:val="20"/>
-        </w:rPr>
-        <w:t xml:space="preserve"> </w:t>
-      </w:r>
-      <w:r>
-        <w:rPr>
-          <w:rFonts w:ascii="Times New Roman" w:hAnsi="Times New Roman" w:eastAsia="Times New Roman" w:cs="Times New Roman"/>
-          <w:i/>
-          <w:iCs/>
-          <w:sz w:val="20"/>
-          <w:szCs w:val="20"/>
-        </w:rPr>
-        <w:t xml:space="preserve">renders</w:t>
-      </w:r>
-      <w:r>
-        <w:rPr>
-          <w:rFonts w:ascii="Times New Roman" w:hAnsi="Times New Roman" w:eastAsia="Times New Roman" w:cs="Times New Roman"/>
-          <w:i/>
-          <w:iCs/>
-          <w:sz w:val="20"/>
-          <w:szCs w:val="20"/>
-        </w:rPr>
-        <w:t xml:space="preserve"> </w:t>
-      </w:r>
-      <m:oMath>
+          <m:t>(</m:t>
+        </m:r>
+        <m:r>
+          <w:rPr>
+            <w:rFonts w:ascii="Times New Roman" w:hAnsi="Times New Roman" w:eastAsia="Times New Roman" w:cs="Times New Roman"/>
+          </w:rPr>
+          <m:t>0</m:t>
+        </m:r>
+        <m:r>
+          <m:rPr>
+            <m:sty m:val="p"/>
+          </m:rPr>
+          <w:rPr>
+            <w:rFonts w:ascii="Times New Roman" w:hAnsi="Times New Roman" w:eastAsia="Times New Roman" w:cs="Times New Roman"/>
+          </w:rPr>
+          <m:t>)</m:t>
+        </m:r>
+        <m:r>
+          <m:rPr>
+            <m:sty m:val="p"/>
+          </m:rPr>
+          <w:rPr>
+            <w:rFonts w:ascii="Times New Roman" w:hAnsi="Times New Roman" w:eastAsia="Times New Roman" w:cs="Times New Roman"/>
+          </w:rPr>
+          <m:t>∈</m:t>
+        </m:r>
         <m:r>
           <m:rPr>
             <m:scr m:val="script"/>
@@ -18979,6 +20164,203 @@
           <m:t>C</m:t>
         </m:r>
       </m:oMath>
+      <w:r>
+        <w:rPr>
+          <w:rFonts w:ascii="Times New Roman" w:hAnsi="Times New Roman" w:eastAsia="Times New Roman" w:cs="Times New Roman"/>
+          <w:i/>
+          <w:iCs/>
+          <w:sz w:val="20"/>
+          <w:szCs w:val="20"/>
+        </w:rPr>
+        <w:t xml:space="preserve">, then, under Assumptions </w:t>
+      </w:r>
+      <w:r>
+        <w:rPr>
+          <w:rFonts w:ascii="Times New Roman" w:hAnsi="Times New Roman" w:eastAsia="Times New Roman" w:cs="Times New Roman"/>
+          <w:i/>
+          <w:iCs/>
+          <w:sz w:val="20"/>
+          <w:szCs w:val="20"/>
+        </w:rPr>
+        <w:t xml:space="preserve">1</w:t>
+      </w:r>
+      <w:r>
+        <w:rPr>
+          <w:rFonts w:ascii="Times New Roman" w:hAnsi="Times New Roman" w:eastAsia="Times New Roman" w:cs="Times New Roman"/>
+          <w:i/>
+          <w:iCs/>
+          <w:sz w:val="20"/>
+          <w:szCs w:val="20"/>
+        </w:rPr>
+        <w:t xml:space="preserve">–</w:t>
+      </w:r>
+      <w:r>
+        <w:rPr>
+          <w:rFonts w:ascii="Times New Roman" w:hAnsi="Times New Roman" w:eastAsia="Times New Roman" w:cs="Times New Roman"/>
+          <w:i/>
+          <w:iCs/>
+          <w:sz w:val="20"/>
+          <w:szCs w:val="20"/>
+        </w:rPr>
+        <w:t xml:space="preserve">4</w:t>
+      </w:r>
+      <w:r>
+        <w:rPr>
+          <w:rFonts w:ascii="Times New Roman" w:hAnsi="Times New Roman" w:eastAsia="Times New Roman" w:cs="Times New Roman"/>
+          <w:i/>
+          <w:iCs/>
+          <w:sz w:val="20"/>
+          <w:szCs w:val="20"/>
+        </w:rPr>
+        <w:t xml:space="preserve">, the QP in Eq. </w:t>
+      </w:r>
+      <w:r>
+        <w:rPr>
+          <w:rFonts w:ascii="Times New Roman" w:hAnsi="Times New Roman" w:eastAsia="Times New Roman" w:cs="Times New Roman"/>
+          <w:i/>
+          <w:iCs/>
+          <w:sz w:val="20"/>
+          <w:szCs w:val="20"/>
+        </w:rPr>
+        <w:t xml:space="preserve">(3)</w:t>
+      </w:r>
+      <w:r>
+        <w:rPr>
+          <w:rFonts w:ascii="Times New Roman" w:hAnsi="Times New Roman" w:eastAsia="Times New Roman" w:cs="Times New Roman"/>
+          <w:i/>
+          <w:iCs/>
+          <w:sz w:val="20"/>
+          <w:szCs w:val="20"/>
+        </w:rPr>
+        <w:t xml:space="preserve"> </w:t>
+      </w:r>
+      <w:r>
+        <w:rPr>
+          <w:rFonts w:ascii="Times New Roman" w:hAnsi="Times New Roman" w:eastAsia="Times New Roman" w:cs="Times New Roman"/>
+          <w:i/>
+          <w:iCs/>
+          <w:sz w:val="20"/>
+          <w:szCs w:val="20"/>
+        </w:rPr>
+        <w:t xml:space="preserve">with</w:t>
+      </w:r>
+      <w:r>
+        <w:rPr>
+          <w:rFonts w:ascii="Times New Roman" w:hAnsi="Times New Roman" w:eastAsia="Times New Roman" w:cs="Times New Roman"/>
+          <w:i/>
+          <w:iCs/>
+          <w:sz w:val="20"/>
+          <w:szCs w:val="20"/>
+        </w:rPr>
+        <w:t xml:space="preserve"> </w:t>
+      </w:r>
+      <m:oMath>
+        <m:sSub>
+          <m:e>
+            <m:r>
+              <w:rPr>
+                <w:rFonts w:ascii="Times New Roman" w:hAnsi="Times New Roman" w:eastAsia="Times New Roman" w:cs="Times New Roman"/>
+              </w:rPr>
+              <m:t>ϵ</m:t>
+            </m:r>
+          </m:e>
+          <m:sub>
+            <m:r>
+              <w:rPr>
+                <w:rFonts w:ascii="Times New Roman" w:hAnsi="Times New Roman" w:eastAsia="Times New Roman" w:cs="Times New Roman"/>
+              </w:rPr>
+              <m:t>κ</m:t>
+            </m:r>
+          </m:sub>
+        </m:sSub>
+        <m:r>
+          <m:rPr>
+            <m:sty m:val="p"/>
+          </m:rPr>
+          <w:rPr>
+            <w:rFonts w:ascii="Times New Roman" w:hAnsi="Times New Roman" w:eastAsia="Times New Roman" w:cs="Times New Roman"/>
+          </w:rPr>
+          <m:t>=</m:t>
+        </m:r>
+        <m:r>
+          <w:rPr>
+            <w:rFonts w:ascii="Times New Roman" w:hAnsi="Times New Roman" w:eastAsia="Times New Roman" w:cs="Times New Roman"/>
+          </w:rPr>
+          <m:t>1</m:t>
+        </m:r>
+      </m:oMath>
+      <w:r>
+        <w:rPr>
+          <w:rFonts w:ascii="Times New Roman" w:hAnsi="Times New Roman" w:eastAsia="Times New Roman" w:cs="Times New Roman"/>
+          <w:i/>
+          <w:iCs/>
+          <w:sz w:val="20"/>
+          <w:szCs w:val="20"/>
+        </w:rPr>
+        <w:t xml:space="preserve"> </w:t>
+      </w:r>
+      <w:r>
+        <w:rPr>
+          <w:rFonts w:ascii="Times New Roman" w:hAnsi="Times New Roman" w:eastAsia="Times New Roman" w:cs="Times New Roman"/>
+          <w:i/>
+          <w:iCs/>
+          <w:sz w:val="20"/>
+          <w:szCs w:val="20"/>
+        </w:rPr>
+        <w:t xml:space="preserve">renders the set</w:t>
+      </w:r>
+      <w:r>
+        <w:rPr>
+          <w:rFonts w:ascii="Times New Roman" w:hAnsi="Times New Roman" w:eastAsia="Times New Roman" w:cs="Times New Roman"/>
+          <w:i/>
+          <w:iCs/>
+          <w:sz w:val="20"/>
+          <w:szCs w:val="20"/>
+        </w:rPr>
+        <w:t xml:space="preserve"> </w:t>
+      </w:r>
+      <m:oMath>
+        <m:r>
+          <m:rPr>
+            <m:scr m:val="script"/>
+            <m:sty m:val="p"/>
+          </m:rPr>
+          <w:rPr>
+            <w:rFonts w:ascii="Times New Roman" w:hAnsi="Times New Roman" w:eastAsia="Times New Roman" w:cs="Times New Roman"/>
+          </w:rPr>
+          <m:t>C</m:t>
+        </m:r>
+      </m:oMath>
+      <w:r>
+        <w:rPr>
+          <w:rFonts w:ascii="Times New Roman" w:hAnsi="Times New Roman" w:eastAsia="Times New Roman" w:cs="Times New Roman"/>
+          <w:i/>
+          <w:iCs/>
+          <w:sz w:val="20"/>
+          <w:szCs w:val="20"/>
+        </w:rPr>
+        <w:t xml:space="preserve"> </w:t>
+      </w:r>
+      <w:r>
+        <w:rPr>
+          <w:rFonts w:ascii="Times New Roman" w:hAnsi="Times New Roman" w:eastAsia="Times New Roman" w:cs="Times New Roman"/>
+          <w:i/>
+          <w:iCs/>
+          <w:sz w:val="20"/>
+          <w:szCs w:val="20"/>
+        </w:rPr>
+        <w:t xml:space="preserve">in Eq. </w:t>
+      </w:r>
+      <w:r>
+        <w:rPr>
+          <w:rFonts w:ascii="Times New Roman" w:hAnsi="Times New Roman" w:eastAsia="Times New Roman" w:cs="Times New Roman"/>
+          <w:i/>
+          <w:iCs/>
+          <w:sz w:val="20"/>
+          <w:szCs w:val="20"/>
+        </w:rPr>
+        <w:t xml:space="preserve">(8)</w:t>
+      </w:r>
       <w:r>
         <w:rPr>
           <w:rFonts w:ascii="Times New Roman" w:hAnsi="Times New Roman" w:eastAsia="Times New Roman" w:cs="Times New Roman"/>
@@ -19666,24 +21048,12 @@
         <w:t xml:space="preserve"> </w:t>
       </w:r>
       <m:oMath>
-        <m:sSub>
-          <m:e>
-            <m:r>
-              <w:rPr>
-                <w:rFonts w:ascii="Times New Roman" w:hAnsi="Times New Roman" w:eastAsia="Times New Roman" w:cs="Times New Roman"/>
-              </w:rPr>
-              <m:t>A</m:t>
-            </m:r>
-          </m:e>
-          <m:sub>
-            <m:r>
-              <w:rPr>
-                <w:rFonts w:ascii="Times New Roman" w:hAnsi="Times New Roman" w:eastAsia="Times New Roman" w:cs="Times New Roman"/>
-              </w:rPr>
-              <m:t>0</m:t>
-            </m:r>
-          </m:sub>
-        </m:sSub>
+        <m:r>
+          <w:rPr>
+            <w:rFonts w:ascii="Times New Roman" w:hAnsi="Times New Roman" w:eastAsia="Times New Roman" w:cs="Times New Roman"/>
+          </w:rPr>
+          <m:t>A</m:t>
+        </m:r>
         <m:r>
           <m:rPr>
             <m:sty m:val="p"/>
@@ -19723,24 +21093,12 @@
           </w:rPr>
           <m:t>≤</m:t>
         </m:r>
-        <m:sSub>
-          <m:e>
-            <m:r>
-              <w:rPr>
-                <w:rFonts w:ascii="Times New Roman" w:hAnsi="Times New Roman" w:eastAsia="Times New Roman" w:cs="Times New Roman"/>
-              </w:rPr>
-              <m:t>b</m:t>
-            </m:r>
-          </m:e>
-          <m:sub>
-            <m:r>
-              <w:rPr>
-                <w:rFonts w:ascii="Times New Roman" w:hAnsi="Times New Roman" w:eastAsia="Times New Roman" w:cs="Times New Roman"/>
-              </w:rPr>
-              <m:t>0</m:t>
-            </m:r>
-          </m:sub>
-        </m:sSub>
+        <m:r>
+          <w:rPr>
+            <w:rFonts w:ascii="Times New Roman" w:hAnsi="Times New Roman" w:eastAsia="Times New Roman" w:cs="Times New Roman"/>
+          </w:rPr>
+          <m:t>b</m:t>
+        </m:r>
         <m:r>
           <m:rPr>
             <m:sty m:val="p"/>
@@ -19772,7 +21130,132 @@
           <w:sz w:val="20"/>
           <w:szCs w:val="20"/>
         </w:rPr>
-        <w:t xml:space="preserve">, i.e., the nominal HOCBF constraint with GP mean correction only. No robustness margin is applied beyond the mean correction itself.</w:t>
+        <w:t xml:space="preserve">, i.e., the GP-mean-corrected HOCBF constraint without an additional robustness margin. The separate</w:t>
+      </w:r>
+      <w:r>
+        <w:rPr>
+          <w:rFonts w:ascii="Times New Roman" w:hAnsi="Times New Roman" w:eastAsia="Times New Roman" w:cs="Times New Roman"/>
+          <w:sz w:val="20"/>
+          <w:szCs w:val="20"/>
+        </w:rPr>
+        <w:t xml:space="preserve"> </w:t>
+      </w:r>
+      <m:oMath>
+        <m:sSub>
+          <m:e>
+            <m:r>
+              <w:rPr>
+                <w:rFonts w:ascii="Times New Roman" w:hAnsi="Times New Roman" w:eastAsia="Times New Roman" w:cs="Times New Roman"/>
+              </w:rPr>
+              <m:t>A</m:t>
+            </m:r>
+          </m:e>
+          <m:sub>
+            <m:r>
+              <w:rPr>
+                <w:rFonts w:ascii="Times New Roman" w:hAnsi="Times New Roman" w:eastAsia="Times New Roman" w:cs="Times New Roman"/>
+              </w:rPr>
+              <m:t>0</m:t>
+            </m:r>
+          </m:sub>
+        </m:sSub>
+        <m:r>
+          <m:rPr>
+            <m:sty m:val="p"/>
+          </m:rPr>
+          <w:rPr>
+            <w:rFonts w:ascii="Times New Roman" w:hAnsi="Times New Roman" w:eastAsia="Times New Roman" w:cs="Times New Roman"/>
+          </w:rPr>
+          <m:t>(</m:t>
+        </m:r>
+        <m:r>
+          <w:rPr>
+            <w:rFonts w:ascii="Times New Roman" w:hAnsi="Times New Roman" w:eastAsia="Times New Roman" w:cs="Times New Roman"/>
+          </w:rPr>
+          <m:t>x</m:t>
+        </m:r>
+        <m:r>
+          <m:rPr>
+            <m:sty m:val="p"/>
+          </m:rPr>
+          <w:rPr>
+            <w:rFonts w:ascii="Times New Roman" w:hAnsi="Times New Roman" w:eastAsia="Times New Roman" w:cs="Times New Roman"/>
+          </w:rPr>
+          <m:t>)</m:t>
+        </m:r>
+        <m:r>
+          <w:rPr>
+            <w:rFonts w:ascii="Times New Roman" w:hAnsi="Times New Roman" w:eastAsia="Times New Roman" w:cs="Times New Roman"/>
+          </w:rPr>
+          <m:t>v</m:t>
+        </m:r>
+        <m:r>
+          <m:rPr>
+            <m:sty m:val="p"/>
+          </m:rPr>
+          <w:rPr>
+            <w:rFonts w:ascii="Times New Roman" w:hAnsi="Times New Roman" w:eastAsia="Times New Roman" w:cs="Times New Roman"/>
+          </w:rPr>
+          <m:t>≤</m:t>
+        </m:r>
+        <m:sSub>
+          <m:e>
+            <m:r>
+              <w:rPr>
+                <w:rFonts w:ascii="Times New Roman" w:hAnsi="Times New Roman" w:eastAsia="Times New Roman" w:cs="Times New Roman"/>
+              </w:rPr>
+              <m:t>b</m:t>
+            </m:r>
+          </m:e>
+          <m:sub>
+            <m:r>
+              <w:rPr>
+                <w:rFonts w:ascii="Times New Roman" w:hAnsi="Times New Roman" w:eastAsia="Times New Roman" w:cs="Times New Roman"/>
+              </w:rPr>
+              <m:t>0</m:t>
+            </m:r>
+          </m:sub>
+        </m:sSub>
+        <m:r>
+          <m:rPr>
+            <m:sty m:val="p"/>
+          </m:rPr>
+          <w:rPr>
+            <w:rFonts w:ascii="Times New Roman" w:hAnsi="Times New Roman" w:eastAsia="Times New Roman" w:cs="Times New Roman"/>
+          </w:rPr>
+          <m:t>(</m:t>
+        </m:r>
+        <m:r>
+          <w:rPr>
+            <w:rFonts w:ascii="Times New Roman" w:hAnsi="Times New Roman" w:eastAsia="Times New Roman" w:cs="Times New Roman"/>
+          </w:rPr>
+          <m:t>x</m:t>
+        </m:r>
+        <m:r>
+          <m:rPr>
+            <m:sty m:val="p"/>
+          </m:rPr>
+          <w:rPr>
+            <w:rFonts w:ascii="Times New Roman" w:hAnsi="Times New Roman" w:eastAsia="Times New Roman" w:cs="Times New Roman"/>
+          </w:rPr>
+          <m:t>)</m:t>
+        </m:r>
+      </m:oMath>
+      <w:r>
+        <w:rPr>
+          <w:rFonts w:ascii="Times New Roman" w:hAnsi="Times New Roman" w:eastAsia="Times New Roman" w:cs="Times New Roman"/>
+          <w:sz w:val="20"/>
+          <w:szCs w:val="20"/>
+        </w:rPr>
+        <w:t xml:space="preserve"> </w:t>
+      </w:r>
+      <w:r>
+        <w:rPr>
+          <w:rFonts w:ascii="Times New Roman" w:hAnsi="Times New Roman" w:eastAsia="Times New Roman" w:cs="Times New Roman"/>
+          <w:sz w:val="20"/>
+          <w:szCs w:val="20"/>
+        </w:rPr>
+        <w:t xml:space="preserve">notation denotes the no-GP ablation.</w:t>
       </w:r>
     </w:p>
     <w:p>
@@ -21365,7 +22848,7 @@
           <w:sz w:val="20"/>
           <w:szCs w:val="20"/>
         </w:rPr>
-        <w:t xml:space="preserve">Coverage monitoring combines the input z-score and 0.5th–99.5th training quantiles, the validation-set 99th percentile of posterior standard deviation, and the standardized one-step innovation. Moderate OOD enters full-row nominal-HOCBF operation for at most ten 1 s cycles; GP operation resumes only after ten consecutive healthy cycles. A persistent coverage failure enters latched live-DCS bypass. Innovation above 5, invalid measurements or communication, non-finite/model-load faults, nominal-QP or actuator-constraint infeasibility, violation of a direct physical bound, pressure-low physical margin below 2.0 MPa, or QP/task timeout bypasses the degraded stage immediately. This nominal-HOCBF interval is a bounded transition mode without a GP coverage claim, not a certified substitute for the GP-RHOCBF mode.</w:t>
+        <w:t xml:space="preserve">Coverage monitoring combines the input z-score and 0.5th–99.5th training quantiles, the validation-set 99th percentile of posterior standard deviation, and the standardized one-step residual-rate innovation. Moderate OOD enters full-row nominal-HOCBF operation for at most ten 1 s cycles; GP operation resumes only after ten consecutive healthy cycles. A persistent coverage failure enters latched live-DCS bypass. Innovation above 5, invalid measurements or communication, non-finite/model-load faults, nominal-QP or actuator-constraint infeasibility, violation of a direct physical bound, pressure-low physical margin below 2.0 MPa, or QP/task timeout bypasses the degraded stage immediately. This nominal-HOCBF interval is a bounded transition mode without a GP coverage claim, not a certified substitute for the GP-RHOCBF mode.</w:t>
       </w:r>
     </w:p>
     <w:p>
@@ -23601,7 +25084,7 @@
                 <w:sz w:val="20"/>
                 <w:szCs w:val="20"/>
               </w:rPr>
-              <w:t>(12)</w:t>
+              <w:t>(13)</w:t>
             </w:r>
           </w:p>
         </w:tc>
@@ -23955,7 +25438,7 @@
           <w:sz w:val="20"/>
           <w:szCs w:val="20"/>
         </w:rPr>
-        <w:t xml:space="preserve">(12)</w:t>
+        <w:t xml:space="preserve">(13)</w:t>
       </w:r>
       <w:r>
         <w:rPr>
@@ -25361,7 +26844,7 @@
                 <w:sz w:val="18"/>
                 <w:szCs w:val="18"/>
               </w:rPr>
-              <w:t xml:space="preserve">RoCBF-SF commissioned (</w:t>
+              <w:t xml:space="preserve">RoCBF-SF composite primary row (</w:t>
             </w:r>
             <m:oMath>
               <m:sSub>
@@ -26024,7 +27507,7 @@
           <w:sz w:val="20"/>
           <w:szCs w:val="20"/>
         </w:rPr>
-        <w:t xml:space="preserve">000, all in S3. The scenario-wise commissioned row applies the independently selected</w:t>
+        <w:t xml:space="preserve">000, all in S3. The composite primary row applies the independently tune-selected</w:t>
       </w:r>
       <w:r>
         <w:rPr>
@@ -26083,7 +27566,66 @@
           <w:sz w:val="20"/>
           <w:szCs w:val="20"/>
         </w:rPr>
-        <w:t xml:space="preserve">in S3 and 0 otherwise, giving 0/17</w:t>
+        <w:t xml:space="preserve">in S3 and the mean-only endpoint</w:t>
+      </w:r>
+      <w:r>
+        <w:rPr>
+          <w:rFonts w:ascii="Times New Roman" w:hAnsi="Times New Roman" w:eastAsia="Times New Roman" w:cs="Times New Roman"/>
+          <w:sz w:val="20"/>
+          <w:szCs w:val="20"/>
+        </w:rPr>
+        <w:t xml:space="preserve"> </w:t>
+      </w:r>
+      <m:oMath>
+        <m:sSub>
+          <m:e>
+            <m:r>
+              <w:rPr>
+                <w:rFonts w:ascii="Times New Roman" w:hAnsi="Times New Roman" w:eastAsia="Times New Roman" w:cs="Times New Roman"/>
+              </w:rPr>
+              <m:t>ϵ</m:t>
+            </m:r>
+          </m:e>
+          <m:sub>
+            <m:r>
+              <w:rPr>
+                <w:rFonts w:ascii="Times New Roman" w:hAnsi="Times New Roman" w:eastAsia="Times New Roman" w:cs="Times New Roman"/>
+              </w:rPr>
+              <m:t>κ</m:t>
+            </m:r>
+          </m:sub>
+        </m:sSub>
+        <m:r>
+          <m:rPr>
+            <m:sty m:val="p"/>
+          </m:rPr>
+          <w:rPr>
+            <w:rFonts w:ascii="Times New Roman" w:hAnsi="Times New Roman" w:eastAsia="Times New Roman" w:cs="Times New Roman"/>
+          </w:rPr>
+          <m:t>=</m:t>
+        </m:r>
+        <m:r>
+          <w:rPr>
+            <w:rFonts w:ascii="Times New Roman" w:hAnsi="Times New Roman" w:eastAsia="Times New Roman" w:cs="Times New Roman"/>
+          </w:rPr>
+          <m:t>0</m:t>
+        </m:r>
+      </m:oMath>
+      <w:r>
+        <w:rPr>
+          <w:rFonts w:ascii="Times New Roman" w:hAnsi="Times New Roman" w:eastAsia="Times New Roman" w:cs="Times New Roman"/>
+          <w:sz w:val="20"/>
+          <w:szCs w:val="20"/>
+        </w:rPr>
+        <w:t xml:space="preserve"> </w:t>
+      </w:r>
+      <w:r>
+        <w:rPr>
+          <w:rFonts w:ascii="Times New Roman" w:hAnsi="Times New Roman" w:eastAsia="Times New Roman" w:cs="Times New Roman"/>
+          <w:sz w:val="20"/>
+          <w:szCs w:val="20"/>
+        </w:rPr>
+        <w:t xml:space="preserve">in the nominal case and the other five mismatch conditions, giving 0/17</w:t>
       </w:r>
       <w:r>
         <w:rPr>
@@ -26099,7 +27641,7 @@
           <w:sz w:val="20"/>
           <w:szCs w:val="20"/>
         </w:rPr>
-        <w:t xml:space="preserve">500 observed violations across the nominal and six mismatch conditions. Each condition is a separate offline commissioning regime with its own frozen scenario-specific GP; this row compares commissioned operating points across prescribed residual regimes rather than switching</w:t>
+        <w:t xml:space="preserve">500 observed violations. Only S3 underwent tune/test factor selection; the zero-margin entries in the other six conditions are not presented as separate held-out calibrations. Each condition retains its own frozen scenario-specific GP, so the row compares prescribed offline operating points rather than switching</w:t>
       </w:r>
       <w:r>
         <w:rPr>
@@ -27489,7 +29031,7 @@
           <w:sz w:val="20"/>
           <w:szCs w:val="20"/>
         </w:rPr>
-        <w:t xml:space="preserve">(12)</w:t>
+        <w:t xml:space="preserve">(13)</w:t>
       </w:r>
       <w:r>
         <w:rPr>
@@ -27512,141 +29054,6 @@
           <w:sz w:val="20"/>
           <w:szCs w:val="20"/>
         </w:rPr>
-        <w:t xml:space="preserve">In this representative rollout, the no-GP HOCBF records 203/300 violations, GP mean correction reduces the count to 30/300, and the calibrated setting records 0/300. The corresponding minimum enthalpy margins are</w:t>
-      </w:r>
-      <w:r>
-        <w:rPr>
-          <w:rFonts w:ascii="Times New Roman" w:hAnsi="Times New Roman" w:eastAsia="Times New Roman" w:cs="Times New Roman"/>
-          <w:sz w:val="20"/>
-          <w:szCs w:val="20"/>
-        </w:rPr>
-        <w:t xml:space="preserve"> </w:t>
-      </w:r>
-      <w:r>
-        <w:rPr>
-          <w:rFonts w:ascii="Times New Roman" w:hAnsi="Times New Roman" w:eastAsia="Times New Roman" w:cs="Times New Roman"/>
-          <w:sz w:val="20"/>
-          <w:szCs w:val="20"/>
-        </w:rPr>
-        <w:t>-51.993</w:t>
-      </w:r>
-      <w:r>
-        <w:rPr>
-          <w:rFonts w:ascii="Times New Roman" w:hAnsi="Times New Roman" w:eastAsia="Times New Roman" w:cs="Times New Roman"/>
-          <w:sz w:val="20"/>
-          <w:szCs w:val="20"/>
-        </w:rPr>
-        <w:t xml:space="preserve">,</w:t>
-      </w:r>
-      <w:r>
-        <w:rPr>
-          <w:rFonts w:ascii="Times New Roman" w:hAnsi="Times New Roman" w:eastAsia="Times New Roman" w:cs="Times New Roman"/>
-          <w:sz w:val="20"/>
-          <w:szCs w:val="20"/>
-        </w:rPr>
-        <w:t xml:space="preserve"> </w:t>
-      </w:r>
-      <w:r>
-        <w:rPr>
-          <w:rFonts w:ascii="Times New Roman" w:hAnsi="Times New Roman" w:eastAsia="Times New Roman" w:cs="Times New Roman"/>
-          <w:sz w:val="20"/>
-          <w:szCs w:val="20"/>
-        </w:rPr>
-        <w:t>-0.01996</w:t>
-      </w:r>
-      <w:r>
-        <w:rPr>
-          <w:rFonts w:ascii="Times New Roman" w:hAnsi="Times New Roman" w:eastAsia="Times New Roman" w:cs="Times New Roman"/>
-          <w:sz w:val="20"/>
-          <w:szCs w:val="20"/>
-        </w:rPr>
-        <w:t xml:space="preserve">, and</w:t>
-      </w:r>
-      <w:r>
-        <w:rPr>
-          <w:rFonts w:ascii="Times New Roman" w:hAnsi="Times New Roman" w:eastAsia="Times New Roman" w:cs="Times New Roman"/>
-          <w:sz w:val="20"/>
-          <w:szCs w:val="20"/>
-        </w:rPr>
-        <w:t xml:space="preserve"> </w:t>
-      </w:r>
-      <w:r>
-        <w:rPr>
-          <w:rFonts w:ascii="Times New Roman" w:hAnsi="Times New Roman" w:eastAsia="Times New Roman" w:cs="Times New Roman"/>
-          <w:sz w:val="20"/>
-          <w:szCs w:val="20"/>
-        </w:rPr>
-        <w:t>+0.01028</w:t>
-      </w:r>
-      <w:r>
-        <w:rPr>
-          <w:rFonts w:ascii="Times New Roman" w:hAnsi="Times New Roman" w:eastAsia="Times New Roman" w:cs="Times New Roman"/>
-          <w:sz w:val="20"/>
-          <w:szCs w:val="20"/>
-        </w:rPr>
-        <w:t xml:space="preserve"> kJ/kg. This single-trajectory diagnostic illustrates the mechanism and is not used in place of the five-seed aggregate in Tables </w:t>
-      </w:r>
-      <w:r>
-        <w:rPr>
-          <w:rFonts w:ascii="Times New Roman" w:hAnsi="Times New Roman" w:eastAsia="Times New Roman" w:cs="Times New Roman"/>
-          <w:sz w:val="20"/>
-          <w:szCs w:val="20"/>
-        </w:rPr>
-        <w:t xml:space="preserve">2</w:t>
-      </w:r>
-      <w:r>
-        <w:rPr>
-          <w:rFonts w:ascii="Times New Roman" w:hAnsi="Times New Roman" w:eastAsia="Times New Roman" w:cs="Times New Roman"/>
-          <w:sz w:val="20"/>
-          <w:szCs w:val="20"/>
-        </w:rPr>
-        <w:t xml:space="preserve"> </w:t>
-      </w:r>
-      <w:r>
-        <w:rPr>
-          <w:rFonts w:ascii="Times New Roman" w:hAnsi="Times New Roman" w:eastAsia="Times New Roman" w:cs="Times New Roman"/>
-          <w:sz w:val="20"/>
-          <w:szCs w:val="20"/>
-        </w:rPr>
-        <w:t xml:space="preserve">and</w:t>
-      </w:r>
-      <w:r>
-        <w:rPr>
-          <w:rFonts w:ascii="Times New Roman" w:hAnsi="Times New Roman" w:eastAsia="Times New Roman" w:cs="Times New Roman"/>
-          <w:sz w:val="20"/>
-          <w:szCs w:val="20"/>
-        </w:rPr>
-        <w:t xml:space="preserve"> </w:t>
-      </w:r>
-      <w:r>
-        <w:rPr>
-          <w:rFonts w:ascii="Times New Roman" w:hAnsi="Times New Roman" w:eastAsia="Times New Roman" w:cs="Times New Roman"/>
-          <w:sz w:val="20"/>
-          <w:szCs w:val="20"/>
-        </w:rPr>
-        <w:t xml:space="preserve">3</w:t>
-      </w:r>
-      <w:r>
-        <w:rPr>
-          <w:rFonts w:ascii="Times New Roman" w:hAnsi="Times New Roman" w:eastAsia="Times New Roman" w:cs="Times New Roman"/>
-          <w:sz w:val="20"/>
-          <w:szCs w:val="20"/>
-        </w:rPr>
-        <w:t xml:space="preserve">.</w:t>
-      </w:r>
-    </w:p>
-    <w:p>
-      <w:pPr>
-        <w:pStyle w:val="3"/>
-        <w:jc w:val="left"/>
-        <w:ind w:firstLine="420"/>
-      </w:pPr>
-      <w:r>
-        <w:rPr>
-          <w:rFonts w:ascii="Times New Roman" w:hAnsi="Times New Roman" w:eastAsia="Times New Roman" w:cs="Times New Roman"/>
-          <w:sz w:val="20"/>
-          <w:szCs w:val="20"/>
-        </w:rPr>
         <w:t xml:space="preserve">Figure </w:t>
       </w:r>
       <w:r>
@@ -27778,7 +29185,7 @@
           <w:sz w:val="20"/>
           <w:szCs w:val="20"/>
         </w:rPr>
-        <w:t xml:space="preserve">margin keeps the minimum positive at</w:t>
+        <w:t xml:space="preserve">margin records 0/300 violations and keeps the minimum positive at</w:t>
       </w:r>
       <w:r>
         <w:rPr>
@@ -27802,7 +29209,55 @@
           <w:sz w:val="20"/>
           <w:szCs w:val="20"/>
         </w:rPr>
-        <w:t xml:space="preserve"> kJ/kg. The correction and event panels show that this change is produced by sustained QP intervention rather than by a different upstream proposal.</w:t>
+        <w:t xml:space="preserve"> kJ/kg. The correction and event panels show that this change is produced by sustained QP intervention rather than by a different upstream proposal. This single-trajectory diagnostic illustrates the mechanism and is not used in place of the five-seed aggregate in Tables </w:t>
+      </w:r>
+      <w:r>
+        <w:rPr>
+          <w:rFonts w:ascii="Times New Roman" w:hAnsi="Times New Roman" w:eastAsia="Times New Roman" w:cs="Times New Roman"/>
+          <w:sz w:val="20"/>
+          <w:szCs w:val="20"/>
+        </w:rPr>
+        <w:t xml:space="preserve">2</w:t>
+      </w:r>
+      <w:r>
+        <w:rPr>
+          <w:rFonts w:ascii="Times New Roman" w:hAnsi="Times New Roman" w:eastAsia="Times New Roman" w:cs="Times New Roman"/>
+          <w:sz w:val="20"/>
+          <w:szCs w:val="20"/>
+        </w:rPr>
+        <w:t xml:space="preserve"> </w:t>
+      </w:r>
+      <w:r>
+        <w:rPr>
+          <w:rFonts w:ascii="Times New Roman" w:hAnsi="Times New Roman" w:eastAsia="Times New Roman" w:cs="Times New Roman"/>
+          <w:sz w:val="20"/>
+          <w:szCs w:val="20"/>
+        </w:rPr>
+        <w:t xml:space="preserve">and</w:t>
+      </w:r>
+      <w:r>
+        <w:rPr>
+          <w:rFonts w:ascii="Times New Roman" w:hAnsi="Times New Roman" w:eastAsia="Times New Roman" w:cs="Times New Roman"/>
+          <w:sz w:val="20"/>
+          <w:szCs w:val="20"/>
+        </w:rPr>
+        <w:t xml:space="preserve"> </w:t>
+      </w:r>
+      <w:r>
+        <w:rPr>
+          <w:rFonts w:ascii="Times New Roman" w:hAnsi="Times New Roman" w:eastAsia="Times New Roman" w:cs="Times New Roman"/>
+          <w:sz w:val="20"/>
+          <w:szCs w:val="20"/>
+        </w:rPr>
+        <w:t xml:space="preserve">3</w:t>
+      </w:r>
+      <w:r>
+        <w:rPr>
+          <w:rFonts w:ascii="Times New Roman" w:hAnsi="Times New Roman" w:eastAsia="Times New Roman" w:cs="Times New Roman"/>
+          <w:sz w:val="20"/>
+          <w:szCs w:val="20"/>
+        </w:rPr>
+        <w:t xml:space="preserve">.</w:t>
       </w:r>
     </w:p>
     <w:p>
@@ -33781,7 +35236,7 @@
           <w:sz w:val="20"/>
           <w:szCs w:val="20"/>
         </w:rPr>
-        <w:t xml:space="preserve">000 mismatch-sample violations without a GP. Mean correction reduces that count to 36. Across separately commissioned scenario-specific GP models, the selected settings (</w:t>
+        <w:t xml:space="preserve">000 mismatch-sample violations without a GP. Mean correction reduces that count to 36. In the composite primary sweep, the tune-selected S3 setting (</w:t>
       </w:r>
       <m:oMath>
         <m:sSub>
@@ -33824,15 +35279,50 @@
           <w:sz w:val="20"/>
           <w:szCs w:val="20"/>
         </w:rPr>
-        <w:t xml:space="preserve"> </w:t>
-      </w:r>
-      <w:r>
-        <w:rPr>
-          <w:rFonts w:ascii="Times New Roman" w:hAnsi="Times New Roman" w:eastAsia="Times New Roman" w:cs="Times New Roman"/>
-          <w:sz w:val="20"/>
-          <w:szCs w:val="20"/>
-        </w:rPr>
-        <w:t xml:space="preserve">in S3 and 0 otherwise) give 0/17</w:t>
+        <w:t xml:space="preserve">) and the mean-only endpoint (</w:t>
+      </w:r>
+      <m:oMath>
+        <m:sSub>
+          <m:e>
+            <m:r>
+              <w:rPr>
+                <w:rFonts w:ascii="Times New Roman" w:hAnsi="Times New Roman" w:eastAsia="Times New Roman" w:cs="Times New Roman"/>
+              </w:rPr>
+              <m:t>ϵ</m:t>
+            </m:r>
+          </m:e>
+          <m:sub>
+            <m:r>
+              <w:rPr>
+                <w:rFonts w:ascii="Times New Roman" w:hAnsi="Times New Roman" w:eastAsia="Times New Roman" w:cs="Times New Roman"/>
+              </w:rPr>
+              <m:t>κ</m:t>
+            </m:r>
+          </m:sub>
+        </m:sSub>
+        <m:r>
+          <m:rPr>
+            <m:sty m:val="p"/>
+          </m:rPr>
+          <w:rPr>
+            <w:rFonts w:ascii="Times New Roman" w:hAnsi="Times New Roman" w:eastAsia="Times New Roman" w:cs="Times New Roman"/>
+          </w:rPr>
+          <m:t>=</m:t>
+        </m:r>
+        <m:r>
+          <w:rPr>
+            <w:rFonts w:ascii="Times New Roman" w:hAnsi="Times New Roman" w:eastAsia="Times New Roman" w:cs="Times New Roman"/>
+          </w:rPr>
+          <m:t>0</m:t>
+        </m:r>
+      </m:oMath>
+      <w:r>
+        <w:rPr>
+          <w:rFonts w:ascii="Times New Roman" w:hAnsi="Times New Roman" w:eastAsia="Times New Roman" w:cs="Times New Roman"/>
+          <w:sz w:val="20"/>
+          <w:szCs w:val="20"/>
+        </w:rPr>
+        <w:t xml:space="preserve">) in the remaining conditions give 0/17</w:t>
       </w:r>
       <w:r>
         <w:rPr>
@@ -33848,7 +35338,7 @@
           <w:sz w:val="20"/>
           <w:szCs w:val="20"/>
         </w:rPr>
-        <w:t xml:space="preserve">500 observed violations in the primary sweep; held-out S3 seeds give 66/50</w:t>
+        <w:t xml:space="preserve">500 observed violations; held-out S3 seeds give 66/50</w:t>
       </w:r>
       <w:r>
         <w:rPr>
@@ -33880,7 +35370,7 @@
           <w:sz w:val="20"/>
           <w:szCs w:val="20"/>
         </w:rPr>
-        <w:t xml:space="preserve">000 QP rejections. Conversely, the full implemented-margin endpoint can lose feasibility under actuator limits. These numerical settings are finite-sample commissioning points. The formal forward-invariance result requires</w:t>
+        <w:t xml:space="preserve">000 QP rejections. Only the S3 factor is supported by the reported tune/test selection. Conversely, the full implemented-margin endpoint can lose feasibility under actuator limits. These numerical settings are finite-sample commissioning points. The formal forward-invariance result requires</w:t>
       </w:r>
       <w:r>
         <w:rPr>

</xml_diff>

<commit_message>
paper: align field GP wording and rebuild revision files
</commit_message>
<xml_diff>
--- a/paper/revision_submission/manuscript_mc_revised_clean.docx
+++ b/paper/revision_submission/manuscript_mc_revised_clean.docx
@@ -3433,7 +3433,23 @@
           <w:sz w:val="20"/>
           <w:szCs w:val="20"/>
         </w:rPr>
-        <w:t xml:space="preserve">lists the measurement, constraint, GP, QP, fallback, and runtime settings used in the benchmark and plant implementation.</w:t>
+        <w:t xml:space="preserve">lists the benchmark constraint definitions alongside the principal GP, QP, fallback, and runtime settings. Field-specific direct bounds are reported with the plant-controller evidence in Section </w:t>
+      </w:r>
+      <w:r>
+        <w:rPr>
+          <w:rFonts w:ascii="Times New Roman" w:hAnsi="Times New Roman" w:eastAsia="Times New Roman" w:cs="Times New Roman"/>
+          <w:sz w:val="20"/>
+          <w:szCs w:val="20"/>
+        </w:rPr>
+        <w:t xml:space="preserve">4.5</w:t>
+      </w:r>
+      <w:r>
+        <w:rPr>
+          <w:rFonts w:ascii="Times New Roman" w:hAnsi="Times New Roman" w:eastAsia="Times New Roman" w:cs="Times New Roman"/>
+          <w:sz w:val="20"/>
+          <w:szCs w:val="20"/>
+        </w:rPr>
+        <w:t xml:space="preserve">.</w:t>
       </w:r>
     </w:p>
     <w:p>
@@ -3458,7 +3474,7 @@
           <w:sz w:val="20"/>
           <w:szCs w:val="20"/>
         </w:rPr>
-        <w:t xml:space="preserve">Variables and implementation settings used by the RoCBF-SF safety filter in the actuator-augmented CCS benchmark and plant implementation.</w:t>
+        <w:t xml:space="preserve">Benchmark constraint definitions and principal implementation settings used by the RoCBF-SF safety filter. Field-specific direct bounds are reported separately with the plant-controller evidence.</w:t>
       </w:r>
     </w:p>
     <w:tbl>
@@ -3466,7 +3482,7 @@
         <w:tblStyle w:val="Table"/>
         <w:tblW w:type="dxa" w:w="8500"/>
         <w:tblLook w:firstRow="1" w:lastRow="0" w:firstColumn="0" w:lastColumn="0" w:noHBand="0" w:noVBand="0" w:val="0020"/>
-        <w:tblCaption w:val="Table 1. Variables and implementation settings used by the RoCBF-SF safety filter in the actuator-augmented CCS benchmark and plant implementation."/>
+        <w:tblCaption w:val="Table 1. Benchmark constraint definitions and principal implementation settings used by the RoCBF-SF safety filter. Field-specific direct bounds are reported separately with the plant-controller evidence."/>
         <w:jc w:val="center"/>
         <w:tblLayout w:type="fixed"/>
         <w:tblCellMar>
@@ -4615,7 +4631,7 @@
                 <w:sz w:val="18"/>
                 <w:szCs w:val="18"/>
               </w:rPr>
-              <w:t xml:space="preserve">Main-steam pressure limit</w:t>
+              <w:t xml:space="preserve">Benchmark pressure constraint</w:t>
             </w:r>
           </w:p>
         </w:tc>
@@ -4860,7 +4876,7 @@
                 <w:sz w:val="18"/>
                 <w:szCs w:val="18"/>
               </w:rPr>
-              <w:t xml:space="preserve">Enthalpy limit</w:t>
+              <w:t xml:space="preserve">Benchmark enthalpy constraint</w:t>
             </w:r>
           </w:p>
         </w:tc>
@@ -4977,7 +4993,7 @@
                 <w:sz w:val="18"/>
                 <w:szCs w:val="18"/>
               </w:rPr>
-              <w:t xml:space="preserve">Power tracking band</w:t>
+              <w:t xml:space="preserve">Benchmark power constraint</w:t>
             </w:r>
           </w:p>
         </w:tc>
@@ -5330,7 +5346,7 @@
                 <w:sz w:val="18"/>
                 <w:szCs w:val="18"/>
               </w:rPr>
-              <w:t xml:space="preserve">Three 500-point Matérn-5 of 2 residual GPs with frozen input/output standardization</w:t>
+              <w:t xml:space="preserve">Three 500-point Matérn-5/2 residual GPs with frozen input/output standardization</w:t>
             </w:r>
           </w:p>
         </w:tc>
@@ -36565,7 +36581,7 @@
                 <w:sz w:val="18"/>
                 <w:szCs w:val="18"/>
               </w:rPr>
-              <w:t xml:space="preserve">Use a scenario-specific GP; select the smallest</w:t>
+              <w:t xml:space="preserve">Use a field-calibrated frozen GP whose training domain covers the commissioned operating envelope; select the smallest</w:t>
             </w:r>
             <w:r>
               <w:rPr>

</xml_diff>

<commit_message>
paper: finalize major-revision submission package
</commit_message>
<xml_diff>
--- a/paper/revision_submission/manuscript_mc_revised_clean.docx
+++ b/paper/revision_submission/manuscript_mc_revised_clean.docx
@@ -37893,6 +37893,287 @@
           <w:szCs w:val="20"/>
         </w:rPr>
         <w:t xml:space="preserve">formulation, and develop a sampled-data certificate for the 1 s zero-order-hold implementation. Further field validation should also retain the current separation between historian response evidence, controller-execution evidence, and full-row certificate conditions.</w:t>
+      </w:r>
+    </w:p>
+    <w:p>
+      <w:pPr>
+        <w:jc w:val="left"/>
+        <w:spacing w:before="0" w:after="0"/>
+      </w:pPr>
+      <w:r>
+        <w:rPr>
+          <w:rFonts w:ascii="Times New Roman" w:hAnsi="Times New Roman" w:eastAsia="Times New Roman" w:cs="Times New Roman"/>
+          <w:sz w:val="24"/>
+          <w:szCs w:val="24"/>
+          <w:color w:val="000000"/>
+          <w:b/>
+          <w:bCs/>
+          <w:i/>
+          <w:iCs/>
+        </w:rPr>
+        <w:t xml:space="preserve">Statements and Declarations</w:t>
+      </w:r>
+    </w:p>
+    <w:p>
+      <w:pPr>
+        <w:jc w:val="left"/>
+        <w:spacing w:before="0" w:after="0"/>
+      </w:pPr>
+      <w:r>
+        <w:rPr>
+          <w:rFonts w:ascii="Times New Roman" w:hAnsi="Times New Roman" w:eastAsia="Times New Roman" w:cs="Times New Roman"/>
+          <w:sz w:val="20"/>
+          <w:szCs w:val="20"/>
+          <w:color w:val="000000"/>
+          <w:b/>
+          <w:bCs/>
+          <w:i/>
+          <w:iCs/>
+        </w:rPr>
+        <w:t xml:space="preserve">Ethical considerations</w:t>
+      </w:r>
+    </w:p>
+    <w:p>
+      <w:pPr>
+        <w:pStyle w:val="11"/>
+        <w:jc w:val="left"/>
+        <w:ind w:firstLine="420"/>
+      </w:pPr>
+      <w:r>
+        <w:rPr>
+          <w:rFonts w:ascii="Times New Roman" w:hAnsi="Times New Roman" w:eastAsia="Times New Roman" w:cs="Times New Roman"/>
+          <w:sz w:val="20"/>
+          <w:szCs w:val="20"/>
+        </w:rPr>
+        <w:t xml:space="preserve">Not applicable. This study did not involve human participants, human data, human tissue, or animal experiments.</w:t>
+      </w:r>
+    </w:p>
+    <w:p>
+      <w:pPr>
+        <w:jc w:val="left"/>
+        <w:spacing w:before="0" w:after="0"/>
+      </w:pPr>
+      <w:r>
+        <w:rPr>
+          <w:rFonts w:ascii="Times New Roman" w:hAnsi="Times New Roman" w:eastAsia="Times New Roman" w:cs="Times New Roman"/>
+          <w:sz w:val="20"/>
+          <w:szCs w:val="20"/>
+          <w:color w:val="000000"/>
+          <w:b/>
+          <w:bCs/>
+          <w:i/>
+          <w:iCs/>
+        </w:rPr>
+        <w:t xml:space="preserve">Consent to participate</w:t>
+      </w:r>
+    </w:p>
+    <w:p>
+      <w:pPr>
+        <w:pStyle w:val="11"/>
+        <w:jc w:val="left"/>
+        <w:ind w:firstLine="420"/>
+      </w:pPr>
+      <w:r>
+        <w:rPr>
+          <w:rFonts w:ascii="Times New Roman" w:hAnsi="Times New Roman" w:eastAsia="Times New Roman" w:cs="Times New Roman"/>
+          <w:sz w:val="20"/>
+          <w:szCs w:val="20"/>
+        </w:rPr>
+        <w:t xml:space="preserve">Not applicable.</w:t>
+      </w:r>
+    </w:p>
+    <w:p>
+      <w:pPr>
+        <w:jc w:val="left"/>
+        <w:spacing w:before="0" w:after="0"/>
+      </w:pPr>
+      <w:r>
+        <w:rPr>
+          <w:rFonts w:ascii="Times New Roman" w:hAnsi="Times New Roman" w:eastAsia="Times New Roman" w:cs="Times New Roman"/>
+          <w:sz w:val="20"/>
+          <w:szCs w:val="20"/>
+          <w:color w:val="000000"/>
+          <w:b/>
+          <w:bCs/>
+          <w:i/>
+          <w:iCs/>
+        </w:rPr>
+        <w:t xml:space="preserve">Consent for publication</w:t>
+      </w:r>
+    </w:p>
+    <w:p>
+      <w:pPr>
+        <w:pStyle w:val="11"/>
+        <w:jc w:val="left"/>
+        <w:ind w:firstLine="420"/>
+      </w:pPr>
+      <w:r>
+        <w:rPr>
+          <w:rFonts w:ascii="Times New Roman" w:hAnsi="Times New Roman" w:eastAsia="Times New Roman" w:cs="Times New Roman"/>
+          <w:sz w:val="20"/>
+          <w:szCs w:val="20"/>
+        </w:rPr>
+        <w:t xml:space="preserve">Not applicable.</w:t>
+      </w:r>
+    </w:p>
+    <w:p>
+      <w:pPr>
+        <w:jc w:val="left"/>
+        <w:spacing w:before="0" w:after="0"/>
+      </w:pPr>
+      <w:r>
+        <w:rPr>
+          <w:rFonts w:ascii="Times New Roman" w:hAnsi="Times New Roman" w:eastAsia="Times New Roman" w:cs="Times New Roman"/>
+          <w:sz w:val="20"/>
+          <w:szCs w:val="20"/>
+          <w:color w:val="000000"/>
+          <w:b/>
+          <w:bCs/>
+          <w:i/>
+          <w:iCs/>
+        </w:rPr>
+        <w:t xml:space="preserve">Declaration of conflicting interests</w:t>
+      </w:r>
+    </w:p>
+    <w:p>
+      <w:pPr>
+        <w:pStyle w:val="11"/>
+        <w:jc w:val="left"/>
+        <w:ind w:firstLine="420"/>
+      </w:pPr>
+      <w:r>
+        <w:rPr>
+          <w:rFonts w:ascii="Times New Roman" w:hAnsi="Times New Roman" w:eastAsia="Times New Roman" w:cs="Times New Roman"/>
+          <w:sz w:val="20"/>
+          <w:szCs w:val="20"/>
+        </w:rPr>
+        <w:t xml:space="preserve">The author(s) declared no potential conflicts of interest with respect to the research, authorship, and/or publication of this article.</w:t>
+      </w:r>
+    </w:p>
+    <w:p>
+      <w:pPr>
+        <w:jc w:val="left"/>
+        <w:spacing w:before="0" w:after="0"/>
+      </w:pPr>
+      <w:r>
+        <w:rPr>
+          <w:rFonts w:ascii="Times New Roman" w:hAnsi="Times New Roman" w:eastAsia="Times New Roman" w:cs="Times New Roman"/>
+          <w:sz w:val="20"/>
+          <w:szCs w:val="20"/>
+          <w:color w:val="000000"/>
+          <w:b/>
+          <w:bCs/>
+          <w:i/>
+          <w:iCs/>
+        </w:rPr>
+        <w:t xml:space="preserve">Funding</w:t>
+      </w:r>
+    </w:p>
+    <w:p>
+      <w:pPr>
+        <w:pStyle w:val="11"/>
+        <w:jc w:val="left"/>
+        <w:ind w:firstLine="420"/>
+      </w:pPr>
+      <w:r>
+        <w:rPr>
+          <w:rFonts w:ascii="Times New Roman" w:hAnsi="Times New Roman" w:eastAsia="Times New Roman" w:cs="Times New Roman"/>
+          <w:sz w:val="20"/>
+          <w:szCs w:val="20"/>
+        </w:rPr>
+        <w:t xml:space="preserve">This work was supported by the Postdoctoral Research Project of China Resources Power Technology Research Institute Co., Ltd. (Internal Project No. 374322).</w:t>
+      </w:r>
+    </w:p>
+    <w:p>
+      <w:pPr>
+        <w:jc w:val="left"/>
+        <w:spacing w:before="0" w:after="0"/>
+      </w:pPr>
+      <w:r>
+        <w:rPr>
+          <w:rFonts w:ascii="Times New Roman" w:hAnsi="Times New Roman" w:eastAsia="Times New Roman" w:cs="Times New Roman"/>
+          <w:sz w:val="20"/>
+          <w:szCs w:val="20"/>
+          <w:color w:val="000000"/>
+          <w:b/>
+          <w:bCs/>
+          <w:i/>
+          <w:iCs/>
+        </w:rPr>
+        <w:t xml:space="preserve">Data availability</w:t>
+      </w:r>
+    </w:p>
+    <w:p>
+      <w:pPr>
+        <w:pStyle w:val="11"/>
+        <w:jc w:val="left"/>
+        <w:ind w:firstLine="420"/>
+      </w:pPr>
+      <w:r>
+        <w:rPr>
+          <w:rFonts w:ascii="Times New Roman" w:hAnsi="Times New Roman" w:eastAsia="Times New Roman" w:cs="Times New Roman"/>
+          <w:sz w:val="20"/>
+          <w:szCs w:val="20"/>
+        </w:rPr>
+        <w:t xml:space="preserve">The source code, simulation scripts, benchmark results, plotting scripts, derived plant-historian metrics, and bounded controller-export excerpts are available in the</w:t>
+      </w:r>
+      <w:r>
+        <w:rPr>
+          <w:rFonts w:ascii="Times New Roman" w:hAnsi="Times New Roman" w:eastAsia="Times New Roman" w:cs="Times New Roman"/>
+          <w:sz w:val="20"/>
+          <w:szCs w:val="20"/>
+        </w:rPr>
+        <w:t xml:space="preserve"> </w:t>
+      </w:r>
+      <w:r>
+        <w:rPr>
+          <w:rFonts w:ascii="Times New Roman" w:hAnsi="Times New Roman" w:eastAsia="Times New Roman" w:cs="Times New Roman"/>
+          <w:sz w:val="20"/>
+          <w:szCs w:val="20"/>
+        </w:rPr>
+        <w:t xml:space="preserve">GitHub repository</w:t>
+      </w:r>
+      <w:r>
+        <w:rPr>
+          <w:rFonts w:ascii="Times New Roman" w:hAnsi="Times New Roman" w:eastAsia="Times New Roman" w:cs="Times New Roman"/>
+          <w:sz w:val="20"/>
+          <w:szCs w:val="20"/>
+        </w:rPr>
+        <w:t xml:space="preserve">. Complete raw plant records are proprietary enterprise assets. Qualified researchers may request restricted access from the corresponding author, subject to data-owner approval and an executed data-use agreement.</w:t>
+      </w:r>
+    </w:p>
+    <w:p>
+      <w:pPr>
+        <w:jc w:val="left"/>
+        <w:spacing w:before="0" w:after="0"/>
+      </w:pPr>
+      <w:r>
+        <w:rPr>
+          <w:rFonts w:ascii="Times New Roman" w:hAnsi="Times New Roman" w:eastAsia="Times New Roman" w:cs="Times New Roman"/>
+          <w:sz w:val="20"/>
+          <w:szCs w:val="20"/>
+          <w:color w:val="000000"/>
+          <w:b/>
+          <w:bCs/>
+          <w:i/>
+          <w:iCs/>
+        </w:rPr>
+        <w:t xml:space="preserve">Declaration of generative AI and AI-assisted technologies</w:t>
+      </w:r>
+    </w:p>
+    <w:p>
+      <w:pPr>
+        <w:pStyle w:val="11"/>
+        <w:jc w:val="left"/>
+        <w:ind w:firstLine="420"/>
+      </w:pPr>
+      <w:r>
+        <w:rPr>
+          <w:rFonts w:ascii="Times New Roman" w:hAnsi="Times New Roman" w:eastAsia="Times New Roman" w:cs="Times New Roman"/>
+          <w:sz w:val="20"/>
+          <w:szCs w:val="20"/>
+        </w:rPr>
+        <w:t xml:space="preserve">During preparation of this work, the authors used Grammarly for English grammar checking. The authors reviewed and edited the manuscript and take full responsibility for its content.</w:t>
       </w:r>
     </w:p>
     <w:p>

</xml_diff>

<commit_message>
paper: close major-revision reproducibility gaps
</commit_message>
<xml_diff>
--- a/paper/revision_submission/manuscript_mc_revised_clean.docx
+++ b/paper/revision_submission/manuscript_mc_revised_clean.docx
@@ -107,7 +107,7 @@
           <w:sz w:val="20"/>
           <w:szCs w:val="20"/>
         </w:rPr>
-        <w:t xml:space="preserve">, HOCBF without GP correction records 65</w:t>
+        <w:t xml:space="preserve">, 65</w:t>
       </w:r>
       <w:r>
         <w:rPr>
@@ -123,7 +123,7 @@
           <w:sz w:val="20"/>
           <w:szCs w:val="20"/>
         </w:rPr>
-        <w:t xml:space="preserve">134 violating samples among 150</w:t>
+        <w:t xml:space="preserve">134/150</w:t>
       </w:r>
       <w:r>
         <w:rPr>
@@ -139,7 +139,7 @@
           <w:sz w:val="20"/>
           <w:szCs w:val="20"/>
         </w:rPr>
-        <w:t xml:space="preserve">000 samples from six mismatch scenarios. The predeclared tune/test rule selects</w:t>
+        <w:t xml:space="preserve">000 HOCBF-without-GP controller samples from six mismatch scenarios exceed at least one prespecified constraint tolerance. The predeclared tune/test rule selects</w:t>
       </w:r>
       <w:r>
         <w:rPr>
@@ -190,7 +190,7 @@
           <w:sz w:val="20"/>
           <w:szCs w:val="20"/>
         </w:rPr>
-        <w:t xml:space="preserve">; the resulting GP-mean filter and an NMPC reference each record 0/175</w:t>
+        <w:t xml:space="preserve">; under the same per-constraint native-unit tolerances, the resulting GP-mean filter and an NMPC reference each record 0/175</w:t>
       </w:r>
       <w:r>
         <w:rPr>
@@ -206,7 +206,7 @@
           <w:sz w:val="20"/>
           <w:szCs w:val="20"/>
         </w:rPr>
-        <w:t xml:space="preserve">000 observed violations in the primary sweep, and the fixed filter setting records 0/50</w:t>
+        <w:t xml:space="preserve">000 counted violations in the primary sweep, and the fixed filter setting records 0/50</w:t>
       </w:r>
       <w:r>
         <w:rPr>
@@ -222,7 +222,7 @@
           <w:sz w:val="20"/>
           <w:szCs w:val="20"/>
         </w:rPr>
-        <w:t xml:space="preserve">000 violations and 0/50</w:t>
+        <w:t xml:space="preserve">000 counted violations and 0/50</w:t>
       </w:r>
       <w:r>
         <w:rPr>
@@ -609,7 +609,7 @@
           <w:sz w:val="20"/>
           <w:szCs w:val="20"/>
         </w:rPr>
-        <w:t xml:space="preserve">For boiler-turbine control, the difficulty is structural. The selected pressure, separator-enthalpy, and power limits are command-level relative-degree-two constraints, and residual uncertainty propagates through the HOCBF recursion rather than appearing only at the final constraint row. Applying the full implemented margin can over-tighten the online QP, reduce actuator authority, or trigger fallback behavior. Applying no margin can also be unsafe when the perturbation is state-dependent and amplifies along the trajectory. The unresolved question is therefore not only how to construct a GP-HOCBF margin, but how much of that margin should be applied in real time for the residual structure observed during commissioning.</w:t>
+        <w:t xml:space="preserve">For boiler-turbine control, the difficulty is structural. The selected pressure, separator-enthalpy, and power limits are command-level relative-degree-two constraints, and residual uncertainty propagates through the HOCBF recursion rather than appearing only at the final constraint row. The resulting compositional margin is a candidate tightening, not evidence that a positive margin fraction must improve finite-sample safety. Applying the full implemented margin can over-tighten the online QP, reduce actuator authority, or trigger fallback behavior. The unresolved commissioning question is therefore whether any positive fraction of that margin is both necessary and feasible for the observed residual structure; a defensible selector must also be permitted to retain the GP-mean-only endpoint.</w:t>
       </w:r>
     </w:p>
     <w:p>
@@ -855,7 +855,7 @@
           <w:sz w:val="20"/>
           <w:szCs w:val="20"/>
         </w:rPr>
-        <w:t xml:space="preserve">interpolates between mean-corrected operation and the full implemented uncertainty margin, with diagnostics for selecting this factor under additive and state-dependent mismatch.</w:t>
+        <w:t xml:space="preserve">interpolates between mean-corrected operation and the full implemented uncertainty margin, with diagnostics that select the smallest setting passing safety and feasibility gates, including the mean-only endpoint when no positive fraction is supported.</w:t>
       </w:r>
     </w:p>
     <w:p>
@@ -1670,7 +1670,22 @@
           <w:sz w:val="20"/>
           <w:szCs w:val="20"/>
         </w:rPr>
-        <w:t xml:space="preserve">develop a real-time sparse-GP HOCBF filter for high-order robotic systems. These methods show that GP uncertainty can support HOCBF safety filters, but they do not target command-level relative-degree-two boiler–turbine constraints, DCS deployment, or commissioning diagnostics based on plant historian and controller-log records. Existing robust CBF and GP-CBF formulations also tend to interpret the uncertainty margin as a certificate-driven tightening term. In actuator-limited process-control loops, however, feasibility, fallback activation, and retained control authority are themselves safety-relevant. This leaves a commissioning question: how should residual-data coverage and replay diagnostics determine the usable fraction of the GP-HOCBF margin?</w:t>
+        <w:t xml:space="preserve">develop a real-time sparse-GP HOCBF filter for high-order robotic systems. These methods show that GP uncertainty can support HOCBF safety filters, but they do not target command-level relative-degree-two boiler–turbine constraints, DCS deployment, or commissioning diagnostics based on plant historian and controller-log records. Because their plants, residual models, online updates, and optimization programs differ from the present setting, a numerical reimplementation would not isolate the source of any performance difference. We instead hold the proposed command fixed and compare no-GP HOCBF, GP-mean-only HOCBF, and the full compositional-margin endpoint within one actuator-limited model.</w:t>
+      </w:r>
+    </w:p>
+    <w:p>
+      <w:pPr>
+        <w:pStyle w:val="3"/>
+        <w:jc w:val="left"/>
+        <w:ind w:firstLine="420"/>
+      </w:pPr>
+      <w:r>
+        <w:rPr>
+          <w:rFonts w:ascii="Times New Roman" w:hAnsi="Times New Roman" w:eastAsia="Times New Roman" w:cs="Times New Roman"/>
+          <w:sz w:val="20"/>
+          <w:szCs w:val="20"/>
+        </w:rPr>
+        <w:t xml:space="preserve">Existing robust CBF and GP-CBF formulations also tend to interpret the uncertainty margin as a certificate-driven tightening term. In actuator-limited process-control loops, however, feasibility, fallback activation, and retained control authority are themselves safety-relevant. The contribution here is not the generic observation that tightening can cause infeasibility, nor a claim that positive tightening is always beneficial. It is an explicit chain-level margin for the command-level HOCBF rows, together with a commissioning procedure that may select zero margin when GP mean correction already passes the prespecified safety and feasibility gates.</w:t>
       </w:r>
     </w:p>
     <w:p>
@@ -9361,7 +9376,7 @@
           <w:sz w:val="20"/>
           <w:szCs w:val="20"/>
         </w:rPr>
-        <w:t xml:space="preserve">selects and evaluates the calibrated benchmark operating point.</w:t>
+        <w:t xml:space="preserve">selects and evaluates the calibrated benchmark operating point. The selector is allowed to return zero when no positive margin fraction improves the prespecified safety and QP-feasibility gates.</w:t>
       </w:r>
     </w:p>
     <w:p>
@@ -12979,18 +12994,18 @@
           <ns2:inline>
             <ns2:extent cx="5270500" cy="2530763"/>
             <ns2:effectExtent b="0" l="0" r="0" t="0"/>
-            <ns2:docPr descr="" title="" id="33" name="Picture"/>
+            <ns2:docPr descr="" title="" id="104" name="Picture"/>
             <ns3:graphic>
               <ns3:graphicData uri="http://schemas.openxmlformats.org/drawingml/2006/picture">
                 <ns4:pic>
                   <ns4:nvPicPr>
-                    <ns4:cNvPr descr="figures/Figure_1.png" id="34" name="Picture"/>
+                    <ns4:cNvPr descr="figures/Figure_1.png" id="105" name="Picture"/>
                     <ns4:cNvPicPr>
                       <ns3:picLocks noChangeArrowheads="1" noChangeAspect="1"/>
                     </ns4:cNvPicPr>
                   </ns4:nvPicPr>
                   <ns4:blipFill>
-                    <ns3:blip ns5:embed="rId32"/>
+                    <ns3:blip ns5:embed="rId103"/>
                     <ns3:stretch>
                       <ns3:fillRect/>
                     </ns3:stretch>
@@ -23741,7 +23756,7 @@
           <w:sz w:val="20"/>
           <w:szCs w:val="20"/>
         </w:rPr>
-        <w:t xml:space="preserve">is data-driven. This distinction explains why additive perturbations can use</w:t>
+        <w:t xml:space="preserve">is data-driven. The S3 sweep therefore tests whether that heterogeneity makes a positive margin fraction useful. In the present seven-state benchmark it does not: GP mean correction already passes the prespecified safety gate, while positive tightening progressively consumes QP feasibility. The compositional margin remains the explicit candidate tightening and the</w:t>
       </w:r>
       <w:r>
         <w:rPr>
@@ -23783,7 +23798,7 @@
           <w:rPr>
             <w:rFonts w:ascii="Times New Roman" w:hAnsi="Times New Roman" w:eastAsia="Times New Roman" w:cs="Times New Roman"/>
           </w:rPr>
-          <ns1:t>0</ns1:t>
+          <ns1:t>1</ns1:t>
         </ns1:r>
       </ns1:oMath>
       <w:r>
@@ -23800,7 +23815,7 @@
           <w:sz w:val="20"/>
           <w:szCs w:val="20"/>
         </w:rPr>
-        <w:t xml:space="preserve">in the tested regime: GP mean correction supplies the effective adjustment, while the floor-driven margin mainly adds QP conservatism.</w:t>
+        <w:t xml:space="preserve">theorem endpoint; finite-sample commissioning is permitted to select zero.</w:t>
       </w:r>
     </w:p>
     <w:p>
@@ -24155,7 +24170,7 @@
           <w:sz w:val="20"/>
           <w:szCs w:val="20"/>
         </w:rPr>
-        <w:t xml:space="preserve">For field commissioning, approximately 14 days of 1 Hz data are divided into days 1–10 for the training candidate pool, day 11 as a 24 h isolation gap, and days 12–14 for validation. Five fixed load strata cover 180–660 MW; each contributes 100 training and 40 validation transitions. Within each stratum, candidates are thinned to at least 60 s spacing and selected by deterministic farthest-point coverage in standardized</w:t>
+        <w:t xml:space="preserve">For field commissioning, approximately 14 days of 1 Hz data are divided into days 1–10 for the training candidate pool, day 11 as a 24 h isolation gap, and days 12–14 for validation. Five fixed load strata partition the intended 180–660 MW commissioning domain; the upper 561–660 MW stratum is a coverage bin and does not imply an exact 660 MW steady hold. Each stratum contributes 100 training and 40 validation transitions. Within each stratum, candidates are thinned to at least 60 s spacing and selected by deterministic farthest-point coverage in standardized</w:t>
       </w:r>
       <w:r>
         <w:rPr>
@@ -26065,7 +26080,7 @@
           <w:sz w:val="20"/>
           <w:szCs w:val="20"/>
         </w:rPr>
-        <w:t xml:space="preserve">. Rejected QP candidates revert to the live upstream proposal and are counted as fallback events. A raw-margin numerical tolerance of</w:t>
+        <w:t xml:space="preserve">. Rejected QP candidates revert to the live upstream proposal and are counted as fallback events. Per-constraint numerical tolerances with the common numerical value</w:t>
       </w:r>
       <w:r>
         <w:rPr>
@@ -26118,7 +26133,7 @@
           <w:sz w:val="20"/>
           <w:szCs w:val="20"/>
         </w:rPr>
-        <w:t xml:space="preserve">is used only for counting binary state-limit violations; unrounded minimum margins remain in the result files.</w:t>
+        <w:t xml:space="preserve">in each barrier’s native unit are used only for counting binary state-limit violations; every comparison is performed on the corresponding unrounded constraint value.</w:t>
       </w:r>
     </w:p>
     <w:p>
@@ -26765,6 +26780,9 @@
                   <ns1:t>(</ns1:t>
                 </ns1:r>
                 <ns1:r>
+                  <ns1:rPr>
+                    <ns1:sty ns1:val="bi"/>
+                  </ns1:rPr>
                   <w:rPr>
                     <w:rFonts w:ascii="Times New Roman" w:hAnsi="Times New Roman" w:eastAsia="Times New Roman" w:cs="Times New Roman"/>
                   </w:rPr>
@@ -27042,27 +27060,36 @@
                       </w:rPr>
                       <ns1:t>{</ns1:t>
                     </ns1:r>
-                    <ns1:limLow>
-                      <ns1:e>
-                        <ns1:r>
-                          <ns1:rPr>
-                            <ns1:sty ns1:val="p"/>
-                          </ns1:rPr>
-                          <w:rPr>
-                            <w:rFonts w:ascii="Times New Roman" w:hAnsi="Times New Roman" w:eastAsia="Times New Roman" w:cs="Times New Roman"/>
-                          </w:rPr>
-                          <ns1:t>min</ns1:t>
-                        </ns1:r>
-                      </ns1:e>
-                      <ns1:lim>
-                        <ns1:r>
-                          <w:rPr>
-                            <w:rFonts w:ascii="Times New Roman" w:hAnsi="Times New Roman" w:eastAsia="Times New Roman" w:cs="Times New Roman"/>
-                          </w:rPr>
-                          <ns1:t>j</ns1:t>
-                        </ns1:r>
-                      </ns1:lim>
-                    </ns1:limLow>
+                    <ns1:r>
+                      <ns1:rPr>
+                        <ns1:sty ns1:val="p"/>
+                      </ns1:rPr>
+                      <w:rPr>
+                        <w:rFonts w:ascii="Times New Roman" w:hAnsi="Times New Roman" w:eastAsia="Times New Roman" w:cs="Times New Roman"/>
+                      </w:rPr>
+                      <ns1:t>∃</ns1:t>
+                    </ns1:r>
+                    <ns1:r>
+                      <w:rPr>
+                        <w:rFonts w:ascii="Times New Roman" w:hAnsi="Times New Roman" w:eastAsia="Times New Roman" w:cs="Times New Roman"/>
+                      </w:rPr>
+                      <ns1:t>j</ns1:t>
+                    </ns1:r>
+                    <ns1:r>
+                      <ns1:rPr>
+                        <ns1:sty ns1:val="p"/>
+                      </ns1:rPr>
+                      <w:rPr>
+                        <w:rFonts w:ascii="Times New Roman" w:hAnsi="Times New Roman" w:eastAsia="Times New Roman" w:cs="Times New Roman"/>
+                      </w:rPr>
+                      <ns1:t>:</ns1:t>
+                    </ns1:r>
+                    <ns1:r>
+                      <w:rPr>
+                        <w:rFonts w:ascii="Times New Roman" w:hAnsi="Times New Roman" w:eastAsia="Times New Roman" w:cs="Times New Roman"/>
+                      </w:rPr>
+                      <ns1:t> </ns1:t>
+                    </ns1:r>
                     <ns1:sSub>
                       <ns1:e>
                         <ns1:r>
@@ -27165,12 +27192,24 @@
                       </w:rPr>
                       <ns1:t>−</ns1:t>
                     </ns1:r>
-                    <ns1:r>
-                      <w:rPr>
-                        <w:rFonts w:ascii="Times New Roman" w:hAnsi="Times New Roman" w:eastAsia="Times New Roman" w:cs="Times New Roman"/>
-                      </w:rPr>
-                      <ns1:t>η</ns1:t>
-                    </ns1:r>
+                    <ns1:sSub>
+                      <ns1:e>
+                        <ns1:r>
+                          <w:rPr>
+                            <w:rFonts w:ascii="Times New Roman" w:hAnsi="Times New Roman" w:eastAsia="Times New Roman" w:cs="Times New Roman"/>
+                          </w:rPr>
+                          <ns1:t>η</ns1:t>
+                        </ns1:r>
+                      </ns1:e>
+                      <ns1:sub>
+                        <ns1:r>
+                          <w:rPr>
+                            <w:rFonts w:ascii="Times New Roman" w:hAnsi="Times New Roman" w:eastAsia="Times New Roman" w:cs="Times New Roman"/>
+                          </w:rPr>
+                          <ns1:t>j</ns1:t>
+                        </ns1:r>
+                      </ns1:sub>
+                    </ns1:sSub>
                     <ns1:r>
                       <ns1:rPr>
                         <ns1:sty ns1:val="p"/>
@@ -27363,7 +27402,7 @@
           <w:sz w:val="20"/>
           <w:szCs w:val="20"/>
         </w:rPr>
-        <w:t xml:space="preserve">where a sample is counted once if any enforced pressure, separator-enthalpy, or power barrier is below the stated numerical tolerance</w:t>
+        <w:t xml:space="preserve">where a sample is counted once if any enforced pressure, separator-enthalpy, or power barrier is below its own tolerance</w:t>
       </w:r>
       <w:r>
         <w:rPr>
@@ -27374,12 +27413,24 @@
         <w:t xml:space="preserve"> </w:t>
       </w:r>
       <ns1:oMath>
-        <ns1:r>
-          <w:rPr>
-            <w:rFonts w:ascii="Times New Roman" w:hAnsi="Times New Roman" w:eastAsia="Times New Roman" w:cs="Times New Roman"/>
-          </w:rPr>
-          <ns1:t>η</ns1:t>
-        </ns1:r>
+        <ns1:sSub>
+          <ns1:e>
+            <ns1:r>
+              <w:rPr>
+                <w:rFonts w:ascii="Times New Roman" w:hAnsi="Times New Roman" w:eastAsia="Times New Roman" w:cs="Times New Roman"/>
+              </w:rPr>
+              <ns1:t>η</ns1:t>
+            </ns1:r>
+          </ns1:e>
+          <ns1:sub>
+            <ns1:r>
+              <w:rPr>
+                <w:rFonts w:ascii="Times New Roman" w:hAnsi="Times New Roman" w:eastAsia="Times New Roman" w:cs="Times New Roman"/>
+              </w:rPr>
+              <ns1:t>j</ns1:t>
+            </ns1:r>
+          </ns1:sub>
+        </ns1:sSub>
       </ns1:oMath>
       <w:r>
         <w:rPr>
@@ -27419,7 +27470,7 @@
           <w:sz w:val="20"/>
           <w:szCs w:val="20"/>
         </w:rPr>
-        <w:t xml:space="preserve">uses</w:t>
+        <w:t xml:space="preserve">uses the same numerical value</w:t>
       </w:r>
       <w:r>
         <w:rPr>
@@ -27430,21 +27481,6 @@
         <w:t xml:space="preserve"> </w:t>
       </w:r>
       <ns1:oMath>
-        <ns1:r>
-          <w:rPr>
-            <w:rFonts w:ascii="Times New Roman" w:hAnsi="Times New Roman" w:eastAsia="Times New Roman" w:cs="Times New Roman"/>
-          </w:rPr>
-          <ns1:t>η</ns1:t>
-        </ns1:r>
-        <ns1:r>
-          <ns1:rPr>
-            <ns1:sty ns1:val="p"/>
-          </ns1:rPr>
-          <w:rPr>
-            <w:rFonts w:ascii="Times New Roman" w:hAnsi="Times New Roman" w:eastAsia="Times New Roman" w:cs="Times New Roman"/>
-          </w:rPr>
-          <ns1:t>=</ns1:t>
-        </ns1:r>
         <ns1:sSup>
           <ns1:e>
             <ns1:r>
@@ -27487,7 +27523,7 @@
           <w:sz w:val="20"/>
           <w:szCs w:val="20"/>
         </w:rPr>
-        <w:t xml:space="preserve">in raw barrier units to avoid counting QP boundary-roundoff as physical violation; the later stress-test diagnostics use the tolerance stated in their result files or captions. This is not an episode-level probability. Counts in Fig. </w:t>
+        <w:t xml:space="preserve">separately in the native unit of each barrier: MPa for pressure, kJ/kg for enthalpy, and MW for power. No minimum is taken across quantities with different units. These tolerances avoid counting QP boundary roundoff as a physical violation; later stress-test diagnostics use the tolerances stated in their result files or captions. This is not an episode-level probability. Counts in Fig. </w:t>
       </w:r>
       <w:r>
         <w:rPr>
@@ -27715,7 +27751,7 @@
           <w:sz w:val="20"/>
           <w:szCs w:val="20"/>
         </w:rPr>
-        <w:t xml:space="preserve">with a raw-margin numerical tolerance of</w:t>
+        <w:t xml:space="preserve">with per-constraint native-unit tolerances of numerical value</w:t>
       </w:r>
       <w:r>
         <w:rPr>
@@ -27843,7 +27879,7 @@
         <w:tblStyle w:val="Table"/>
         <w:tblW w:type="dxa" w:w="8500"/>
         <w:tblLook w:firstRow="1" w:lastRow="0" w:firstColumn="0" w:lastColumn="0" w:noHBand="0" w:noVBand="0" w:val="0020"/>
-        <w:tblCaption w:val="Table 2. Primary \Delta g=0 validation: sample-level constraint violation rate (%) at controller instants, computed by Eq. [eq:sample_violation_rate] with a raw-margin numerical tolerance of 10^{-2}. Each cell aggregates 50 independent 500-sample rollouts (25,000 controller samples). The fixed-proposal, HOCBF, and RoCBF-SF rows share the same upstream command; NMPC uses its own receding-horizon proposal. The \epsilon_\kappa=1 row is an implemented endpoint test, not the recommended commissioned setting."/>
+        <w:tblCaption w:val="Table 2. Primary \Delta g=0 validation: sample-level constraint violation rate (%) at controller instants, computed by Eq. [eq:sample_violation_rate] with per-constraint native-unit tolerances of numerical value 10^{-2}. Each cell aggregates 50 independent 500-sample rollouts (25,000 controller samples). The fixed-proposal, HOCBF, and RoCBF-SF rows share the same upstream command; NMPC uses its own receding-horizon proposal. The \epsilon_\kappa=1 row is an implemented endpoint test, not the recommended commissioned setting."/>
         <w:jc w:val="center"/>
         <w:tblLayout w:type="fixed"/>
         <w:tblCellMar>
@@ -29461,7 +29497,7 @@
           <w:sz w:val="20"/>
           <w:szCs w:val="20"/>
         </w:rPr>
-        <w:t xml:space="preserve">134 violating samples among 150</w:t>
+        <w:t xml:space="preserve">134 samples exceeding the per-constraint counting tolerances among 150</w:t>
       </w:r>
       <w:r>
         <w:rPr>
@@ -29544,7 +29580,7 @@
           <w:sz w:val="20"/>
           <w:szCs w:val="20"/>
         </w:rPr>
-        <w:t xml:space="preserve">000 observed violations across the nominal case and all six mismatch conditions. Each condition uses its own frozen scenario-specific GP; the controller does not identify the true scenario online. NMPC also records 0/175</w:t>
+        <w:t xml:space="preserve">000 counted violations across the nominal case and all six mismatch conditions. Each condition uses its own frozen scenario-specific GP; the controller does not identify the true scenario online. NMPC also records 0/175</w:t>
       </w:r>
       <w:r>
         <w:rPr>
@@ -29560,7 +29596,7 @@
           <w:sz w:val="20"/>
           <w:szCs w:val="20"/>
         </w:rPr>
-        <w:t xml:space="preserve">000 violations and no solver failure. The comparison therefore does not establish universal superiority over MPC; RoCBF-SF’s deployment distinction is its one-step downstream projection of an existing coordinated-controller command.</w:t>
+        <w:t xml:space="preserve">000 counted violations and no solver failure. The comparison therefore does not establish universal superiority over MPC; RoCBF-SF’s deployment distinction is its one-step downstream projection of an existing coordinated-controller command.</w:t>
       </w:r>
     </w:p>
     <w:p>
@@ -30760,20 +30796,20 @@
         </w:rPr>
         <w:drawing>
           <ns2:inline>
-            <ns2:extent cx="5006975" cy="3403463"/>
+            <ns2:extent cx="5006975" cy="3384165"/>
             <ns2:effectExtent b="0" l="0" r="0" t="0"/>
-            <ns2:docPr descr="" title="" id="49" name="Picture"/>
+            <ns2:docPr descr="" title="" id="120" name="Picture"/>
             <ns3:graphic>
               <ns3:graphicData uri="http://schemas.openxmlformats.org/drawingml/2006/picture">
                 <ns4:pic>
                   <ns4:nvPicPr>
-                    <ns4:cNvPr descr="figures/Figure_6_process_response.png" id="50" name="Picture"/>
+                    <ns4:cNvPr descr="figures/Figure_6_process_response.png" id="121" name="Picture"/>
                     <ns4:cNvPicPr>
                       <ns3:picLocks noChangeArrowheads="1" noChangeAspect="1"/>
                     </ns4:cNvPicPr>
                   </ns4:nvPicPr>
                   <ns4:blipFill>
-                    <ns3:blip ns5:embed="rId48"/>
+                    <ns3:blip ns5:embed="rId119"/>
                     <ns3:stretch>
                       <ns3:fillRect/>
                     </ns3:stretch>
@@ -30781,7 +30817,7 @@
                   <ns4:spPr bwMode="auto">
                     <ns3:xfrm>
                       <ns3:off x="0" y="0"/>
-                      <ns3:ext cx="5006975" cy="3403463"/>
+                      <ns3:ext cx="5006975" cy="3384165"/>
                     </ns3:xfrm>
                     <ns3:prstGeom prst="rect">
                       <ns3:avLst/>
@@ -30924,60 +30960,7 @@
           <w:sz w:val="20"/>
           <w:szCs w:val="20"/>
         </w:rPr>
-        <w:t xml:space="preserve">Full-rollout minimum pressure margin and sample-level violation rate; the symmetric-log horizontal scale resolves the tune-selected near-boundary trajectory while retaining the no-GP excursion. Lines in (a,b) are interpolated on a 0.1 s display grid only for visual continuity; open markers are the native 1 s controller samples, and all statistics use native samples and the</w:t>
-      </w:r>
-      <w:r>
-        <w:rPr>
-          <w:rFonts w:ascii="Times New Roman" w:hAnsi="Times New Roman" w:eastAsia="Times New Roman" w:cs="Times New Roman"/>
-          <w:sz w:val="20"/>
-          <w:szCs w:val="20"/>
-        </w:rPr>
-        <w:t xml:space="preserve"> </w:t>
-      </w:r>
-      <ns1:oMath>
-        <ns1:sSup>
-          <ns1:e>
-            <ns1:r>
-              <w:rPr>
-                <w:rFonts w:ascii="Times New Roman" w:hAnsi="Times New Roman" w:eastAsia="Times New Roman" w:cs="Times New Roman"/>
-              </w:rPr>
-              <ns1:t>10</ns1:t>
-            </ns1:r>
-          </ns1:e>
-          <ns1:sup>
-            <ns1:r>
-              <ns1:rPr>
-                <ns1:sty ns1:val="p"/>
-              </ns1:rPr>
-              <w:rPr>
-                <w:rFonts w:ascii="Times New Roman" w:hAnsi="Times New Roman" w:eastAsia="Times New Roman" w:cs="Times New Roman"/>
-              </w:rPr>
-              <ns1:t>−</ns1:t>
-            </ns1:r>
-            <ns1:r>
-              <w:rPr>
-                <w:rFonts w:ascii="Times New Roman" w:hAnsi="Times New Roman" w:eastAsia="Times New Roman" w:cs="Times New Roman"/>
-              </w:rPr>
-              <ns1:t>2</ns1:t>
-            </ns1:r>
-          </ns1:sup>
-        </ns1:sSup>
-      </ns1:oMath>
-      <w:r>
-        <w:rPr>
-          <w:rFonts w:ascii="Times New Roman" w:hAnsi="Times New Roman" w:eastAsia="Times New Roman" w:cs="Times New Roman"/>
-          <w:sz w:val="20"/>
-          <w:szCs w:val="20"/>
-        </w:rPr>
-        <w:t xml:space="preserve"> </w:t>
-      </w:r>
-      <w:r>
-        <w:rPr>
-          <w:rFonts w:ascii="Times New Roman" w:hAnsi="Times New Roman" w:eastAsia="Times New Roman" w:cs="Times New Roman"/>
-          <w:sz w:val="20"/>
-          <w:szCs w:val="20"/>
-        </w:rPr>
-        <w:t xml:space="preserve">counting tolerance defined in Eq. </w:t>
+        <w:t xml:space="preserve">Full-rollout minimum pressure margin and sample-level violation rate; the symmetric-log horizontal scale resolves the tune-selected near-boundary trajectory while retaining the no-GP excursion. Lines in (a,b) are interpolated on a 0.1 s display grid only for visual continuity; open markers are the native 1 s controller samples, and all statistics use native samples and the per-constraint counting tolerances defined in Eq. </w:t>
       </w:r>
       <w:r>
         <w:rPr>
@@ -31032,7 +31015,7 @@
           <w:sz w:val="20"/>
           <w:szCs w:val="20"/>
         </w:rPr>
-        <w:t xml:space="preserve">shows the pressure bottleneck directly in a representative S3 rollout. HOCBF without GP correction produces 239/300 violating samples and a minimum lower-pressure margin of</w:t>
+        <w:t xml:space="preserve">shows the pressure bottleneck directly in a representative S3 rollout. HOCBF without GP correction produces 239/300 counted violations and a minimum lower-pressure margin of</w:t>
       </w:r>
       <w:r>
         <w:rPr>
@@ -31099,7 +31082,7 @@
           <w:sz w:val="20"/>
           <w:szCs w:val="20"/>
         </w:rPr>
-        <w:t xml:space="preserve">) accepts all 300 QPs, intervenes on 241 samples, and records 0/300 violations under the stated counting tolerance; its unrounded minimum pressure margin is</w:t>
+        <w:t xml:space="preserve">) accepts all 300 QPs, intervenes on 241 samples, and records 0/300 counted violations under the stated pressure tolerance; its unrounded minimum pressure margin is</w:t>
       </w:r>
       <w:r>
         <w:rPr>
@@ -31234,18 +31217,18 @@
           <ns2:inline>
             <ns2:extent cx="5006975" cy="3407071"/>
             <ns2:effectExtent b="0" l="0" r="0" t="0"/>
-            <ns2:docPr descr="" title="" id="53" name="Picture"/>
+            <ns2:docPr descr="" title="" id="124" name="Picture"/>
             <ns3:graphic>
               <ns3:graphicData uri="http://schemas.openxmlformats.org/drawingml/2006/picture">
                 <ns4:pic>
                   <ns4:nvPicPr>
-                    <ns4:cNvPr descr="figures/Figure_8_model_mismatch.png" id="54" name="Picture"/>
+                    <ns4:cNvPr descr="figures/Figure_8_model_mismatch.png" id="125" name="Picture"/>
                     <ns4:cNvPicPr>
                       <ns3:picLocks noChangeArrowheads="1" noChangeAspect="1"/>
                     </ns4:cNvPicPr>
                   </ns4:nvPicPr>
                   <ns4:blipFill>
-                    <ns3:blip ns5:embed="rId52"/>
+                    <ns3:blip ns5:embed="rId123"/>
                     <ns3:stretch>
                       <ns3:fillRect/>
                     </ns3:stretch>
@@ -31894,18 +31877,18 @@
           <ns2:inline>
             <ns2:extent cx="5006975" cy="1973467"/>
             <ns2:effectExtent b="0" l="0" r="0" t="0"/>
-            <ns2:docPr descr="" title="" id="57" name="Picture"/>
+            <ns2:docPr descr="" title="" id="128" name="Picture"/>
             <ns3:graphic>
               <ns3:graphicData uri="http://schemas.openxmlformats.org/drawingml/2006/picture">
                 <ns4:pic>
                   <ns4:nvPicPr>
-                    <ns4:cNvPr descr="figures/Figure_2.png" id="58" name="Picture"/>
+                    <ns4:cNvPr descr="figures/Figure_2.png" id="129" name="Picture"/>
                     <ns4:cNvPicPr>
                       <ns3:picLocks noChangeArrowheads="1" noChangeAspect="1"/>
                     </ns4:cNvPicPr>
                   </ns4:nvPicPr>
                   <ns4:blipFill>
-                    <ns3:blip ns5:embed="rId56"/>
+                    <ns3:blip ns5:embed="rId127"/>
                     <ns3:stretch>
                       <ns3:fillRect/>
                     </ns3:stretch>
@@ -32263,7 +32246,7 @@
           <w:sz w:val="20"/>
           <w:szCs w:val="20"/>
         </w:rPr>
-        <w:t xml:space="preserve">000 observed violations and no rejected QP; the predeclared smallest-passing rule therefore selects the mean-only endpoint</w:t>
+        <w:t xml:space="preserve">000 counted violations and no rejected QP; the predeclared smallest-passing rule therefore selects the mean-only endpoint</w:t>
       </w:r>
       <w:r>
         <w:rPr>
@@ -32365,7 +32348,7 @@
           <w:sz w:val="20"/>
           <w:szCs w:val="20"/>
         </w:rPr>
-        <w:t xml:space="preserve">, no violation is observed but 13/15</w:t>
+        <w:t xml:space="preserve">, no counted violation is observed but 13/15</w:t>
       </w:r>
       <w:r>
         <w:rPr>
@@ -32464,7 +32447,7 @@
           <w:sz w:val="20"/>
           <w:szCs w:val="20"/>
         </w:rPr>
-        <w:t xml:space="preserve">000 observed violations and 0/50</w:t>
+        <w:t xml:space="preserve">000 counted violations and 0/50</w:t>
       </w:r>
       <w:r>
         <w:rPr>
@@ -32517,18 +32500,18 @@
           <ns2:inline>
             <ns2:extent cx="5006975" cy="4226299"/>
             <ns2:effectExtent b="0" l="0" r="0" t="0"/>
-            <ns2:docPr descr="" title="" id="62" name="Picture"/>
+            <ns2:docPr descr="" title="" id="133" name="Picture"/>
             <ns3:graphic>
               <ns3:graphicData uri="http://schemas.openxmlformats.org/drawingml/2006/picture">
                 <ns4:pic>
                   <ns4:nvPicPr>
-                    <ns4:cNvPr descr="figures/Figure_GP_data_sensitivity.png" id="63" name="Picture"/>
+                    <ns4:cNvPr descr="figures/Figure_GP_data_sensitivity.png" id="134" name="Picture"/>
                     <ns4:cNvPicPr>
                       <ns3:picLocks noChangeArrowheads="1" noChangeAspect="1"/>
                     </ns4:cNvPicPr>
                   </ns4:nvPicPr>
                   <ns4:blipFill>
-                    <ns3:blip ns5:embed="rId61"/>
+                    <ns3:blip ns5:embed="rId132"/>
                     <ns3:stretch>
                       <ns3:fillRect/>
                     </ns3:stretch>
@@ -32743,7 +32726,7 @@
           <w:sz w:val="20"/>
           <w:szCs w:val="20"/>
         </w:rPr>
-        <w:t xml:space="preserve">setting gives 0/2500 violations and no QP rejection at each size. Synthetic target corruption exposes a dictionary-size dependence: the 100- and 250-point fits produce 5.76–20.24% violation and 4.04–8.60% QP rejection, whereas the 500-point fits retain 0/2500 observed violations and no QP rejection at both tested corruption levels, with 99.8–99.9% coverage. The result supports quantity, coverage, and closed-loop feasibility as joint pre-enable gates; it does not estimate plant-data corruption or establish universal robustness to bad labels. The complete aggregation is reported in the Supplemental Material.</w:t>
+        <w:t xml:space="preserve">setting gives 0/2500 counted violations and no QP rejection at each size. Synthetic target corruption exposes a dictionary-size dependence: the 100- and 250-point fits produce 5.76–20.24% violation and 4.04–8.60% QP rejection, whereas the 500-point fits retain 0/2500 counted violations and no QP rejection at both tested corruption levels, with 99.8–99.9% coverage. The result supports quantity, coverage, and closed-loop feasibility as joint pre-enable gates; it does not estimate plant-data corruption or establish universal robustness to bad labels. The complete aggregation is reported in the Supplemental Material.</w:t>
       </w:r>
     </w:p>
     <w:p>
@@ -33022,18 +33005,18 @@
           <ns2:inline>
             <ns2:extent cx="5006975" cy="3597266"/>
             <ns2:effectExtent b="0" l="0" r="0" t="0"/>
-            <ns2:docPr descr="" title="" id="68" name="Picture"/>
+            <ns2:docPr descr="" title="" id="139" name="Picture"/>
             <ns3:graphic>
               <ns3:graphicData uri="http://schemas.openxmlformats.org/drawingml/2006/picture">
                 <ns4:pic>
                   <ns4:nvPicPr>
-                    <ns4:cNvPr descr="figures/Figure_9_production_historian.png" id="69" name="Picture"/>
+                    <ns4:cNvPr descr="figures/Figure_9_production_historian.png" id="140" name="Picture"/>
                     <ns4:cNvPicPr>
                       <ns3:picLocks noChangeArrowheads="1" noChangeAspect="1"/>
                     </ns4:cNvPicPr>
                   </ns4:nvPicPr>
                   <ns4:blipFill>
-                    <ns3:blip ns5:embed="rId67"/>
+                    <ns3:blip ns5:embed="rId138"/>
                     <ns3:stretch>
                       <ns3:fillRect/>
                     </ns3:stretch>
@@ -33266,7 +33249,7 @@
           <w:sz w:val="20"/>
           <w:szCs w:val="20"/>
         </w:rPr>
-        <w:t xml:space="preserve">The unit chronology permits a load-matched commissioning comparison. The 660 MW unit used traditional PID before 21 May 2026, was shut down from 21 May to 24 June 2026, and restarted with the proposed RoCBF-SF-based strategy after 24 June 2026. The outage included extensive routine plant maintenance in addition to integration of the proposed algorithm. We screened 300 s historian records from 2024–2025 and 25 June–5 July 2026. Candidate two-hour windows contain 24 consecutive samples, advance every 30 min, and retain only load in 195–700 MW with finite pressure, setpoint, and fuel-flow values. A global linear-assignment step forms one-to-one pairs without replacement using mean-load difference, 24-point load-profile RMSE, load-range difference, and fuel/load difference. Calipers are 10, 30, and 40 MW and 0.08, respectively. This protocol yields 512 pairs from 14,675 pre-retrofit and 517 post-retrofit candidates. Median mean-load difference is 1.32 MW and median profile RMSE is 15.37 MW. Cohort median pressure-residual standard deviation decreases from 0.523 to 0.502 MPa (3.93%), whereas median absolute-error p95 is essentially unchanged (1.082 versus 1.085 MPa). Because the windows overlap, these cohort quantities and the post-day cluster bootstrap reported in the Supplemental Material are descriptive rather than independent-sample inference. Figure </w:t>
+        <w:t xml:space="preserve">The unit chronology permits a load-matched commissioning comparison. The 660 MW unit used traditional PID before 21 May 2026, was shut down from 21 May to 24 June 2026, and restarted with the proposed RoCBF-SF-based strategy after 24 June 2026. Retained plant work-scope and controller-configuration records distinguish the simultaneous changes. Routine maintenance included instrument calibration, actuator inspection, combustion-equipment maintenance, and heat-surface cleaning. The baseline PID gains, output limits, anti-windup, sliding-pressure curve, coordinated-control logic, and fuel/feedwater/turbine-valve base loops were unchanged; the control-system modification was the downstream RoCBF-SF integration and its enable, bypass, heartbeat, command-quality, and DCS-selection logic. We screened 300 s historian records from 2024–2025 and 25 June–5 July 2026. Candidate two-hour windows contain 24 consecutive samples, advance every 30 min, and retain only load in 195–700 MW with finite pressure, setpoint, and fuel-flow values. The 700 MW ceiling is a permissive data-quality screen rather than an observed operating endpoint; measured ranges are reported separately below. A global linear-assignment step forms one-to-one pairs without replacement using mean-load difference, 24-point load-profile RMSE, load-range difference, and fuel/load difference. Calipers are 10, 30, and 40 MW and 0.08, respectively. This protocol yields 512 pairs from 14,675 pre-retrofit and 517 post-retrofit candidates. Median mean-load difference is 1.32 MW and median profile RMSE is 15.37 MW. Cohort median pressure-residual standard deviation decreases from 0.523 to 0.502 MPa (3.93%), whereas median absolute-error p95 is essentially unchanged (1.082 versus 1.085 MPa). Because the windows overlap, these cohort quantities and the post-day cluster bootstrap reported in the Supplemental Material are descriptive rather than independent-sample inference. Figure </w:t>
       </w:r>
       <w:r>
         <w:rPr>
@@ -33290,7 +33273,7 @@
           <w:sz w:val="20"/>
           <w:szCs w:val="20"/>
         </w:rPr>
-        <w:t xml:space="preserve">is a separate native-5 s load-matched diagnostic, not a selected member of the 300 s cohort; its source timestamps and metric JSON are preserved independently in the evidence package. Concurrent routine maintenance also means that the response comparison is observational evidence associated with the documented retrofit, not a standalone causal estimate. Confirmed original plant-controller exports provide the separate evidence that RoCBF-SF executed after restart.</w:t>
+        <w:t xml:space="preserve">is a separate native-5 s load-matched diagnostic, not a selected member of the 300 s cohort; its source timestamps and metric JSON are preserved independently in the evidence package. The retained records narrow the set of control-system changes but do not remove routine maintenance as a competing explanation, so the response comparison remains observational evidence associated with the documented retrofit rather than a standalone causal estimate. Confirmed original plant-controller exports provide the separate evidence that RoCBF-SF executed after restart.</w:t>
       </w:r>
     </w:p>
     <w:p>
@@ -33308,18 +33291,18 @@
           <ns2:inline>
             <ns2:extent cx="5006975" cy="4940793"/>
             <ns2:effectExtent b="0" l="0" r="0" t="0"/>
-            <ns2:docPr descr="" title="" id="72" name="Picture"/>
+            <ns2:docPr descr="" title="" id="143" name="Picture"/>
             <ns3:graphic>
               <ns3:graphicData uri="http://schemas.openxmlformats.org/drawingml/2006/picture">
                 <ns4:pic>
                   <ns4:nvPicPr>
-                    <ns4:cNvPr descr="figures/Figure_10_production_retrofit_evidence.png" id="73" name="Picture"/>
+                    <ns4:cNvPr descr="figures/Figure_10_production_retrofit_evidence.png" id="144" name="Picture"/>
                     <ns4:cNvPicPr>
                       <ns3:picLocks noChangeArrowheads="1" noChangeAspect="1"/>
                     </ns4:cNvPicPr>
                   </ns4:nvPicPr>
                   <ns4:blipFill>
-                    <ns3:blip ns5:embed="rId71"/>
+                    <ns3:blip ns5:embed="rId142"/>
                     <ns3:stretch>
                       <ns3:fillRect/>
                     </ns3:stretch>
@@ -33778,7 +33761,7 @@
           <w:sz w:val="20"/>
           <w:szCs w:val="20"/>
         </w:rPr>
-        <w:t xml:space="preserve">The same 5 s historian query includes main/reheat temperature, air–coal ratio channels, mode/fallback indicators, and turbine-valve demand. Main-steam temperature variability decreases from 2.245 to 0.915C, while reheat-temperature variability and air–coal ratio dispersion increase, showing that the post-retrofit interval is not uniformly easier. These historian diagnostics are then paired with the post-retrofit controller-log export in Fig. </w:t>
+        <w:t xml:space="preserve">The same 5 s historian query includes main/reheat temperature, air–coal ratio channels, mode/fallback indicators, and turbine-valve demand. Main-steam temperature variability decreases from 2.245 to 0.915°C, while reheat-temperature variability and air–coal ratio dispersion increase, showing that the post-retrofit interval is not uniformly easier. These historian diagnostics are then paired with the post-retrofit controller-log export in Fig. </w:t>
       </w:r>
       <w:r>
         <w:rPr>
@@ -33812,18 +33795,18 @@
           <ns2:inline>
             <ns2:extent cx="5006975" cy="4327295"/>
             <ns2:effectExtent b="0" l="0" r="0" t="0"/>
-            <ns2:docPr descr="" title="" id="76" name="Picture"/>
+            <ns2:docPr descr="" title="" id="147" name="Picture"/>
             <ns3:graphic>
               <ns3:graphicData uri="http://schemas.openxmlformats.org/drawingml/2006/picture">
                 <ns4:pic>
                   <ns4:nvPicPr>
-                    <ns4:cNvPr descr="figures/Figure_11_controller_log_validation.png" id="77" name="Picture"/>
+                    <ns4:cNvPr descr="figures/Figure_11_controller_log_validation.png" id="148" name="Picture"/>
                     <ns4:cNvPicPr>
                       <ns3:picLocks noChangeArrowheads="1" noChangeAspect="1"/>
                     </ns4:cNvPicPr>
                   </ns4:nvPicPr>
                   <ns4:blipFill>
-                    <ns3:blip ns5:embed="rId75"/>
+                    <ns3:blip ns5:embed="rId146"/>
                     <ns3:stretch>
                       <ns3:fillRect/>
                     </ns3:stretch>
@@ -37565,7 +37548,7 @@
           <w:sz w:val="20"/>
           <w:szCs w:val="20"/>
         </w:rPr>
-        <w:t xml:space="preserve">000 violating samples. The predeclared calibration rule selects the mean-only endpoint</w:t>
+        <w:t xml:space="preserve">000 samples exceeding the prespecified per-constraint native-unit tolerances. The predeclared calibration rule selects the mean-only endpoint</w:t>
       </w:r>
       <w:r>
         <w:rPr>
@@ -37632,7 +37615,7 @@
           <w:sz w:val="20"/>
           <w:szCs w:val="20"/>
         </w:rPr>
-        <w:t xml:space="preserve">000 observed violations in the primary sweep, and the fixed filter setting records 0/50</w:t>
+        <w:t xml:space="preserve">000 counted violations in the primary sweep, and the fixed filter setting records 0/50</w:t>
       </w:r>
       <w:r>
         <w:rPr>
@@ -37648,7 +37631,7 @@
           <w:sz w:val="20"/>
           <w:szCs w:val="20"/>
         </w:rPr>
-        <w:t xml:space="preserve">000 violations and no QP rejection on held-out seeds. The equality with NMPC precludes a claim of universal safety superiority; the practical distinction is the filter’s compatibility with an existing coordinated controller. Conversely, the implemented</w:t>
+        <w:t xml:space="preserve">000 counted violations and no QP rejection on held-out seeds. The equality with NMPC precludes a claim of universal safety superiority; the practical distinction is the filter’s compatibility with an existing coordinated controller. Conversely, the implemented</w:t>
       </w:r>
       <w:r>
         <w:rPr>
@@ -38207,7 +38190,7 @@
           <w:sz w:val="20"/>
           <w:szCs w:val="20"/>
         </w:rPr>
-        <w:t>[1] L Wu, L Huang, Y Wang, B Jiang, D Li. Pressure optimization control of low-pressure vacuum systems based on anti-disturbance Smith predictor compensation. Meas Control. 2026;59(6):870–82. doi:10.1177/00202940251372871</w:t>
+        <w:t>[1] Wu L, Huang L, Wang Y, et al. Pressure optimization control of low-pressure vacuum systems based on anti-disturbance Smith predictor compensation. Meas Control. 2026;59(6):870–82. doi:10.1177/00202940251372871</w:t>
       </w:r>
     </w:p>
     <w:p>
@@ -38222,7 +38205,7 @@
           <w:sz w:val="20"/>
           <w:szCs w:val="20"/>
         </w:rPr>
-        <w:t>[2] Y W Feng, Y H Li. Event-triggered voltage regulation and current sharing in neighbors-based second control for DC microgrids. Meas Control. 2026;59(5):630–9. doi:10.1177/00202940251344578</w:t>
+        <w:t>[2] Feng YW, Li YH. Event-triggered voltage regulation and current sharing in neighbors-based second control for DC microgrids. Meas Control. 2026;59(5):630–9. doi:10.1177/00202940251344578</w:t>
       </w:r>
     </w:p>
     <w:p>
@@ -38237,7 +38220,7 @@
           <w:sz w:val="20"/>
           <w:szCs w:val="20"/>
         </w:rPr>
-        <w:t>[3] A D Ames, S Coogan, M Egerstedt, G Notomista, K Sreenath, P Tabuada. Control barrier functions: Theory and applications. In: Proceedings of the 18th european control conference (ECC). 2019. p. 3420–31. doi:10.23919/ECC.2019.8796030</w:t>
+        <w:t>[3] Ames AD, Coogan S, Egerstedt M, et al. Control barrier functions: Theory and applications. In: Proceedings of the 18th european control conference (ECC). 2019. p. 3420–31. doi:10.23919/ECC.2019.8796030</w:t>
       </w:r>
     </w:p>
     <w:p>
@@ -38252,7 +38235,7 @@
           <w:sz w:val="20"/>
           <w:szCs w:val="20"/>
         </w:rPr>
-        <w:t>[4] W Xiao, C Belta, C G Cassandras. High-order control barrier functions. IEEE Trans Automat Contr. 2022;67(7):3655–62.</w:t>
+        <w:t>[4] Xiao W, Belta C, Cassandras CG. High-order control barrier functions. IEEE Trans Automat Contr. 2022;67(7):3655–62.</w:t>
       </w:r>
     </w:p>
     <w:p>
@@ -38267,7 +38250,7 @@
           <w:sz w:val="20"/>
           <w:szCs w:val="20"/>
         </w:rPr>
-        <w:t>[5] C E Rasmussen, C K I Williams. Gaussian processes for machine learning. MIT Press; 2006.</w:t>
+        <w:t>[5] Rasmussen CE, Williams CKI. Gaussian processes for machine learning. MIT Press; 2006.</w:t>
       </w:r>
     </w:p>
     <w:p>
@@ -38282,7 +38265,7 @@
           <w:sz w:val="20"/>
           <w:szCs w:val="20"/>
         </w:rPr>
-        <w:t>[6] N Srinivas, A Krause, S M Kakade, M W Seeger. Information-theoretic regret bounds for Gaussian process optimization in the bandit setting. IEEE Trans Inf Theory. 2012;58(5):3250–65. doi:10.1109/TIT.2011.2182033</w:t>
+        <w:t>[6] Srinivas N, Krause A, Kakade SM, et al. Information-theoretic regret bounds for Gaussian process optimization in the bandit setting. IEEE Trans Inf Theory. 2012;58(5):3250–65. doi:10.1109/TIT.2011.2182033</w:t>
       </w:r>
     </w:p>
     <w:p>
@@ -38297,7 +38280,7 @@
           <w:sz w:val="20"/>
           <w:szCs w:val="20"/>
         </w:rPr>
-        <w:t>[7] R Cheng, G Orosz, R M Murray, J W Burdick. End-to-end safe reinforcement learning through barrier functions for safety-critical continuous control. In: Proceedings of the AAAI conference on artificial intelligence. 2019. p. 3387–95. doi:10.1609/aaai.v33i01.33013387</w:t>
+        <w:t>[7] Cheng R, Orosz G, Murray RM, et al. End-to-end safe reinforcement learning through barrier functions for safety-critical continuous control. In: Proceedings of the AAAI conference on artificial intelligence. 2019. p. 3387–95. doi:10.1609/aaai.v33i01.33013387</w:t>
       </w:r>
     </w:p>
     <w:p>
@@ -38312,7 +38295,7 @@
           <w:sz w:val="20"/>
           <w:szCs w:val="20"/>
         </w:rPr>
-        <w:t>[8] J F Fisac, A K Akametalu, M N Zeilinger, S Kaynama, J Gillula, C J Tomlin. A general safety framework for learning-based control in uncertain robotic systems. IEEE Trans Automat Contr. 2019;64(7):2737–52.</w:t>
+        <w:t>[8] Fisac JF, Akametalu AK, Zeilinger MN, et al. A general safety framework for learning-based control in uncertain robotic systems. IEEE Trans Automat Contr. 2019;64(7):2737–52.</w:t>
       </w:r>
     </w:p>
     <w:p>
@@ -38327,7 +38310,7 @@
           <w:sz w:val="20"/>
           <w:szCs w:val="20"/>
         </w:rPr>
-        <w:t>[9] F Castañeda, J J Choi, B Zhang, C J Tomlin, K Sreenath. Pointwise feasibility of Gaussian process-based safety-critical control under model uncertainty. In: Proceedings of the 60th IEEE conference on decision and control (CDC). 2021. p. 6762–9. doi:10.1109/CDC45484.2021.9683743</w:t>
+        <w:t>[9] Castañeda F, Choi JJ, Zhang B, et al. Pointwise feasibility of Gaussian process-based safety-critical control under model uncertainty. In: Proceedings of the 60th IEEE conference on decision and control (CDC). 2021. p. 6762–9. doi:10.1109/CDC45484.2021.9683743</w:t>
       </w:r>
     </w:p>
     <w:p>
@@ -38342,7 +38325,7 @@
           <w:sz w:val="20"/>
           <w:szCs w:val="20"/>
         </w:rPr>
-        <w:t>[10] M Aali, J Liu. Learning high-order control barrier functions for safety-critical control with Gaussian processes. In: Proceedings of the american control conference (ACC). 2024. p. 1–6. doi:10.23919/ACC60939.2024.10644311</w:t>
+        <w:t>[10] Aali M, Liu J. Learning high-order control barrier functions for safety-critical control with Gaussian processes. In: Proceedings of the american control conference (ACC). 2024. p. 1–6. doi:10.23919/ACC60939.2024.10644311</w:t>
       </w:r>
     </w:p>
     <w:p>
@@ -38357,7 +38340,7 @@
           <w:sz w:val="20"/>
           <w:szCs w:val="20"/>
         </w:rPr>
-        <w:t>[11] Y Zhang, L Wen, Z Bing, X Yao, L Kong, W He, A Knoll. Adaptive safety-critical control for high-order systems: A real-time Gaussian process approach. IEEE Trans Autom Sci Eng. 2025. doi:10.1109/TASE.2025.3611987</w:t>
+        <w:t>[11] Zhang Y, Wen L, Bing Z, et al. Adaptive safety-critical control for high-order systems: A real-time Gaussian process approach. IEEE Trans Autom Sci Eng. 2025;22:21296–310. doi:10.1109/TASE.2025.3611987</w:t>
       </w:r>
     </w:p>
     <w:p>
@@ -38372,7 +38355,7 @@
           <w:sz w:val="20"/>
           <w:szCs w:val="20"/>
         </w:rPr>
-        <w:t>[12] K J Åström, R D Bell. Benchmark problems for control system design. IFAC Proc Vol. 2000;33(11):27–46.</w:t>
+        <w:t>[12] Åström KJ, Bell RD. Benchmark problems for control system design. IFAC Proc Vol. 2000;33(11):27–46.</w:t>
       </w:r>
     </w:p>
     <w:p>
@@ -38387,7 +38370,7 @@
           <w:sz w:val="20"/>
           <w:szCs w:val="20"/>
         </w:rPr>
-        <w:t>[13] S Y Li, H B Liu, W J Cai, Y C Soh, L H Xie. A new coordinated control strategy for boiler-turbine system of coal-fired power plant. IEEE Trans Control Syst Technol. 2005;13(6):943–54. doi:10.1109/TCST.2005.854319</w:t>
+        <w:t>[13] Li SY, Liu HB, Cai WJ, et al. A new coordinated control strategy for boiler-turbine system of coal-fired power plant. IEEE Trans Control Syst Technol. 2005;13(6):943–54. doi:10.1109/TCST.2005.854319</w:t>
       </w:r>
     </w:p>
     <w:p>
@@ -38402,7 +38385,7 @@
           <w:sz w:val="20"/>
           <w:szCs w:val="20"/>
         </w:rPr>
-        <w:t>[14] W Tan, J Z Liu, F Fang. Coordinated control of boiler-turbine unit of supercritical power plant. J Process Control. 2006;16(3):261–7.</w:t>
+        <w:t>[14] Tan W, Liu JZ, Fang F. Coordinated control of boiler-turbine unit of supercritical power plant. J Process Control. 2006;16(3):261–7.</w:t>
       </w:r>
     </w:p>
     <w:p>
@@ -38417,7 +38400,7 @@
           <w:sz w:val="20"/>
           <w:szCs w:val="20"/>
         </w:rPr>
-        <w:t>[15] X Liu, P Guan, C W Chan. Nonlinear multivariable power plant coordinate control by constrained predictive scheme. IEEE Trans Control Syst Technol. 2010;18(5):1116–25. doi:10.1109/TCST.2009.2034640</w:t>
+        <w:t>[15] Liu X, Guan P, Chan CW. Nonlinear multivariable power plant coordinate control by constrained predictive scheme. IEEE Trans Control Syst Technol. 2010;18(5):1116–25. doi:10.1109/TCST.2009.2034640</w:t>
       </w:r>
     </w:p>
     <w:p>
@@ -38432,7 +38415,7 @@
           <w:sz w:val="20"/>
           <w:szCs w:val="20"/>
         </w:rPr>
-        <w:t>[16] M A Abdelbaky, X Liu, X Kong. Stable constrained model predictive control based on IOFL technique for boiler-turbine system. Trans Inst Meas Control. 2025;47(6):1104–16. doi:10.1177/01423312241263911</w:t>
+        <w:t>[16] Abdelbaky MA, Liu X, Kong X. Stable constrained model predictive control based on IOFL technique for boiler-turbine system. Trans Inst Meas Control. 2025;47(6):1104–16. doi:10.1177/01423312241263911</w:t>
       </w:r>
     </w:p>
     <w:p>
@@ -38447,7 +38430,7 @@
           <w:sz w:val="20"/>
           <w:szCs w:val="20"/>
         </w:rPr>
-        <w:t>[17] J Z Liu, D L Zeng, L Tian, M M Gao, W Wang, Y G Niu, F Fang. Control strategy for operating flexibility of coal-fired power plants in alternate electrical power systems. Proc CSEE. 2015;35(21):5385–94. doi:10.13334/j.0258-8013.pcsee.2015.21.001</w:t>
+        <w:t>[17] Liu JZ, Zeng DL, Tian L, et al. Control strategy for operating flexibility of coal-fired power plants in alternate electrical power systems. Proc CSEE. 2015;35(21):5385–94. doi:10.13334/j.0258-8013.pcsee.2015.21.001</w:t>
       </w:r>
     </w:p>
     <w:p>
@@ -38462,7 +38445,7 @@
           <w:sz w:val="20"/>
           <w:szCs w:val="20"/>
         </w:rPr>
-        <w:t>[18] S J Qin, T A Badgwell. A survey of industrial model predictive control technology. Control Eng Pract. 2003;11(7):733–64. doi:10.1016/S0967-0661(02)00186-7</w:t>
+        <w:t>[18] Qin SJ, Badgwell TA. A survey of industrial model predictive control technology. Control Eng Pract. 2003;11(7):733–64. doi:10.1016/S0967-0661(02)00186-7</w:t>
       </w:r>
     </w:p>
     <w:p>
@@ -38477,7 +38460,7 @@
           <w:sz w:val="20"/>
           <w:szCs w:val="20"/>
         </w:rPr>
-        <w:t>[19] D Q Mayne, J B Rawlings, C V Rao, P O M Scokaert. Constrained model predictive control: Stability and optimality. Automatica. 2000;36(6):789–814.</w:t>
+        <w:t>[19] Mayne DQ, Rawlings JB, Rao CV, et al. Constrained model predictive control: Stability and optimality. Automatica. 2000;36(6):789–814.</w:t>
       </w:r>
     </w:p>
     <w:p>
@@ -38492,7 +38475,7 @@
           <w:sz w:val="20"/>
           <w:szCs w:val="20"/>
         </w:rPr>
-        <w:t>[20] M Morari, J H Lee. Model predictive control: Past, present and future. Comput Chem Eng. 1999;23(4-5):667–82. doi:10.1016/S0098-1354(98)00301-9</w:t>
+        <w:t>[20] Morari M, Lee JH. Model predictive control: Past, present and future. Comput Chem Eng. 1999;23(4-5):667–82. doi:10.1016/S0098-1354(98)00301-9</w:t>
       </w:r>
     </w:p>
     <w:p>
@@ -38507,7 +38490,7 @@
           <w:sz w:val="20"/>
           <w:szCs w:val="20"/>
         </w:rPr>
-        <w:t>[21] D Q Mayne, M M Seron, S V Raković. Robust model predictive control of constrained linear systems with bounded disturbances. Automatica. 2005;41(2):219–24. doi:10.1016/j.automatica.2004.08.019</w:t>
+        <w:t>[21] Mayne DQ, Seron MM, Raković SV. Robust model predictive control of constrained linear systems with bounded disturbances. Automatica. 2005;41(2):219–24. doi:10.1016/j.automatica.2004.08.019</w:t>
       </w:r>
     </w:p>
     <w:p>
@@ -38522,7 +38505,7 @@
           <w:sz w:val="20"/>
           <w:szCs w:val="20"/>
         </w:rPr>
-        <w:t>[22] A Mesbah. Stochastic model predictive control: An overview and perspectives for future research. IEEE Control Syst Mag. 2016;36(6):30–44. doi:10.1109/MCS.2016.2602087</w:t>
+        <w:t>[22] Mesbah A. Stochastic model predictive control: An overview and perspectives for future research. IEEE Control Syst Mag. 2016;36(6):30–44. doi:10.1109/MCS.2016.2602087</w:t>
       </w:r>
     </w:p>
     <w:p>
@@ -38537,7 +38520,7 @@
           <w:sz w:val="20"/>
           <w:szCs w:val="20"/>
         </w:rPr>
-        <w:t>[23] L Hewing, J Kabzan, M N Zeilinger. Cautious model predictive control using Gaussian process regression. IEEE Trans Control Syst Technol. 2020;28(6):2736–43. doi:10.1109/TCST.2019.2949757</w:t>
+        <w:t>[23] Hewing L, Kabzan J, Zeilinger MN. Cautious model predictive control using Gaussian process regression. IEEE Trans Control Syst Technol. 2020;28(6):2736–43. doi:10.1109/TCST.2019.2949757</w:t>
       </w:r>
     </w:p>
     <w:p>
@@ -38552,7 +38535,7 @@
           <w:sz w:val="20"/>
           <w:szCs w:val="20"/>
         </w:rPr>
-        <w:t>[24] P Wieland, F Allgöwer. Constructive safety using control barrier functions. IFAC Proc Vol. 2007;40(12):462–7.</w:t>
+        <w:t>[24] Wieland P, Allgöwer F. Constructive safety using control barrier functions. IFAC Proc Vol. 2007;40(12):462–7.</w:t>
       </w:r>
     </w:p>
     <w:p>
@@ -38567,7 +38550,7 @@
           <w:sz w:val="20"/>
           <w:szCs w:val="20"/>
         </w:rPr>
-        <w:t>[25] M Jankovic. Robust control barrier functions for constrained nonlinear systems. Automatica. 2018;96:359–67. doi:10.1016/j.automatica.2018.07.004</w:t>
+        <w:t>[25] Jankovic M. Robust control barrier functions for constrained nonlinear systems. Automatica. 2018;96:359–67. doi:10.1016/j.automatica.2018.07.004</w:t>
       </w:r>
     </w:p>
     <w:p>
@@ -38582,7 +38565,7 @@
           <w:sz w:val="20"/>
           <w:szCs w:val="20"/>
         </w:rPr>
-        <w:t>[26] A J Taylor, A Singletary, Y Yue, A D Ames. A control barrier perspective on episodic learning via projection-to-state safety. IEEE Control Syst Lett. 2020;5(3):1019–24. doi:10.1109/LCSYS.2020.3009082</w:t>
+        <w:t>[26] Taylor AJ, Singletary A, Yue Y, et al. A control barrier perspective on episodic learning via projection-to-state safety. IEEE Control Syst Lett. 2020;5(3):1019–24. doi:10.1109/LCSYS.2020.3009082</w:t>
       </w:r>
     </w:p>
     <w:p>
@@ -38597,7 +38580,7 @@
           <w:sz w:val="20"/>
           <w:szCs w:val="20"/>
         </w:rPr>
-        <w:t>[27] Q Long, Y T Wang, J Pan. Safe control synthesis with uncertain dynamics via adaptive control barrier functions. IEEE Robot Autom Lett. 2023;8(3):1615–22.</w:t>
+        <w:t>[27] Long Q, Wang YT, Pan J. Safe control synthesis with uncertain dynamics via adaptive control barrier functions. IEEE Robot Autom Lett. 2023;8(3):1615–22.</w:t>
       </w:r>
     </w:p>
     <w:p>
@@ -38612,7 +38595,7 @@
           <w:sz w:val="20"/>
           <w:szCs w:val="20"/>
         </w:rPr>
-        <w:t>[28] J Zeng, B Zhang, Z Li, K Sreenath. Safety-critical control using optimal-decay control barrier function with guaranteed point-wise feasibility. In: Proceedings of the american control conference (ACC). 2021. p. 3856–63. doi:10.23919/ACC50511.2021.9482626</w:t>
+        <w:t>[28] Zeng J, Zhang B, Li Z, et al. Safety-critical control using optimal-decay control barrier function with guaranteed point-wise feasibility. In: Proceedings of the american control conference (ACC). 2021. p. 3856–63. doi:10.23919/ACC50511.2021.9482626</w:t>
       </w:r>
     </w:p>
     <w:p>
@@ -38627,7 +38610,7 @@
           <w:sz w:val="20"/>
           <w:szCs w:val="20"/>
         </w:rPr>
-        <w:t>[29] A Agrawal, K Sreenath. Discrete control barrier functions for safety-critical control of discrete systems with application to bipedal robot navigation. In: Proceedings of robotics: Science and systems (RSS). 2017. p. Paper 073. doi:10.15607/RSS.2017.XIII.073</w:t>
+        <w:t>[29] Agrawal A, Sreenath K. Discrete control barrier functions for safety-critical control of discrete systems with application to bipedal robot navigation. In: Proceedings of robotics: Science and systems (RSS). 2017. p. Paper 073. doi:10.15607/RSS.2017.XIII.073</w:t>
       </w:r>
     </w:p>
     <w:p>
@@ -38642,7 +38625,7 @@
           <w:sz w:val="20"/>
           <w:szCs w:val="20"/>
         </w:rPr>
-        <w:t>[30] A J Taylor, V D Dorobantu, R K Cosner, Y Yue, A D Ames. Safety of sampled-data systems with control barrier functions via approximate discrete time models. In: Proceedings of the 61st IEEE conference on decision and control (CDC). 2022. p. 7127–34. doi:10.1109/CDC51059.2022.9993226</w:t>
+        <w:t>[30] Taylor AJ, Dorobantu VD, Cosner RK, et al. Safety of sampled-data systems with control barrier functions via approximate discrete time models. In: Proceedings of the 61st IEEE conference on decision and control (CDC). 2022. p. 7127–34. doi:10.1109/CDC51059.2022.9993226</w:t>
       </w:r>
     </w:p>
     <w:p>
@@ -38657,7 +38640,7 @@
           <w:sz w:val="20"/>
           <w:szCs w:val="20"/>
         </w:rPr>
-        <w:t>[31] R K Cosner, Y Yue, A D Ames. Robust safety under stochastic uncertainty with discrete-time control barrier functions. In: Proceedings of robotics: Science and systems (RSS). RSS Foundation; 2023. p. Paper 084. doi:10.15607/RSS.2023.XIX.084</w:t>
+        <w:t>[31] Cosner RK, Yue Y, Ames AD. Robust safety under stochastic uncertainty with discrete-time control barrier functions. In: Proceedings of robotics: Science and systems (RSS). RSS Foundation; 2023. p. Paper 084. doi:10.15607/RSS.2023.XIX.084</w:t>
       </w:r>
     </w:p>
     <w:p>
@@ -38672,7 +38655,7 @@
           <w:sz w:val="20"/>
           <w:szCs w:val="20"/>
         </w:rPr>
-        <w:t>[32] A Lederer, J Umlauft, S Hirche. Uniform error bounds for Gaussian process regression with application to safe control. In: Advances in neural information processing systems 32 (NeurIPS). Curran Associates Inc.; 2019. p. 659–69.</w:t>
+        <w:t>[32] Lederer A, Umlauft J, Hirche S. Uniform error bounds for Gaussian process regression with application to safe control. In: Advances in neural information processing systems 32 (NeurIPS). Curran Associates Inc.; 2019. p. 659–69.</w:t>
       </w:r>
     </w:p>
     <w:p>
@@ -38687,7 +38670,7 @@
           <w:sz w:val="20"/>
           <w:szCs w:val="20"/>
         </w:rPr>
-        <w:t>[33] A Alburayt, W P Syam. Bayesian machine learning for measurement noise estimation of focus variation microscopy instrument. Meas Control. 2026;59(6):857–69. doi:10.1177/00202940251374964</w:t>
+        <w:t>[33] Alburayt A, Syam WP. Bayesian machine learning for measurement noise estimation of focus variation microscopy instrument. Meas Control. 2026;59(6):857–69. doi:10.1177/00202940251374964</w:t>
       </w:r>
     </w:p>
     <w:p>
@@ -38702,7 +38685,7 @@
           <w:sz w:val="20"/>
           <w:szCs w:val="20"/>
         </w:rPr>
-        <w:t>[34] S R Chowdhury, A Gopalan. On kernelized multi-armed bandits. In: Proceedings of the 34th international conference on machine learning. PMLR; 2017. p. 844–53. (Proceedings of machine learning research).</w:t>
+        <w:t>[34] Chowdhury SR, Gopalan A. On kernelized multi-armed bandits. In: Proceedings of the 34th international conference on machine learning. PMLR; 2017. p. 844–53. (Proceedings of machine learning research).</w:t>
       </w:r>
     </w:p>
     <w:sectPr>

</xml_diff>